<commit_message>
Schools set their own instalment plans and parents choose them; WardPay charges a fee per plan
</commit_message>
<xml_diff>
--- a/docs/product/WardPay - user guide.docx
+++ b/docs/product/WardPay - user guide.docx
@@ -46,7 +46,7 @@
           <w:sz w:val="22"/>
           <w:szCs w:val="22"/>
         </w:rPr>
-        <w:t xml:space="preserve">For proprietors, bursars, school admins, parents and the WardPay team. Updated 24 October 2026.</w:t>
+        <w:t xml:space="preserve">For proprietors, bursars, school admins, parents and the WardPay team. Updated 25 October 2026.</w:t>
       </w:r>
     </w:p>
     <w:p>
@@ -889,7 +889,7 @@
           </w:pPr>
           <w:hyperlink w:history="1" w:anchor="_Toc36">
             <w:r>
-              <w:t xml:space="preserve">Writing off debt</w:t>
+              <w:t xml:space="preserve">The school’s own instalment plans</w:t>
             </w:r>
             <w:r>
               <w:tab/>
@@ -897,28 +897,6 @@
             <w:r>
               <w:fldChar w:fldCharType="begin" w:dirty="true"/>
               <w:instrText xml:space="preserve">PAGEREF _Toc36 \h</w:instrText>
-              <w:fldChar w:fldCharType="separate"/>
-              <w:fldChar w:fldCharType="end"/>
-            </w:r>
-          </w:hyperlink>
-        </w:p>
-        <w:p>
-          <w:pPr>
-            <w:pStyle w:val="TOC1"/>
-            <w:tabs>
-              <w:tab w:val="right" w:pos="9638" w:leader="dot"/>
-            </w:tabs>
-          </w:pPr>
-          <w:hyperlink w:history="1" w:anchor="_Toc37">
-            <w:r>
-              <w:t xml:space="preserve">Payments</w:t>
-            </w:r>
-            <w:r>
-              <w:tab/>
-            </w:r>
-            <w:r>
-              <w:fldChar w:fldCharType="begin" w:dirty="true"/>
-              <w:instrText xml:space="preserve">PAGEREF _Toc37 \h</w:instrText>
               <w:fldChar w:fldCharType="separate"/>
               <w:fldChar w:fldCharType="end"/>
             </w:r>
@@ -932,9 +910,31 @@
             </w:tabs>
             <w:ind w:left="220"/>
           </w:pPr>
+          <w:hyperlink w:history="1" w:anchor="_Toc37">
+            <w:r>
+              <w:t xml:space="preserve">Writing off debt</w:t>
+            </w:r>
+            <w:r>
+              <w:tab/>
+            </w:r>
+            <w:r>
+              <w:fldChar w:fldCharType="begin" w:dirty="true"/>
+              <w:instrText xml:space="preserve">PAGEREF _Toc37 \h</w:instrText>
+              <w:fldChar w:fldCharType="separate"/>
+              <w:fldChar w:fldCharType="end"/>
+            </w:r>
+          </w:hyperlink>
+        </w:p>
+        <w:p>
+          <w:pPr>
+            <w:pStyle w:val="TOC1"/>
+            <w:tabs>
+              <w:tab w:val="right" w:pos="9638" w:leader="dot"/>
+            </w:tabs>
+          </w:pPr>
           <w:hyperlink w:history="1" w:anchor="_Toc38">
             <w:r>
-              <w:t xml:space="preserve">How parents pay</w:t>
+              <w:t xml:space="preserve">Payments</w:t>
             </w:r>
             <w:r>
               <w:tab/>
@@ -957,7 +957,7 @@
           </w:pPr>
           <w:hyperlink w:history="1" w:anchor="_Toc39">
             <w:r>
-              <w:t xml:space="preserve">Seeing payments</w:t>
+              <w:t xml:space="preserve">How parents pay</w:t>
             </w:r>
             <w:r>
               <w:tab/>
@@ -980,7 +980,7 @@
           </w:pPr>
           <w:hyperlink w:history="1" w:anchor="_Toc40">
             <w:r>
-              <w:t xml:space="preserve">Recording cash, teller, POS or a direct transfer</w:t>
+              <w:t xml:space="preserve">Seeing payments</w:t>
             </w:r>
             <w:r>
               <w:tab/>
@@ -1003,7 +1003,7 @@
           </w:pPr>
           <w:hyperlink w:history="1" w:anchor="_Toc41">
             <w:r>
-              <w:t xml:space="preserve">Saying what a payment was for, after it arrived</w:t>
+              <w:t xml:space="preserve">Recording cash, teller, POS or a direct transfer</w:t>
             </w:r>
             <w:r>
               <w:tab/>
@@ -1026,7 +1026,7 @@
           </w:pPr>
           <w:hyperlink w:history="1" w:anchor="_Toc42">
             <w:r>
-              <w:t xml:space="preserve">Reversing a payment</w:t>
+              <w:t xml:space="preserve">Saying what a payment was for, after it arrived</w:t>
             </w:r>
             <w:r>
               <w:tab/>
@@ -1049,7 +1049,7 @@
           </w:pPr>
           <w:hyperlink w:history="1" w:anchor="_Toc43">
             <w:r>
-              <w:t xml:space="preserve">Card payment link for one pupil</w:t>
+              <w:t xml:space="preserve">Reversing a payment</w:t>
             </w:r>
             <w:r>
               <w:tab/>
@@ -1072,7 +1072,7 @@
           </w:pPr>
           <w:hyperlink w:history="1" w:anchor="_Toc44">
             <w:r>
-              <w:t xml:space="preserve">Receipts</w:t>
+              <w:t xml:space="preserve">Card payment link for one pupil</w:t>
             </w:r>
             <w:r>
               <w:tab/>
@@ -1095,7 +1095,7 @@
           </w:pPr>
           <w:hyperlink w:history="1" w:anchor="_Toc45">
             <w:r>
-              <w:t xml:space="preserve">Paid into the bank (Paystack payouts)</w:t>
+              <w:t xml:space="preserve">Receipts</w:t>
             </w:r>
             <w:r>
               <w:tab/>
@@ -1103,28 +1103,6 @@
             <w:r>
               <w:fldChar w:fldCharType="begin" w:dirty="true"/>
               <w:instrText xml:space="preserve">PAGEREF _Toc45 \h</w:instrText>
-              <w:fldChar w:fldCharType="separate"/>
-              <w:fldChar w:fldCharType="end"/>
-            </w:r>
-          </w:hyperlink>
-        </w:p>
-        <w:p>
-          <w:pPr>
-            <w:pStyle w:val="TOC1"/>
-            <w:tabs>
-              <w:tab w:val="right" w:pos="9638" w:leader="dot"/>
-            </w:tabs>
-          </w:pPr>
-          <w:hyperlink w:history="1" w:anchor="_Toc46">
-            <w:r>
-              <w:t xml:space="preserve">Cash and spending</w:t>
-            </w:r>
-            <w:r>
-              <w:tab/>
-            </w:r>
-            <w:r>
-              <w:fldChar w:fldCharType="begin" w:dirty="true"/>
-              <w:instrText xml:space="preserve">PAGEREF _Toc46 \h</w:instrText>
               <w:fldChar w:fldCharType="separate"/>
               <w:fldChar w:fldCharType="end"/>
             </w:r>
@@ -1138,9 +1116,31 @@
             </w:tabs>
             <w:ind w:left="220"/>
           </w:pPr>
+          <w:hyperlink w:history="1" w:anchor="_Toc46">
+            <w:r>
+              <w:t xml:space="preserve">Paid into the bank (Paystack payouts)</w:t>
+            </w:r>
+            <w:r>
+              <w:tab/>
+            </w:r>
+            <w:r>
+              <w:fldChar w:fldCharType="begin" w:dirty="true"/>
+              <w:instrText xml:space="preserve">PAGEREF _Toc46 \h</w:instrText>
+              <w:fldChar w:fldCharType="separate"/>
+              <w:fldChar w:fldCharType="end"/>
+            </w:r>
+          </w:hyperlink>
+        </w:p>
+        <w:p>
+          <w:pPr>
+            <w:pStyle w:val="TOC1"/>
+            <w:tabs>
+              <w:tab w:val="right" w:pos="9638" w:leader="dot"/>
+            </w:tabs>
+          </w:pPr>
           <w:hyperlink w:history="1" w:anchor="_Toc47">
             <w:r>
-              <w:t xml:space="preserve">Cash book</w:t>
+              <w:t xml:space="preserve">Cash and spending</w:t>
             </w:r>
             <w:r>
               <w:tab/>
@@ -1163,7 +1163,7 @@
           </w:pPr>
           <w:hyperlink w:history="1" w:anchor="_Toc48">
             <w:r>
-              <w:t xml:space="preserve">Banking cash, checked by a second person</w:t>
+              <w:t xml:space="preserve">Cash book</w:t>
             </w:r>
             <w:r>
               <w:tab/>
@@ -1186,7 +1186,7 @@
           </w:pPr>
           <w:hyperlink w:history="1" w:anchor="_Toc49">
             <w:r>
-              <w:t xml:space="preserve">Closing the day (drawer count)</w:t>
+              <w:t xml:space="preserve">Banking cash, checked by a second person</w:t>
             </w:r>
             <w:r>
               <w:tab/>
@@ -1209,7 +1209,7 @@
           </w:pPr>
           <w:hyperlink w:history="1" w:anchor="_Toc50">
             <w:r>
-              <w:t xml:space="preserve">Recording spending</w:t>
+              <w:t xml:space="preserve">Closing the day (drawer count)</w:t>
             </w:r>
             <w:r>
               <w:tab/>
@@ -1232,7 +1232,7 @@
           </w:pPr>
           <w:hyperlink w:history="1" w:anchor="_Toc51">
             <w:r>
-              <w:t xml:space="preserve">Income and expenditure</w:t>
+              <w:t xml:space="preserve">Recording spending</w:t>
             </w:r>
             <w:r>
               <w:tab/>
@@ -1240,28 +1240,6 @@
             <w:r>
               <w:fldChar w:fldCharType="begin" w:dirty="true"/>
               <w:instrText xml:space="preserve">PAGEREF _Toc51 \h</w:instrText>
-              <w:fldChar w:fldCharType="separate"/>
-              <w:fldChar w:fldCharType="end"/>
-            </w:r>
-          </w:hyperlink>
-        </w:p>
-        <w:p>
-          <w:pPr>
-            <w:pStyle w:val="TOC1"/>
-            <w:tabs>
-              <w:tab w:val="right" w:pos="9638" w:leader="dot"/>
-            </w:tabs>
-          </w:pPr>
-          <w:hyperlink w:history="1" w:anchor="_Toc52">
-            <w:r>
-              <w:t xml:space="preserve">Messages to parents</w:t>
-            </w:r>
-            <w:r>
-              <w:tab/>
-            </w:r>
-            <w:r>
-              <w:fldChar w:fldCharType="begin" w:dirty="true"/>
-              <w:instrText xml:space="preserve">PAGEREF _Toc52 \h</w:instrText>
               <w:fldChar w:fldCharType="separate"/>
               <w:fldChar w:fldCharType="end"/>
             </w:r>
@@ -1275,9 +1253,31 @@
             </w:tabs>
             <w:ind w:left="220"/>
           </w:pPr>
+          <w:hyperlink w:history="1" w:anchor="_Toc52">
+            <w:r>
+              <w:t xml:space="preserve">Income and expenditure</w:t>
+            </w:r>
+            <w:r>
+              <w:tab/>
+            </w:r>
+            <w:r>
+              <w:fldChar w:fldCharType="begin" w:dirty="true"/>
+              <w:instrText xml:space="preserve">PAGEREF _Toc52 \h</w:instrText>
+              <w:fldChar w:fldCharType="separate"/>
+              <w:fldChar w:fldCharType="end"/>
+            </w:r>
+          </w:hyperlink>
+        </w:p>
+        <w:p>
+          <w:pPr>
+            <w:pStyle w:val="TOC1"/>
+            <w:tabs>
+              <w:tab w:val="right" w:pos="9638" w:leader="dot"/>
+            </w:tabs>
+          </w:pPr>
           <w:hyperlink w:history="1" w:anchor="_Toc53">
             <w:r>
-              <w:t xml:space="preserve">Sent messages</w:t>
+              <w:t xml:space="preserve">Messages to parents</w:t>
             </w:r>
             <w:r>
               <w:tab/>
@@ -1300,7 +1300,7 @@
           </w:pPr>
           <w:hyperlink w:history="1" w:anchor="_Toc54">
             <w:r>
-              <w:t xml:space="preserve">The wording</w:t>
+              <w:t xml:space="preserve">Sent messages</w:t>
             </w:r>
             <w:r>
               <w:tab/>
@@ -1323,7 +1323,7 @@
           </w:pPr>
           <w:hyperlink w:history="1" w:anchor="_Toc55">
             <w:r>
-              <w:t xml:space="preserve">The reminder schedule</w:t>
+              <w:t xml:space="preserve">The wording</w:t>
             </w:r>
             <w:r>
               <w:tab/>
@@ -1331,28 +1331,6 @@
             <w:r>
               <w:fldChar w:fldCharType="begin" w:dirty="true"/>
               <w:instrText xml:space="preserve">PAGEREF _Toc55 \h</w:instrText>
-              <w:fldChar w:fldCharType="separate"/>
-              <w:fldChar w:fldCharType="end"/>
-            </w:r>
-          </w:hyperlink>
-        </w:p>
-        <w:p>
-          <w:pPr>
-            <w:pStyle w:val="TOC1"/>
-            <w:tabs>
-              <w:tab w:val="right" w:pos="9638" w:leader="dot"/>
-            </w:tabs>
-          </w:pPr>
-          <w:hyperlink w:history="1" w:anchor="_Toc56">
-            <w:r>
-              <w:t xml:space="preserve">The Overview page and reports</w:t>
-            </w:r>
-            <w:r>
-              <w:tab/>
-            </w:r>
-            <w:r>
-              <w:fldChar w:fldCharType="begin" w:dirty="true"/>
-              <w:instrText xml:space="preserve">PAGEREF _Toc56 \h</w:instrText>
               <w:fldChar w:fldCharType="separate"/>
               <w:fldChar w:fldCharType="end"/>
             </w:r>
@@ -1366,9 +1344,31 @@
             </w:tabs>
             <w:ind w:left="220"/>
           </w:pPr>
+          <w:hyperlink w:history="1" w:anchor="_Toc56">
+            <w:r>
+              <w:t xml:space="preserve">The reminder schedule</w:t>
+            </w:r>
+            <w:r>
+              <w:tab/>
+            </w:r>
+            <w:r>
+              <w:fldChar w:fldCharType="begin" w:dirty="true"/>
+              <w:instrText xml:space="preserve">PAGEREF _Toc56 \h</w:instrText>
+              <w:fldChar w:fldCharType="separate"/>
+              <w:fldChar w:fldCharType="end"/>
+            </w:r>
+          </w:hyperlink>
+        </w:p>
+        <w:p>
+          <w:pPr>
+            <w:pStyle w:val="TOC1"/>
+            <w:tabs>
+              <w:tab w:val="right" w:pos="9638" w:leader="dot"/>
+            </w:tabs>
+          </w:pPr>
           <w:hyperlink w:history="1" w:anchor="_Toc57">
             <w:r>
-              <w:t xml:space="preserve">Overview</w:t>
+              <w:t xml:space="preserve">The Overview page and reports</w:t>
             </w:r>
             <w:r>
               <w:tab/>
@@ -1391,7 +1391,7 @@
           </w:pPr>
           <w:hyperlink w:history="1" w:anchor="_Toc58">
             <w:r>
-              <w:t xml:space="preserve">Pace and forecast</w:t>
+              <w:t xml:space="preserve">Overview</w:t>
             </w:r>
             <w:r>
               <w:tab/>
@@ -1414,7 +1414,7 @@
           </w:pPr>
           <w:hyperlink w:history="1" w:anchor="_Toc59">
             <w:r>
-              <w:t xml:space="preserve">Debtors</w:t>
+              <w:t xml:space="preserve">Pace and forecast</w:t>
             </w:r>
             <w:r>
               <w:tab/>
@@ -1437,7 +1437,7 @@
           </w:pPr>
           <w:hyperlink w:history="1" w:anchor="_Toc60">
             <w:r>
-              <w:t xml:space="preserve">Money received</w:t>
+              <w:t xml:space="preserve">Debtors</w:t>
             </w:r>
             <w:r>
               <w:tab/>
@@ -1460,7 +1460,7 @@
           </w:pPr>
           <w:hyperlink w:history="1" w:anchor="_Toc61">
             <w:r>
-              <w:t xml:space="preserve">Fee status by pupil</w:t>
+              <w:t xml:space="preserve">Money received</w:t>
             </w:r>
             <w:r>
               <w:tab/>
@@ -1483,7 +1483,7 @@
           </w:pPr>
           <w:hyperlink w:history="1" w:anchor="_Toc62">
             <w:r>
-              <w:t xml:space="preserve">Unusual activity</w:t>
+              <w:t xml:space="preserve">Fee status by pupil</w:t>
             </w:r>
             <w:r>
               <w:tab/>
@@ -1491,28 +1491,6 @@
             <w:r>
               <w:fldChar w:fldCharType="begin" w:dirty="true"/>
               <w:instrText xml:space="preserve">PAGEREF _Toc62 \h</w:instrText>
-              <w:fldChar w:fldCharType="separate"/>
-              <w:fldChar w:fldCharType="end"/>
-            </w:r>
-          </w:hyperlink>
-        </w:p>
-        <w:p>
-          <w:pPr>
-            <w:pStyle w:val="TOC1"/>
-            <w:tabs>
-              <w:tab w:val="right" w:pos="9638" w:leader="dot"/>
-            </w:tabs>
-          </w:pPr>
-          <w:hyperlink w:history="1" w:anchor="_Toc63">
-            <w:r>
-              <w:t xml:space="preserve">For the accountant</w:t>
-            </w:r>
-            <w:r>
-              <w:tab/>
-            </w:r>
-            <w:r>
-              <w:fldChar w:fldCharType="begin" w:dirty="true"/>
-              <w:instrText xml:space="preserve">PAGEREF _Toc63 \h</w:instrText>
               <w:fldChar w:fldCharType="separate"/>
               <w:fldChar w:fldCharType="end"/>
             </w:r>
@@ -1526,9 +1504,31 @@
             </w:tabs>
             <w:ind w:left="220"/>
           </w:pPr>
+          <w:hyperlink w:history="1" w:anchor="_Toc63">
+            <w:r>
+              <w:t xml:space="preserve">Unusual activity</w:t>
+            </w:r>
+            <w:r>
+              <w:tab/>
+            </w:r>
+            <w:r>
+              <w:fldChar w:fldCharType="begin" w:dirty="true"/>
+              <w:instrText xml:space="preserve">PAGEREF _Toc63 \h</w:instrText>
+              <w:fldChar w:fldCharType="separate"/>
+              <w:fldChar w:fldCharType="end"/>
+            </w:r>
+          </w:hyperlink>
+        </w:p>
+        <w:p>
+          <w:pPr>
+            <w:pStyle w:val="TOC1"/>
+            <w:tabs>
+              <w:tab w:val="right" w:pos="9638" w:leader="dot"/>
+            </w:tabs>
+          </w:pPr>
           <w:hyperlink w:history="1" w:anchor="_Toc64">
             <w:r>
-              <w:t xml:space="preserve">The general journal</w:t>
+              <w:t xml:space="preserve">For the accountant</w:t>
             </w:r>
             <w:r>
               <w:tab/>
@@ -1551,7 +1551,7 @@
           </w:pPr>
           <w:hyperlink w:history="1" w:anchor="_Toc65">
             <w:r>
-              <w:t xml:space="preserve">Chart of accounts</w:t>
+              <w:t xml:space="preserve">The general journal</w:t>
             </w:r>
             <w:r>
               <w:tab/>
@@ -1574,7 +1574,7 @@
           </w:pPr>
           <w:hyperlink w:history="1" w:anchor="_Toc66">
             <w:r>
-              <w:t xml:space="preserve">Closing the books (closing a term)</w:t>
+              <w:t xml:space="preserve">Chart of accounts</w:t>
             </w:r>
             <w:r>
               <w:tab/>
@@ -1597,7 +1597,7 @@
           </w:pPr>
           <w:hyperlink w:history="1" w:anchor="_Toc67">
             <w:r>
-              <w:t xml:space="preserve">End-of-session pack</w:t>
+              <w:t xml:space="preserve">Closing the books (closing a term)</w:t>
             </w:r>
             <w:r>
               <w:tab/>
@@ -1605,28 +1605,6 @@
             <w:r>
               <w:fldChar w:fldCharType="begin" w:dirty="true"/>
               <w:instrText xml:space="preserve">PAGEREF _Toc67 \h</w:instrText>
-              <w:fldChar w:fldCharType="separate"/>
-              <w:fldChar w:fldCharType="end"/>
-            </w:r>
-          </w:hyperlink>
-        </w:p>
-        <w:p>
-          <w:pPr>
-            <w:pStyle w:val="TOC1"/>
-            <w:tabs>
-              <w:tab w:val="right" w:pos="9638" w:leader="dot"/>
-            </w:tabs>
-          </w:pPr>
-          <w:hyperlink w:history="1" w:anchor="_Toc68">
-            <w:r>
-              <w:t xml:space="preserve">The school’s own records</w:t>
-            </w:r>
-            <w:r>
-              <w:tab/>
-            </w:r>
-            <w:r>
-              <w:fldChar w:fldCharType="begin" w:dirty="true"/>
-              <w:instrText xml:space="preserve">PAGEREF _Toc68 \h</w:instrText>
               <w:fldChar w:fldCharType="separate"/>
               <w:fldChar w:fldCharType="end"/>
             </w:r>
@@ -1640,9 +1618,31 @@
             </w:tabs>
             <w:ind w:left="220"/>
           </w:pPr>
+          <w:hyperlink w:history="1" w:anchor="_Toc68">
+            <w:r>
+              <w:t xml:space="preserve">End-of-session pack</w:t>
+            </w:r>
+            <w:r>
+              <w:tab/>
+            </w:r>
+            <w:r>
+              <w:fldChar w:fldCharType="begin" w:dirty="true"/>
+              <w:instrText xml:space="preserve">PAGEREF _Toc68 \h</w:instrText>
+              <w:fldChar w:fldCharType="separate"/>
+              <w:fldChar w:fldCharType="end"/>
+            </w:r>
+          </w:hyperlink>
+        </w:p>
+        <w:p>
+          <w:pPr>
+            <w:pStyle w:val="TOC1"/>
+            <w:tabs>
+              <w:tab w:val="right" w:pos="9638" w:leader="dot"/>
+            </w:tabs>
+          </w:pPr>
           <w:hyperlink w:history="1" w:anchor="_Toc69">
             <w:r>
-              <w:t xml:space="preserve">Activity log</w:t>
+              <w:t xml:space="preserve">The school’s own records</w:t>
             </w:r>
             <w:r>
               <w:tab/>
@@ -1665,7 +1665,7 @@
           </w:pPr>
           <w:hyperlink w:history="1" w:anchor="_Toc70">
             <w:r>
-              <w:t xml:space="preserve">Subscription</w:t>
+              <w:t xml:space="preserve">Activity log</w:t>
             </w:r>
             <w:r>
               <w:tab/>
@@ -1673,28 +1673,6 @@
             <w:r>
               <w:fldChar w:fldCharType="begin" w:dirty="true"/>
               <w:instrText xml:space="preserve">PAGEREF _Toc70 \h</w:instrText>
-              <w:fldChar w:fldCharType="separate"/>
-              <w:fldChar w:fldCharType="end"/>
-            </w:r>
-          </w:hyperlink>
-        </w:p>
-        <w:p>
-          <w:pPr>
-            <w:pStyle w:val="TOC1"/>
-            <w:tabs>
-              <w:tab w:val="right" w:pos="9638" w:leader="dot"/>
-            </w:tabs>
-          </w:pPr>
-          <w:hyperlink w:history="1" w:anchor="_Toc71">
-            <w:r>
-              <w:t xml:space="preserve">For parents</w:t>
-            </w:r>
-            <w:r>
-              <w:tab/>
-            </w:r>
-            <w:r>
-              <w:fldChar w:fldCharType="begin" w:dirty="true"/>
-              <w:instrText xml:space="preserve">PAGEREF _Toc71 \h</w:instrText>
               <w:fldChar w:fldCharType="separate"/>
               <w:fldChar w:fldCharType="end"/>
             </w:r>
@@ -1708,9 +1686,31 @@
             </w:tabs>
             <w:ind w:left="220"/>
           </w:pPr>
+          <w:hyperlink w:history="1" w:anchor="_Toc71">
+            <w:r>
+              <w:t xml:space="preserve">Subscription</w:t>
+            </w:r>
+            <w:r>
+              <w:tab/>
+            </w:r>
+            <w:r>
+              <w:fldChar w:fldCharType="begin" w:dirty="true"/>
+              <w:instrText xml:space="preserve">PAGEREF _Toc71 \h</w:instrText>
+              <w:fldChar w:fldCharType="separate"/>
+              <w:fldChar w:fldCharType="end"/>
+            </w:r>
+          </w:hyperlink>
+        </w:p>
+        <w:p>
+          <w:pPr>
+            <w:pStyle w:val="TOC1"/>
+            <w:tabs>
+              <w:tab w:val="right" w:pos="9638" w:leader="dot"/>
+            </w:tabs>
+          </w:pPr>
           <w:hyperlink w:history="1" w:anchor="_Toc72">
             <w:r>
-              <w:t xml:space="preserve">Paying from the message link</w:t>
+              <w:t xml:space="preserve">For parents</w:t>
             </w:r>
             <w:r>
               <w:tab/>
@@ -1733,7 +1733,7 @@
           </w:pPr>
           <w:hyperlink w:history="1" w:anchor="_Toc73">
             <w:r>
-              <w:t xml:space="preserve">The parent portal</w:t>
+              <w:t xml:space="preserve">Paying from the message link</w:t>
             </w:r>
             <w:r>
               <w:tab/>
@@ -1756,7 +1756,7 @@
           </w:pPr>
           <w:hyperlink w:history="1" w:anchor="_Toc74">
             <w:r>
-              <w:t xml:space="preserve">Messages and my data</w:t>
+              <w:t xml:space="preserve">The parent portal</w:t>
             </w:r>
             <w:r>
               <w:tab/>
@@ -1771,14 +1771,15 @@
         </w:p>
         <w:p>
           <w:pPr>
-            <w:pStyle w:val="TOC1"/>
+            <w:pStyle w:val="TOC2"/>
             <w:tabs>
               <w:tab w:val="right" w:pos="9638" w:leader="dot"/>
             </w:tabs>
+            <w:ind w:left="220"/>
           </w:pPr>
           <w:hyperlink w:history="1" w:anchor="_Toc75">
             <w:r>
-              <w:t xml:space="preserve">For the WardPay team</w:t>
+              <w:t xml:space="preserve">Spreading the fees with a school plan</w:t>
             </w:r>
             <w:r>
               <w:tab/>
@@ -1801,7 +1802,7 @@
           </w:pPr>
           <w:hyperlink w:history="1" w:anchor="_Toc76">
             <w:r>
-              <w:t xml:space="preserve">Platform overview and trends</w:t>
+              <w:t xml:space="preserve">Messages and my data</w:t>
             </w:r>
             <w:r>
               <w:tab/>
@@ -1816,15 +1817,14 @@
         </w:p>
         <w:p>
           <w:pPr>
-            <w:pStyle w:val="TOC2"/>
+            <w:pStyle w:val="TOC1"/>
             <w:tabs>
               <w:tab w:val="right" w:pos="9638" w:leader="dot"/>
             </w:tabs>
-            <w:ind w:left="220"/>
           </w:pPr>
           <w:hyperlink w:history="1" w:anchor="_Toc77">
             <w:r>
-              <w:t xml:space="preserve">Schools</w:t>
+              <w:t xml:space="preserve">For the WardPay team</w:t>
             </w:r>
             <w:r>
               <w:tab/>
@@ -1847,7 +1847,7 @@
           </w:pPr>
           <w:hyperlink w:history="1" w:anchor="_Toc78">
             <w:r>
-              <w:t xml:space="preserve">Subscription billing and plans</w:t>
+              <w:t xml:space="preserve">Platform overview and trends</w:t>
             </w:r>
             <w:r>
               <w:tab/>
@@ -1870,7 +1870,7 @@
           </w:pPr>
           <w:hyperlink w:history="1" w:anchor="_Toc79">
             <w:r>
-              <w:t xml:space="preserve">Problems, providers and support lookup</w:t>
+              <w:t xml:space="preserve">Schools</w:t>
             </w:r>
             <w:r>
               <w:tab/>
@@ -1878,6 +1878,52 @@
             <w:r>
               <w:fldChar w:fldCharType="begin" w:dirty="true"/>
               <w:instrText xml:space="preserve">PAGEREF _Toc79 \h</w:instrText>
+              <w:fldChar w:fldCharType="separate"/>
+              <w:fldChar w:fldCharType="end"/>
+            </w:r>
+          </w:hyperlink>
+        </w:p>
+        <w:p>
+          <w:pPr>
+            <w:pStyle w:val="TOC2"/>
+            <w:tabs>
+              <w:tab w:val="right" w:pos="9638" w:leader="dot"/>
+            </w:tabs>
+            <w:ind w:left="220"/>
+          </w:pPr>
+          <w:hyperlink w:history="1" w:anchor="_Toc80">
+            <w:r>
+              <w:t xml:space="preserve">Subscription billing and plans</w:t>
+            </w:r>
+            <w:r>
+              <w:tab/>
+            </w:r>
+            <w:r>
+              <w:fldChar w:fldCharType="begin" w:dirty="true"/>
+              <w:instrText xml:space="preserve">PAGEREF _Toc80 \h</w:instrText>
+              <w:fldChar w:fldCharType="separate"/>
+              <w:fldChar w:fldCharType="end"/>
+            </w:r>
+          </w:hyperlink>
+        </w:p>
+        <w:p>
+          <w:pPr>
+            <w:pStyle w:val="TOC2"/>
+            <w:tabs>
+              <w:tab w:val="right" w:pos="9638" w:leader="dot"/>
+            </w:tabs>
+            <w:ind w:left="220"/>
+          </w:pPr>
+          <w:hyperlink w:history="1" w:anchor="_Toc81">
+            <w:r>
+              <w:t xml:space="preserve">Problems, providers and support lookup</w:t>
+            </w:r>
+            <w:r>
+              <w:tab/>
+            </w:r>
+            <w:r>
+              <w:fldChar w:fldCharType="begin" w:dirty="true"/>
+              <w:instrText xml:space="preserve">PAGEREF _Toc81 \h</w:instrText>
               <w:fldChar w:fldCharType="separate"/>
               <w:fldChar w:fldCharType="end"/>
             </w:r>
@@ -1890,7 +1936,7 @@
               <w:tab w:val="right" w:pos="9638" w:leader="dot"/>
             </w:tabs>
           </w:pPr>
-          <w:hyperlink w:history="1" w:anchor="_Toc80">
+          <w:hyperlink w:history="1" w:anchor="_Toc82">
             <w:r>
               <w:t xml:space="preserve">What changed in this guide</w:t>
             </w:r>
@@ -1899,7 +1945,7 @@
             </w:r>
             <w:r>
               <w:fldChar w:fldCharType="begin" w:dirty="true"/>
-              <w:instrText xml:space="preserve">PAGEREF _Toc80 \h</w:instrText>
+              <w:instrText xml:space="preserve">PAGEREF _Toc82 \h</w:instrText>
               <w:fldChar w:fldCharType="separate"/>
               <w:fldChar w:fldCharType="end"/>
             </w:r>
@@ -6275,9 +6321,247 @@
       </w:pPr>
       <w:bookmarkStart w:name="_Toc36" w:id="36"/>
       <w:r>
+        <w:t xml:space="preserve">The school’s own instalment plans</w:t>
+      </w:r>
+      <w:bookmarkEnd w:id="36"/>
+    </w:p>
+    <w:p>
+      <w:pPr>
+        <w:spacing w:after="100"/>
+      </w:pPr>
+      <w:r>
+        <w:rPr>
+          <w:b/>
+          <w:bCs/>
+          <w:color w:val="0F5132"/>
+          <w:sz w:val="22"/>
+          <w:szCs w:val="22"/>
+        </w:rPr>
+        <w:t xml:space="preserve">Who: </w:t>
+      </w:r>
+      <w:r>
+        <w:rPr>
+          <w:sz w:val="22"/>
+          <w:szCs w:val="22"/>
+        </w:rPr>
+        <w:t xml:space="preserve">Bursar, school admin, proprietor set them up; parents choose them</w:t>
+      </w:r>
+    </w:p>
+    <w:p>
+      <w:pPr>
+        <w:spacing w:after="100"/>
+      </w:pPr>
+      <w:r>
+        <w:rPr>
+          <w:b/>
+          <w:bCs/>
+          <w:color w:val="0F5132"/>
+          <w:sz w:val="22"/>
+          <w:szCs w:val="22"/>
+        </w:rPr>
+        <w:t xml:space="preserve">What it’s for: </w:t>
+      </w:r>
+      <w:r>
+        <w:rPr>
+          <w:sz w:val="22"/>
+          <w:szCs w:val="22"/>
+        </w:rPr>
+        <w:t xml:space="preserve">Plans such as “Pay in 3” that parents can choose for themselves, so they can spread fees without calling the bursary.</w:t>
+      </w:r>
+    </w:p>
+    <w:p>
+      <w:pPr>
+        <w:spacing w:after="60" w:before="80"/>
+      </w:pPr>
+      <w:r>
+        <w:rPr>
+          <w:b/>
+          <w:bCs/>
+          <w:color w:val="0F5132"/>
+          <w:sz w:val="22"/>
+          <w:szCs w:val="22"/>
+        </w:rPr>
+        <w:t xml:space="preserve">How to use it</w:t>
+      </w:r>
+    </w:p>
+    <w:p>
+      <w:pPr>
+        <w:pStyle w:val="ListParagraph"/>
+        <w:numPr>
+          <w:ilvl w:val="0"/>
+          <w:numId w:val="33"/>
+        </w:numPr>
+        <w:spacing w:after="60"/>
+      </w:pPr>
+      <w:r>
+        <w:rPr>
+          <w:sz w:val="22"/>
+          <w:szCs w:val="22"/>
+        </w:rPr>
+        <w:t xml:space="preserve">Go to Setup → Fees → Instalment plans and press Add plan.</w:t>
+      </w:r>
+    </w:p>
+    <w:p>
+      <w:pPr>
+        <w:pStyle w:val="ListParagraph"/>
+        <w:numPr>
+          <w:ilvl w:val="0"/>
+          <w:numId w:val="33"/>
+        </w:numPr>
+        <w:spacing w:after="60"/>
+      </w:pPr>
+      <w:r>
+        <w:rPr>
+          <w:sz w:val="22"/>
+          <w:szCs w:val="22"/>
+        </w:rPr>
+        <w:t xml:space="preserve">Give it a name parents will see (for example Pay in 3). For each payment, set its share of the bill and how many days after the term starts it is due; the shares must add up to 100%.</w:t>
+      </w:r>
+    </w:p>
+    <w:p>
+      <w:pPr>
+        <w:pStyle w:val="ListParagraph"/>
+        <w:numPr>
+          <w:ilvl w:val="0"/>
+          <w:numId w:val="33"/>
+        </w:numPr>
+        <w:spacing w:after="60"/>
+      </w:pPr>
+      <w:r>
+        <w:rPr>
+          <w:sz w:val="22"/>
+          <w:szCs w:val="22"/>
+        </w:rPr>
+        <w:t xml:space="preserve">Choose who can choose it: any parent, parents with nothing owed from before, or only staff.</w:t>
+      </w:r>
+    </w:p>
+    <w:p>
+      <w:pPr>
+        <w:pStyle w:val="ListParagraph"/>
+        <w:numPr>
+          <w:ilvl w:val="0"/>
+          <w:numId w:val="33"/>
+        </w:numPr>
+        <w:spacing w:after="60"/>
+      </w:pPr>
+      <w:r>
+        <w:rPr>
+          <w:sz w:val="22"/>
+          <w:szCs w:val="22"/>
+        </w:rPr>
+        <w:t xml:space="preserve">Optionally add a plan charge (a fixed amount or a percentage, up to 20%) to cover the extra payment charges. It goes on the bill when a parent chooses the plan.</w:t>
+      </w:r>
+    </w:p>
+    <w:p>
+      <w:pPr>
+        <w:pStyle w:val="ListParagraph"/>
+        <w:numPr>
+          <w:ilvl w:val="0"/>
+          <w:numId w:val="33"/>
+        </w:numPr>
+        <w:spacing w:after="60"/>
+      </w:pPr>
+      <w:r>
+        <w:rPr>
+          <w:sz w:val="22"/>
+          <w:szCs w:val="22"/>
+        </w:rPr>
+        <w:t xml:space="preserve">Press Save plan. Use Switch off to stop offering a plan; families already on it keep it.</w:t>
+      </w:r>
+    </w:p>
+    <w:p>
+      <w:pPr>
+        <w:spacing w:after="60" w:before="80"/>
+      </w:pPr>
+      <w:r>
+        <w:rPr>
+          <w:b/>
+          <w:bCs/>
+          <w:color w:val="0F5132"/>
+          <w:sz w:val="22"/>
+          <w:szCs w:val="22"/>
+        </w:rPr>
+        <w:t xml:space="preserve">Good to know</w:t>
+      </w:r>
+    </w:p>
+    <w:p>
+      <w:pPr>
+        <w:pStyle w:val="ListParagraph"/>
+        <w:numPr>
+          <w:ilvl w:val="0"/>
+          <w:numId w:val="3"/>
+        </w:numPr>
+        <w:spacing w:after="60"/>
+      </w:pPr>
+      <w:r>
+        <w:rPr>
+          <w:sz w:val="22"/>
+          <w:szCs w:val="22"/>
+        </w:rPr>
+        <w:t xml:space="preserve">Parents see the plans on their payment link and in the portal, with the exact dates and amounts, and choose with two taps.</w:t>
+      </w:r>
+    </w:p>
+    <w:p>
+      <w:pPr>
+        <w:pStyle w:val="ListParagraph"/>
+        <w:numPr>
+          <w:ilvl w:val="0"/>
+          <w:numId w:val="3"/>
+        </w:numPr>
+        <w:spacing w:after="60"/>
+      </w:pPr>
+      <w:r>
+        <w:rPr>
+          <w:sz w:val="22"/>
+          <w:szCs w:val="22"/>
+        </w:rPr>
+        <w:t xml:space="preserve">Payments whose day has already passed fall due straight away. Plans are not offered once a term has ended or been closed.</w:t>
+      </w:r>
+    </w:p>
+    <w:p>
+      <w:pPr>
+        <w:pStyle w:val="ListParagraph"/>
+        <w:numPr>
+          <w:ilvl w:val="0"/>
+          <w:numId w:val="3"/>
+        </w:numPr>
+        <w:spacing w:after="60"/>
+      </w:pPr>
+      <w:r>
+        <w:rPr>
+          <w:sz w:val="22"/>
+          <w:szCs w:val="22"/>
+        </w:rPr>
+        <w:t xml:space="preserve">Staff can put a family on any plan, including staff-only ones: open the bill and press Use a school plan.</w:t>
+      </w:r>
+    </w:p>
+    <w:p>
+      <w:pPr>
+        <w:pStyle w:val="ListParagraph"/>
+        <w:numPr>
+          <w:ilvl w:val="0"/>
+          <w:numId w:val="3"/>
+        </w:numPr>
+        <w:spacing w:after="60"/>
+      </w:pPr>
+      <w:r>
+        <w:rPr>
+          <w:sz w:val="22"/>
+          <w:szCs w:val="22"/>
+        </w:rPr>
+        <w:t xml:space="preserve">WardPay charges the school a small fee for each instalment plan made, on its next termly WardPay bill.</w:t>
+      </w:r>
+    </w:p>
+    <w:p>
+      <w:pPr>
+        <w:pStyle w:val="Heading2"/>
+        <w:spacing w:after="100" w:before="280"/>
+      </w:pPr>
+      <w:bookmarkStart w:name="_Toc37" w:id="37"/>
+      <w:r>
         <w:t xml:space="preserve">Writing off debt</w:t>
       </w:r>
-      <w:bookmarkEnd w:id="36"/>
+      <w:bookmarkEnd w:id="37"/>
     </w:p>
     <w:p>
       <w:pPr>
@@ -6343,7 +6627,7 @@
         <w:pStyle w:val="ListParagraph"/>
         <w:numPr>
           <w:ilvl w:val="0"/>
-          <w:numId w:val="33"/>
+          <w:numId w:val="34"/>
         </w:numPr>
         <w:spacing w:after="60"/>
       </w:pPr>
@@ -6360,7 +6644,7 @@
         <w:pStyle w:val="ListParagraph"/>
         <w:numPr>
           <w:ilvl w:val="0"/>
-          <w:numId w:val="33"/>
+          <w:numId w:val="34"/>
         </w:numPr>
         <w:spacing w:after="60"/>
       </w:pPr>
@@ -6377,7 +6661,7 @@
         <w:pStyle w:val="ListParagraph"/>
         <w:numPr>
           <w:ilvl w:val="0"/>
-          <w:numId w:val="33"/>
+          <w:numId w:val="34"/>
         </w:numPr>
         <w:spacing w:after="60"/>
       </w:pPr>
@@ -6394,7 +6678,7 @@
         <w:pStyle w:val="ListParagraph"/>
         <w:numPr>
           <w:ilvl w:val="0"/>
-          <w:numId w:val="33"/>
+          <w:numId w:val="34"/>
         </w:numPr>
         <w:spacing w:after="60"/>
       </w:pPr>
@@ -6461,11 +6745,11 @@
         <w:pageBreakBefore/>
         <w:spacing w:after="160"/>
       </w:pPr>
-      <w:bookmarkStart w:name="_Toc37" w:id="37"/>
+      <w:bookmarkStart w:name="_Toc38" w:id="38"/>
       <w:r>
         <w:t xml:space="preserve">Payments</w:t>
       </w:r>
-      <w:bookmarkEnd w:id="37"/>
+      <w:bookmarkEnd w:id="38"/>
     </w:p>
     <w:p>
       <w:pPr>
@@ -6484,11 +6768,11 @@
         <w:pStyle w:val="Heading2"/>
         <w:spacing w:after="100" w:before="280"/>
       </w:pPr>
-      <w:bookmarkStart w:name="_Toc38" w:id="38"/>
+      <w:bookmarkStart w:name="_Toc39" w:id="39"/>
       <w:r>
         <w:t xml:space="preserve">How parents pay</w:t>
       </w:r>
-      <w:bookmarkEnd w:id="38"/>
+      <w:bookmarkEnd w:id="39"/>
     </w:p>
     <w:p>
       <w:pPr>
@@ -6554,7 +6838,7 @@
         <w:pStyle w:val="ListParagraph"/>
         <w:numPr>
           <w:ilvl w:val="0"/>
-          <w:numId w:val="34"/>
+          <w:numId w:val="35"/>
         </w:numPr>
         <w:spacing w:after="60"/>
       </w:pPr>
@@ -6571,7 +6855,7 @@
         <w:pStyle w:val="ListParagraph"/>
         <w:numPr>
           <w:ilvl w:val="0"/>
-          <w:numId w:val="34"/>
+          <w:numId w:val="35"/>
         </w:numPr>
         <w:spacing w:after="60"/>
       </w:pPr>
@@ -6588,7 +6872,7 @@
         <w:pStyle w:val="ListParagraph"/>
         <w:numPr>
           <w:ilvl w:val="0"/>
-          <w:numId w:val="34"/>
+          <w:numId w:val="35"/>
         </w:numPr>
         <w:spacing w:after="60"/>
       </w:pPr>
@@ -6605,7 +6889,7 @@
         <w:pStyle w:val="ListParagraph"/>
         <w:numPr>
           <w:ilvl w:val="0"/>
-          <w:numId w:val="34"/>
+          <w:numId w:val="35"/>
         </w:numPr>
         <w:spacing w:after="60"/>
       </w:pPr>
@@ -6654,11 +6938,11 @@
         <w:pStyle w:val="Heading2"/>
         <w:spacing w:after="100" w:before="280"/>
       </w:pPr>
-      <w:bookmarkStart w:name="_Toc39" w:id="39"/>
+      <w:bookmarkStart w:name="_Toc40" w:id="40"/>
       <w:r>
         <w:t xml:space="preserve">Seeing payments</w:t>
       </w:r>
-      <w:bookmarkEnd w:id="39"/>
+      <w:bookmarkEnd w:id="40"/>
     </w:p>
     <w:p>
       <w:pPr>
@@ -6724,7 +7008,7 @@
         <w:pStyle w:val="ListParagraph"/>
         <w:numPr>
           <w:ilvl w:val="0"/>
-          <w:numId w:val="35"/>
+          <w:numId w:val="36"/>
         </w:numPr>
         <w:spacing w:after="60"/>
       </w:pPr>
@@ -6741,11 +7025,11 @@
         <w:pStyle w:val="Heading2"/>
         <w:spacing w:after="100" w:before="280"/>
       </w:pPr>
-      <w:bookmarkStart w:name="_Toc40" w:id="40"/>
+      <w:bookmarkStart w:name="_Toc41" w:id="41"/>
       <w:r>
         <w:t xml:space="preserve">Recording cash, teller, POS or a direct transfer</w:t>
       </w:r>
-      <w:bookmarkEnd w:id="40"/>
+      <w:bookmarkEnd w:id="41"/>
     </w:p>
     <w:p>
       <w:pPr>
@@ -6811,7 +7095,7 @@
         <w:pStyle w:val="ListParagraph"/>
         <w:numPr>
           <w:ilvl w:val="0"/>
-          <w:numId w:val="36"/>
+          <w:numId w:val="37"/>
         </w:numPr>
         <w:spacing w:after="60"/>
       </w:pPr>
@@ -6828,7 +7112,7 @@
         <w:pStyle w:val="ListParagraph"/>
         <w:numPr>
           <w:ilvl w:val="0"/>
-          <w:numId w:val="36"/>
+          <w:numId w:val="37"/>
         </w:numPr>
         <w:spacing w:after="60"/>
       </w:pPr>
@@ -6845,7 +7129,7 @@
         <w:pStyle w:val="ListParagraph"/>
         <w:numPr>
           <w:ilvl w:val="0"/>
-          <w:numId w:val="36"/>
+          <w:numId w:val="37"/>
         </w:numPr>
         <w:spacing w:after="60"/>
       </w:pPr>
@@ -6894,11 +7178,11 @@
         <w:pStyle w:val="Heading2"/>
         <w:spacing w:after="100" w:before="280"/>
       </w:pPr>
-      <w:bookmarkStart w:name="_Toc41" w:id="41"/>
+      <w:bookmarkStart w:name="_Toc42" w:id="42"/>
       <w:r>
         <w:t xml:space="preserve">Saying what a payment was for, after it arrived</w:t>
       </w:r>
-      <w:bookmarkEnd w:id="41"/>
+      <w:bookmarkEnd w:id="42"/>
     </w:p>
     <w:p>
       <w:pPr>
@@ -6964,7 +7248,7 @@
         <w:pStyle w:val="ListParagraph"/>
         <w:numPr>
           <w:ilvl w:val="0"/>
-          <w:numId w:val="37"/>
+          <w:numId w:val="38"/>
         </w:numPr>
         <w:spacing w:after="60"/>
       </w:pPr>
@@ -6981,7 +7265,7 @@
         <w:pStyle w:val="ListParagraph"/>
         <w:numPr>
           <w:ilvl w:val="0"/>
-          <w:numId w:val="37"/>
+          <w:numId w:val="38"/>
         </w:numPr>
         <w:spacing w:after="60"/>
       </w:pPr>
@@ -6998,11 +7282,11 @@
         <w:pStyle w:val="Heading2"/>
         <w:spacing w:after="100" w:before="280"/>
       </w:pPr>
-      <w:bookmarkStart w:name="_Toc42" w:id="42"/>
+      <w:bookmarkStart w:name="_Toc43" w:id="43"/>
       <w:r>
         <w:t xml:space="preserve">Reversing a payment</w:t>
       </w:r>
-      <w:bookmarkEnd w:id="42"/>
+      <w:bookmarkEnd w:id="43"/>
     </w:p>
     <w:p>
       <w:pPr>
@@ -7068,7 +7352,7 @@
         <w:pStyle w:val="ListParagraph"/>
         <w:numPr>
           <w:ilvl w:val="0"/>
-          <w:numId w:val="38"/>
+          <w:numId w:val="39"/>
         </w:numPr>
         <w:spacing w:after="60"/>
       </w:pPr>
@@ -7085,11 +7369,11 @@
         <w:pStyle w:val="Heading2"/>
         <w:spacing w:after="100" w:before="280"/>
       </w:pPr>
-      <w:bookmarkStart w:name="_Toc43" w:id="43"/>
+      <w:bookmarkStart w:name="_Toc44" w:id="44"/>
       <w:r>
         <w:t xml:space="preserve">Card payment link for one pupil</w:t>
       </w:r>
-      <w:bookmarkEnd w:id="43"/>
+      <w:bookmarkEnd w:id="44"/>
     </w:p>
     <w:p>
       <w:pPr>
@@ -7155,7 +7439,7 @@
         <w:pStyle w:val="ListParagraph"/>
         <w:numPr>
           <w:ilvl w:val="0"/>
-          <w:numId w:val="39"/>
+          <w:numId w:val="40"/>
         </w:numPr>
         <w:spacing w:after="60"/>
       </w:pPr>
@@ -7172,11 +7456,11 @@
         <w:pStyle w:val="Heading2"/>
         <w:spacing w:after="100" w:before="280"/>
       </w:pPr>
-      <w:bookmarkStart w:name="_Toc44" w:id="44"/>
+      <w:bookmarkStart w:name="_Toc45" w:id="45"/>
       <w:r>
         <w:t xml:space="preserve">Receipts</w:t>
       </w:r>
-      <w:bookmarkEnd w:id="44"/>
+      <w:bookmarkEnd w:id="45"/>
     </w:p>
     <w:p>
       <w:pPr>
@@ -7242,7 +7526,7 @@
         <w:pStyle w:val="ListParagraph"/>
         <w:numPr>
           <w:ilvl w:val="0"/>
-          <w:numId w:val="40"/>
+          <w:numId w:val="41"/>
         </w:numPr>
         <w:spacing w:after="60"/>
       </w:pPr>
@@ -7259,7 +7543,7 @@
         <w:pStyle w:val="ListParagraph"/>
         <w:numPr>
           <w:ilvl w:val="0"/>
-          <w:numId w:val="40"/>
+          <w:numId w:val="41"/>
         </w:numPr>
         <w:spacing w:after="60"/>
       </w:pPr>
@@ -7276,7 +7560,7 @@
         <w:pStyle w:val="ListParagraph"/>
         <w:numPr>
           <w:ilvl w:val="0"/>
-          <w:numId w:val="40"/>
+          <w:numId w:val="41"/>
         </w:numPr>
         <w:spacing w:after="60"/>
       </w:pPr>
@@ -7293,11 +7577,11 @@
         <w:pStyle w:val="Heading2"/>
         <w:spacing w:after="100" w:before="280"/>
       </w:pPr>
-      <w:bookmarkStart w:name="_Toc45" w:id="45"/>
+      <w:bookmarkStart w:name="_Toc46" w:id="46"/>
       <w:r>
         <w:t xml:space="preserve">Paid into the bank (Paystack payouts)</w:t>
       </w:r>
-      <w:bookmarkEnd w:id="45"/>
+      <w:bookmarkEnd w:id="46"/>
     </w:p>
     <w:p>
       <w:pPr>
@@ -7363,7 +7647,7 @@
         <w:pStyle w:val="ListParagraph"/>
         <w:numPr>
           <w:ilvl w:val="0"/>
-          <w:numId w:val="41"/>
+          <w:numId w:val="42"/>
         </w:numPr>
         <w:spacing w:after="60"/>
       </w:pPr>
@@ -7380,7 +7664,7 @@
         <w:pStyle w:val="ListParagraph"/>
         <w:numPr>
           <w:ilvl w:val="0"/>
-          <w:numId w:val="41"/>
+          <w:numId w:val="42"/>
         </w:numPr>
         <w:spacing w:after="60"/>
       </w:pPr>
@@ -7397,7 +7681,7 @@
         <w:pStyle w:val="ListParagraph"/>
         <w:numPr>
           <w:ilvl w:val="0"/>
-          <w:numId w:val="41"/>
+          <w:numId w:val="42"/>
         </w:numPr>
         <w:spacing w:after="60"/>
       </w:pPr>
@@ -7414,7 +7698,7 @@
         <w:pStyle w:val="ListParagraph"/>
         <w:numPr>
           <w:ilvl w:val="0"/>
-          <w:numId w:val="41"/>
+          <w:numId w:val="42"/>
         </w:numPr>
         <w:spacing w:after="60"/>
       </w:pPr>
@@ -7432,11 +7716,11 @@
         <w:pageBreakBefore/>
         <w:spacing w:after="160"/>
       </w:pPr>
-      <w:bookmarkStart w:name="_Toc46" w:id="46"/>
+      <w:bookmarkStart w:name="_Toc47" w:id="47"/>
       <w:r>
         <w:t xml:space="preserve">Cash and spending</w:t>
       </w:r>
-      <w:bookmarkEnd w:id="46"/>
+      <w:bookmarkEnd w:id="47"/>
     </w:p>
     <w:p>
       <w:pPr>
@@ -7455,11 +7739,11 @@
         <w:pStyle w:val="Heading2"/>
         <w:spacing w:after="100" w:before="280"/>
       </w:pPr>
-      <w:bookmarkStart w:name="_Toc47" w:id="47"/>
+      <w:bookmarkStart w:name="_Toc48" w:id="48"/>
       <w:r>
         <w:t xml:space="preserve">Cash book</w:t>
       </w:r>
-      <w:bookmarkEnd w:id="47"/>
+      <w:bookmarkEnd w:id="48"/>
     </w:p>
     <w:p>
       <w:pPr>
@@ -7525,7 +7809,7 @@
         <w:pStyle w:val="ListParagraph"/>
         <w:numPr>
           <w:ilvl w:val="0"/>
-          <w:numId w:val="42"/>
+          <w:numId w:val="43"/>
         </w:numPr>
         <w:spacing w:after="60"/>
       </w:pPr>
@@ -7574,11 +7858,11 @@
         <w:pStyle w:val="Heading2"/>
         <w:spacing w:after="100" w:before="280"/>
       </w:pPr>
-      <w:bookmarkStart w:name="_Toc48" w:id="48"/>
+      <w:bookmarkStart w:name="_Toc49" w:id="49"/>
       <w:r>
         <w:t xml:space="preserve">Banking cash, checked by a second person</w:t>
       </w:r>
-      <w:bookmarkEnd w:id="48"/>
+      <w:bookmarkEnd w:id="49"/>
     </w:p>
     <w:p>
       <w:pPr>
@@ -7644,7 +7928,7 @@
         <w:pStyle w:val="ListParagraph"/>
         <w:numPr>
           <w:ilvl w:val="0"/>
-          <w:numId w:val="43"/>
+          <w:numId w:val="44"/>
         </w:numPr>
         <w:spacing w:after="60"/>
       </w:pPr>
@@ -7661,7 +7945,7 @@
         <w:pStyle w:val="ListParagraph"/>
         <w:numPr>
           <w:ilvl w:val="0"/>
-          <w:numId w:val="43"/>
+          <w:numId w:val="44"/>
         </w:numPr>
         <w:spacing w:after="60"/>
       </w:pPr>
@@ -7678,11 +7962,11 @@
         <w:pStyle w:val="Heading2"/>
         <w:spacing w:after="100" w:before="280"/>
       </w:pPr>
-      <w:bookmarkStart w:name="_Toc49" w:id="49"/>
+      <w:bookmarkStart w:name="_Toc50" w:id="50"/>
       <w:r>
         <w:t xml:space="preserve">Closing the day (drawer count)</w:t>
       </w:r>
-      <w:bookmarkEnd w:id="49"/>
+      <w:bookmarkEnd w:id="50"/>
     </w:p>
     <w:p>
       <w:pPr>
@@ -7748,7 +8032,7 @@
         <w:pStyle w:val="ListParagraph"/>
         <w:numPr>
           <w:ilvl w:val="0"/>
-          <w:numId w:val="44"/>
+          <w:numId w:val="45"/>
         </w:numPr>
         <w:spacing w:after="60"/>
       </w:pPr>
@@ -7765,11 +8049,11 @@
         <w:pStyle w:val="Heading2"/>
         <w:spacing w:after="100" w:before="280"/>
       </w:pPr>
-      <w:bookmarkStart w:name="_Toc50" w:id="50"/>
+      <w:bookmarkStart w:name="_Toc51" w:id="51"/>
       <w:r>
         <w:t xml:space="preserve">Recording spending</w:t>
       </w:r>
-      <w:bookmarkEnd w:id="50"/>
+      <w:bookmarkEnd w:id="51"/>
     </w:p>
     <w:p>
       <w:pPr>
@@ -7835,7 +8119,7 @@
         <w:pStyle w:val="ListParagraph"/>
         <w:numPr>
           <w:ilvl w:val="0"/>
-          <w:numId w:val="45"/>
+          <w:numId w:val="46"/>
         </w:numPr>
         <w:spacing w:after="60"/>
       </w:pPr>
@@ -7852,7 +8136,7 @@
         <w:pStyle w:val="ListParagraph"/>
         <w:numPr>
           <w:ilvl w:val="0"/>
-          <w:numId w:val="45"/>
+          <w:numId w:val="46"/>
         </w:numPr>
         <w:spacing w:after="60"/>
       </w:pPr>
@@ -7869,7 +8153,7 @@
         <w:pStyle w:val="ListParagraph"/>
         <w:numPr>
           <w:ilvl w:val="0"/>
-          <w:numId w:val="45"/>
+          <w:numId w:val="46"/>
         </w:numPr>
         <w:spacing w:after="60"/>
       </w:pPr>
@@ -7918,11 +8202,11 @@
         <w:pStyle w:val="Heading2"/>
         <w:spacing w:after="100" w:before="280"/>
       </w:pPr>
-      <w:bookmarkStart w:name="_Toc51" w:id="51"/>
+      <w:bookmarkStart w:name="_Toc52" w:id="52"/>
       <w:r>
         <w:t xml:space="preserve">Income and expenditure</w:t>
       </w:r>
-      <w:bookmarkEnd w:id="51"/>
+      <w:bookmarkEnd w:id="52"/>
     </w:p>
     <w:p>
       <w:pPr>
@@ -7988,7 +8272,7 @@
         <w:pStyle w:val="ListParagraph"/>
         <w:numPr>
           <w:ilvl w:val="0"/>
-          <w:numId w:val="46"/>
+          <w:numId w:val="47"/>
         </w:numPr>
         <w:spacing w:after="60"/>
       </w:pPr>
@@ -8006,11 +8290,11 @@
         <w:pageBreakBefore/>
         <w:spacing w:after="160"/>
       </w:pPr>
-      <w:bookmarkStart w:name="_Toc52" w:id="52"/>
+      <w:bookmarkStart w:name="_Toc53" w:id="53"/>
       <w:r>
         <w:t xml:space="preserve">Messages to parents</w:t>
       </w:r>
-      <w:bookmarkEnd w:id="52"/>
+      <w:bookmarkEnd w:id="53"/>
     </w:p>
     <w:p>
       <w:pPr>
@@ -8029,11 +8313,11 @@
         <w:pStyle w:val="Heading2"/>
         <w:spacing w:after="100" w:before="280"/>
       </w:pPr>
-      <w:bookmarkStart w:name="_Toc53" w:id="53"/>
+      <w:bookmarkStart w:name="_Toc54" w:id="54"/>
       <w:r>
         <w:t xml:space="preserve">Sent messages</w:t>
       </w:r>
-      <w:bookmarkEnd w:id="53"/>
+      <w:bookmarkEnd w:id="54"/>
     </w:p>
     <w:p>
       <w:pPr>
@@ -8099,7 +8383,7 @@
         <w:pStyle w:val="ListParagraph"/>
         <w:numPr>
           <w:ilvl w:val="0"/>
-          <w:numId w:val="47"/>
+          <w:numId w:val="48"/>
         </w:numPr>
         <w:spacing w:after="60"/>
       </w:pPr>
@@ -8116,11 +8400,11 @@
         <w:pStyle w:val="Heading2"/>
         <w:spacing w:after="100" w:before="280"/>
       </w:pPr>
-      <w:bookmarkStart w:name="_Toc54" w:id="54"/>
+      <w:bookmarkStart w:name="_Toc55" w:id="55"/>
       <w:r>
         <w:t xml:space="preserve">The wording</w:t>
       </w:r>
-      <w:bookmarkEnd w:id="54"/>
+      <w:bookmarkEnd w:id="55"/>
     </w:p>
     <w:p>
       <w:pPr>
@@ -8186,7 +8470,7 @@
         <w:pStyle w:val="ListParagraph"/>
         <w:numPr>
           <w:ilvl w:val="0"/>
-          <w:numId w:val="48"/>
+          <w:numId w:val="49"/>
         </w:numPr>
         <w:spacing w:after="60"/>
       </w:pPr>
@@ -8203,7 +8487,7 @@
         <w:pStyle w:val="ListParagraph"/>
         <w:numPr>
           <w:ilvl w:val="0"/>
-          <w:numId w:val="48"/>
+          <w:numId w:val="49"/>
         </w:numPr>
         <w:spacing w:after="60"/>
       </w:pPr>
@@ -8220,7 +8504,7 @@
         <w:pStyle w:val="ListParagraph"/>
         <w:numPr>
           <w:ilvl w:val="0"/>
-          <w:numId w:val="48"/>
+          <w:numId w:val="49"/>
         </w:numPr>
         <w:spacing w:after="60"/>
       </w:pPr>
@@ -8269,11 +8553,11 @@
         <w:pStyle w:val="Heading2"/>
         <w:spacing w:after="100" w:before="280"/>
       </w:pPr>
-      <w:bookmarkStart w:name="_Toc55" w:id="55"/>
+      <w:bookmarkStart w:name="_Toc56" w:id="56"/>
       <w:r>
         <w:t xml:space="preserve">The reminder schedule</w:t>
       </w:r>
-      <w:bookmarkEnd w:id="55"/>
+      <w:bookmarkEnd w:id="56"/>
     </w:p>
     <w:p>
       <w:pPr>
@@ -8339,7 +8623,7 @@
         <w:pStyle w:val="ListParagraph"/>
         <w:numPr>
           <w:ilvl w:val="0"/>
-          <w:numId w:val="49"/>
+          <w:numId w:val="50"/>
         </w:numPr>
         <w:spacing w:after="60"/>
       </w:pPr>
@@ -8356,7 +8640,7 @@
         <w:pStyle w:val="ListParagraph"/>
         <w:numPr>
           <w:ilvl w:val="0"/>
-          <w:numId w:val="49"/>
+          <w:numId w:val="50"/>
         </w:numPr>
         <w:spacing w:after="60"/>
       </w:pPr>
@@ -8373,7 +8657,7 @@
         <w:pStyle w:val="ListParagraph"/>
         <w:numPr>
           <w:ilvl w:val="0"/>
-          <w:numId w:val="49"/>
+          <w:numId w:val="50"/>
         </w:numPr>
         <w:spacing w:after="60"/>
       </w:pPr>
@@ -8391,11 +8675,11 @@
         <w:pageBreakBefore/>
         <w:spacing w:after="160"/>
       </w:pPr>
-      <w:bookmarkStart w:name="_Toc56" w:id="56"/>
+      <w:bookmarkStart w:name="_Toc57" w:id="57"/>
       <w:r>
         <w:t xml:space="preserve">The Overview page and reports</w:t>
       </w:r>
-      <w:bookmarkEnd w:id="56"/>
+      <w:bookmarkEnd w:id="57"/>
     </w:p>
     <w:p>
       <w:pPr>
@@ -8414,11 +8698,11 @@
         <w:pStyle w:val="Heading2"/>
         <w:spacing w:after="100" w:before="280"/>
       </w:pPr>
-      <w:bookmarkStart w:name="_Toc57" w:id="57"/>
+      <w:bookmarkStart w:name="_Toc58" w:id="58"/>
       <w:r>
         <w:t xml:space="preserve">Overview</w:t>
       </w:r>
-      <w:bookmarkEnd w:id="57"/>
+      <w:bookmarkEnd w:id="58"/>
     </w:p>
     <w:p>
       <w:pPr>
@@ -8484,7 +8768,7 @@
         <w:pStyle w:val="ListParagraph"/>
         <w:numPr>
           <w:ilvl w:val="0"/>
-          <w:numId w:val="50"/>
+          <w:numId w:val="51"/>
         </w:numPr>
         <w:spacing w:after="60"/>
       </w:pPr>
@@ -8501,7 +8785,7 @@
         <w:pStyle w:val="ListParagraph"/>
         <w:numPr>
           <w:ilvl w:val="0"/>
-          <w:numId w:val="50"/>
+          <w:numId w:val="51"/>
         </w:numPr>
         <w:spacing w:after="60"/>
       </w:pPr>
@@ -8518,11 +8802,11 @@
         <w:pStyle w:val="Heading2"/>
         <w:spacing w:after="100" w:before="280"/>
       </w:pPr>
-      <w:bookmarkStart w:name="_Toc58" w:id="58"/>
+      <w:bookmarkStart w:name="_Toc59" w:id="59"/>
       <w:r>
         <w:t xml:space="preserve">Pace and forecast</w:t>
       </w:r>
-      <w:bookmarkEnd w:id="58"/>
+      <w:bookmarkEnd w:id="59"/>
     </w:p>
     <w:p>
       <w:pPr>
@@ -8588,7 +8872,7 @@
         <w:pStyle w:val="ListParagraph"/>
         <w:numPr>
           <w:ilvl w:val="0"/>
-          <w:numId w:val="51"/>
+          <w:numId w:val="52"/>
         </w:numPr>
         <w:spacing w:after="60"/>
       </w:pPr>
@@ -8605,7 +8889,7 @@
         <w:pStyle w:val="ListParagraph"/>
         <w:numPr>
           <w:ilvl w:val="0"/>
-          <w:numId w:val="51"/>
+          <w:numId w:val="52"/>
         </w:numPr>
         <w:spacing w:after="60"/>
       </w:pPr>
@@ -8622,7 +8906,7 @@
         <w:pStyle w:val="ListParagraph"/>
         <w:numPr>
           <w:ilvl w:val="0"/>
-          <w:numId w:val="51"/>
+          <w:numId w:val="52"/>
         </w:numPr>
         <w:spacing w:after="60"/>
       </w:pPr>
@@ -8639,11 +8923,11 @@
         <w:pStyle w:val="Heading2"/>
         <w:spacing w:after="100" w:before="280"/>
       </w:pPr>
-      <w:bookmarkStart w:name="_Toc59" w:id="59"/>
+      <w:bookmarkStart w:name="_Toc60" w:id="60"/>
       <w:r>
         <w:t xml:space="preserve">Debtors</w:t>
       </w:r>
-      <w:bookmarkEnd w:id="59"/>
+      <w:bookmarkEnd w:id="60"/>
     </w:p>
     <w:p>
       <w:pPr>
@@ -8709,7 +8993,7 @@
         <w:pStyle w:val="ListParagraph"/>
         <w:numPr>
           <w:ilvl w:val="0"/>
-          <w:numId w:val="52"/>
+          <w:numId w:val="53"/>
         </w:numPr>
         <w:spacing w:after="60"/>
       </w:pPr>
@@ -8726,11 +9010,11 @@
         <w:pStyle w:val="Heading2"/>
         <w:spacing w:after="100" w:before="280"/>
       </w:pPr>
-      <w:bookmarkStart w:name="_Toc60" w:id="60"/>
+      <w:bookmarkStart w:name="_Toc61" w:id="61"/>
       <w:r>
         <w:t xml:space="preserve">Money received</w:t>
       </w:r>
-      <w:bookmarkEnd w:id="60"/>
+      <w:bookmarkEnd w:id="61"/>
     </w:p>
     <w:p>
       <w:pPr>
@@ -8796,7 +9080,7 @@
         <w:pStyle w:val="ListParagraph"/>
         <w:numPr>
           <w:ilvl w:val="0"/>
-          <w:numId w:val="53"/>
+          <w:numId w:val="54"/>
         </w:numPr>
         <w:spacing w:after="60"/>
       </w:pPr>
@@ -8813,11 +9097,11 @@
         <w:pStyle w:val="Heading2"/>
         <w:spacing w:after="100" w:before="280"/>
       </w:pPr>
-      <w:bookmarkStart w:name="_Toc61" w:id="61"/>
+      <w:bookmarkStart w:name="_Toc62" w:id="62"/>
       <w:r>
         <w:t xml:space="preserve">Fee status by pupil</w:t>
       </w:r>
-      <w:bookmarkEnd w:id="61"/>
+      <w:bookmarkEnd w:id="62"/>
     </w:p>
     <w:p>
       <w:pPr>
@@ -8883,7 +9167,7 @@
         <w:pStyle w:val="ListParagraph"/>
         <w:numPr>
           <w:ilvl w:val="0"/>
-          <w:numId w:val="54"/>
+          <w:numId w:val="55"/>
         </w:numPr>
         <w:spacing w:after="60"/>
       </w:pPr>
@@ -8900,11 +9184,11 @@
         <w:pStyle w:val="Heading2"/>
         <w:spacing w:after="100" w:before="280"/>
       </w:pPr>
-      <w:bookmarkStart w:name="_Toc62" w:id="62"/>
+      <w:bookmarkStart w:name="_Toc63" w:id="63"/>
       <w:r>
         <w:t xml:space="preserve">Unusual activity</w:t>
       </w:r>
-      <w:bookmarkEnd w:id="62"/>
+      <w:bookmarkEnd w:id="63"/>
     </w:p>
     <w:p>
       <w:pPr>
@@ -8970,7 +9254,7 @@
         <w:pStyle w:val="ListParagraph"/>
         <w:numPr>
           <w:ilvl w:val="0"/>
-          <w:numId w:val="55"/>
+          <w:numId w:val="56"/>
         </w:numPr>
         <w:spacing w:after="60"/>
       </w:pPr>
@@ -8987,7 +9271,7 @@
         <w:pStyle w:val="ListParagraph"/>
         <w:numPr>
           <w:ilvl w:val="0"/>
-          <w:numId w:val="55"/>
+          <w:numId w:val="56"/>
         </w:numPr>
         <w:spacing w:after="60"/>
       </w:pPr>
@@ -9004,7 +9288,7 @@
         <w:pStyle w:val="ListParagraph"/>
         <w:numPr>
           <w:ilvl w:val="0"/>
-          <w:numId w:val="55"/>
+          <w:numId w:val="56"/>
         </w:numPr>
         <w:spacing w:after="60"/>
       </w:pPr>
@@ -9054,11 +9338,11 @@
         <w:pageBreakBefore/>
         <w:spacing w:after="160"/>
       </w:pPr>
-      <w:bookmarkStart w:name="_Toc63" w:id="63"/>
+      <w:bookmarkStart w:name="_Toc64" w:id="64"/>
       <w:r>
         <w:t xml:space="preserve">For the accountant</w:t>
       </w:r>
-      <w:bookmarkEnd w:id="63"/>
+      <w:bookmarkEnd w:id="64"/>
     </w:p>
     <w:p>
       <w:pPr>
@@ -9077,11 +9361,11 @@
         <w:pStyle w:val="Heading2"/>
         <w:spacing w:after="100" w:before="280"/>
       </w:pPr>
-      <w:bookmarkStart w:name="_Toc64" w:id="64"/>
+      <w:bookmarkStart w:name="_Toc65" w:id="65"/>
       <w:r>
         <w:t xml:space="preserve">The general journal</w:t>
       </w:r>
-      <w:bookmarkEnd w:id="64"/>
+      <w:bookmarkEnd w:id="65"/>
     </w:p>
     <w:p>
       <w:pPr>
@@ -9147,7 +9431,7 @@
         <w:pStyle w:val="ListParagraph"/>
         <w:numPr>
           <w:ilvl w:val="0"/>
-          <w:numId w:val="56"/>
+          <w:numId w:val="57"/>
         </w:numPr>
         <w:spacing w:after="60"/>
       </w:pPr>
@@ -9164,7 +9448,7 @@
         <w:pStyle w:val="ListParagraph"/>
         <w:numPr>
           <w:ilvl w:val="0"/>
-          <w:numId w:val="56"/>
+          <w:numId w:val="57"/>
         </w:numPr>
         <w:spacing w:after="60"/>
       </w:pPr>
@@ -9213,11 +9497,11 @@
         <w:pStyle w:val="Heading2"/>
         <w:spacing w:after="100" w:before="280"/>
       </w:pPr>
-      <w:bookmarkStart w:name="_Toc65" w:id="65"/>
+      <w:bookmarkStart w:name="_Toc66" w:id="66"/>
       <w:r>
         <w:t xml:space="preserve">Chart of accounts</w:t>
       </w:r>
-      <w:bookmarkEnd w:id="65"/>
+      <w:bookmarkEnd w:id="66"/>
     </w:p>
     <w:p>
       <w:pPr>
@@ -9283,7 +9567,7 @@
         <w:pStyle w:val="ListParagraph"/>
         <w:numPr>
           <w:ilvl w:val="0"/>
-          <w:numId w:val="57"/>
+          <w:numId w:val="58"/>
         </w:numPr>
         <w:spacing w:after="60"/>
       </w:pPr>
@@ -9300,11 +9584,11 @@
         <w:pStyle w:val="Heading2"/>
         <w:spacing w:after="100" w:before="280"/>
       </w:pPr>
-      <w:bookmarkStart w:name="_Toc66" w:id="66"/>
+      <w:bookmarkStart w:name="_Toc67" w:id="67"/>
       <w:r>
         <w:t xml:space="preserve">Closing the books (closing a term)</w:t>
       </w:r>
-      <w:bookmarkEnd w:id="66"/>
+      <w:bookmarkEnd w:id="67"/>
     </w:p>
     <w:p>
       <w:pPr>
@@ -9370,7 +9654,7 @@
         <w:pStyle w:val="ListParagraph"/>
         <w:numPr>
           <w:ilvl w:val="0"/>
-          <w:numId w:val="58"/>
+          <w:numId w:val="59"/>
         </w:numPr>
         <w:spacing w:after="60"/>
       </w:pPr>
@@ -9387,7 +9671,7 @@
         <w:pStyle w:val="ListParagraph"/>
         <w:numPr>
           <w:ilvl w:val="0"/>
-          <w:numId w:val="58"/>
+          <w:numId w:val="59"/>
         </w:numPr>
         <w:spacing w:after="60"/>
       </w:pPr>
@@ -9404,7 +9688,7 @@
         <w:pStyle w:val="ListParagraph"/>
         <w:numPr>
           <w:ilvl w:val="0"/>
-          <w:numId w:val="58"/>
+          <w:numId w:val="59"/>
         </w:numPr>
         <w:spacing w:after="60"/>
       </w:pPr>
@@ -9453,11 +9737,11 @@
         <w:pStyle w:val="Heading2"/>
         <w:spacing w:after="100" w:before="280"/>
       </w:pPr>
-      <w:bookmarkStart w:name="_Toc67" w:id="67"/>
+      <w:bookmarkStart w:name="_Toc68" w:id="68"/>
       <w:r>
         <w:t xml:space="preserve">End-of-session pack</w:t>
       </w:r>
-      <w:bookmarkEnd w:id="67"/>
+      <w:bookmarkEnd w:id="68"/>
     </w:p>
     <w:p>
       <w:pPr>
@@ -9523,7 +9807,7 @@
         <w:pStyle w:val="ListParagraph"/>
         <w:numPr>
           <w:ilvl w:val="0"/>
-          <w:numId w:val="59"/>
+          <w:numId w:val="60"/>
         </w:numPr>
         <w:spacing w:after="60"/>
       </w:pPr>
@@ -9540,7 +9824,7 @@
         <w:pStyle w:val="ListParagraph"/>
         <w:numPr>
           <w:ilvl w:val="0"/>
-          <w:numId w:val="59"/>
+          <w:numId w:val="60"/>
         </w:numPr>
         <w:spacing w:after="60"/>
       </w:pPr>
@@ -9590,22 +9874,22 @@
         <w:pageBreakBefore/>
         <w:spacing w:after="160"/>
       </w:pPr>
-      <w:bookmarkStart w:name="_Toc68" w:id="68"/>
+      <w:bookmarkStart w:name="_Toc69" w:id="69"/>
       <w:r>
         <w:t xml:space="preserve">The school’s own records</w:t>
       </w:r>
-      <w:bookmarkEnd w:id="68"/>
+      <w:bookmarkEnd w:id="69"/>
     </w:p>
     <w:p>
       <w:pPr>
         <w:pStyle w:val="Heading2"/>
         <w:spacing w:after="100" w:before="280"/>
       </w:pPr>
-      <w:bookmarkStart w:name="_Toc69" w:id="69"/>
+      <w:bookmarkStart w:name="_Toc70" w:id="70"/>
       <w:r>
         <w:t xml:space="preserve">Activity log</w:t>
       </w:r>
-      <w:bookmarkEnd w:id="69"/>
+      <w:bookmarkEnd w:id="70"/>
     </w:p>
     <w:p>
       <w:pPr>
@@ -9671,7 +9955,7 @@
         <w:pStyle w:val="ListParagraph"/>
         <w:numPr>
           <w:ilvl w:val="0"/>
-          <w:numId w:val="60"/>
+          <w:numId w:val="61"/>
         </w:numPr>
         <w:spacing w:after="60"/>
       </w:pPr>
@@ -9688,11 +9972,11 @@
         <w:pStyle w:val="Heading2"/>
         <w:spacing w:after="100" w:before="280"/>
       </w:pPr>
-      <w:bookmarkStart w:name="_Toc70" w:id="70"/>
+      <w:bookmarkStart w:name="_Toc71" w:id="71"/>
       <w:r>
         <w:t xml:space="preserve">Subscription</w:t>
       </w:r>
-      <w:bookmarkEnd w:id="70"/>
+      <w:bookmarkEnd w:id="71"/>
     </w:p>
     <w:p>
       <w:pPr>
@@ -9758,7 +10042,7 @@
         <w:pStyle w:val="ListParagraph"/>
         <w:numPr>
           <w:ilvl w:val="0"/>
-          <w:numId w:val="61"/>
+          <w:numId w:val="62"/>
         </w:numPr>
         <w:spacing w:after="60"/>
       </w:pPr>
@@ -9808,11 +10092,11 @@
         <w:pageBreakBefore/>
         <w:spacing w:after="160"/>
       </w:pPr>
-      <w:bookmarkStart w:name="_Toc71" w:id="71"/>
+      <w:bookmarkStart w:name="_Toc72" w:id="72"/>
       <w:r>
         <w:t xml:space="preserve">For parents</w:t>
       </w:r>
-      <w:bookmarkEnd w:id="71"/>
+      <w:bookmarkEnd w:id="72"/>
     </w:p>
     <w:p>
       <w:pPr>
@@ -9831,11 +10115,11 @@
         <w:pStyle w:val="Heading2"/>
         <w:spacing w:after="100" w:before="280"/>
       </w:pPr>
-      <w:bookmarkStart w:name="_Toc72" w:id="72"/>
+      <w:bookmarkStart w:name="_Toc73" w:id="73"/>
       <w:r>
         <w:t xml:space="preserve">Paying from the message link</w:t>
       </w:r>
-      <w:bookmarkEnd w:id="72"/>
+      <w:bookmarkEnd w:id="73"/>
     </w:p>
     <w:p>
       <w:pPr>
@@ -9901,7 +10185,7 @@
         <w:pStyle w:val="ListParagraph"/>
         <w:numPr>
           <w:ilvl w:val="0"/>
-          <w:numId w:val="62"/>
+          <w:numId w:val="63"/>
         </w:numPr>
         <w:spacing w:after="60"/>
       </w:pPr>
@@ -9918,7 +10202,7 @@
         <w:pStyle w:val="ListParagraph"/>
         <w:numPr>
           <w:ilvl w:val="0"/>
-          <w:numId w:val="62"/>
+          <w:numId w:val="63"/>
         </w:numPr>
         <w:spacing w:after="60"/>
       </w:pPr>
@@ -9935,7 +10219,7 @@
         <w:pStyle w:val="ListParagraph"/>
         <w:numPr>
           <w:ilvl w:val="0"/>
-          <w:numId w:val="62"/>
+          <w:numId w:val="63"/>
         </w:numPr>
         <w:spacing w:after="60"/>
       </w:pPr>
@@ -9952,11 +10236,11 @@
         <w:pStyle w:val="Heading2"/>
         <w:spacing w:after="100" w:before="280"/>
       </w:pPr>
-      <w:bookmarkStart w:name="_Toc73" w:id="73"/>
+      <w:bookmarkStart w:name="_Toc74" w:id="74"/>
       <w:r>
         <w:t xml:space="preserve">The parent portal</w:t>
       </w:r>
-      <w:bookmarkEnd w:id="73"/>
+      <w:bookmarkEnd w:id="74"/>
     </w:p>
     <w:p>
       <w:pPr>
@@ -10022,7 +10306,7 @@
         <w:pStyle w:val="ListParagraph"/>
         <w:numPr>
           <w:ilvl w:val="0"/>
-          <w:numId w:val="63"/>
+          <w:numId w:val="64"/>
         </w:numPr>
         <w:spacing w:after="60"/>
       </w:pPr>
@@ -10039,7 +10323,7 @@
         <w:pStyle w:val="ListParagraph"/>
         <w:numPr>
           <w:ilvl w:val="0"/>
-          <w:numId w:val="63"/>
+          <w:numId w:val="64"/>
         </w:numPr>
         <w:spacing w:after="60"/>
       </w:pPr>
@@ -10056,7 +10340,7 @@
         <w:pStyle w:val="ListParagraph"/>
         <w:numPr>
           <w:ilvl w:val="0"/>
-          <w:numId w:val="63"/>
+          <w:numId w:val="64"/>
         </w:numPr>
         <w:spacing w:after="60"/>
       </w:pPr>
@@ -10073,11 +10357,132 @@
         <w:pStyle w:val="Heading2"/>
         <w:spacing w:after="100" w:before="280"/>
       </w:pPr>
-      <w:bookmarkStart w:name="_Toc74" w:id="74"/>
+      <w:bookmarkStart w:name="_Toc75" w:id="75"/>
+      <w:r>
+        <w:t xml:space="preserve">Spreading the fees with a school plan</w:t>
+      </w:r>
+      <w:bookmarkEnd w:id="75"/>
+    </w:p>
+    <w:p>
+      <w:pPr>
+        <w:spacing w:after="100"/>
+      </w:pPr>
+      <w:r>
+        <w:rPr>
+          <w:b/>
+          <w:bCs/>
+          <w:color w:val="0F5132"/>
+          <w:sz w:val="22"/>
+          <w:szCs w:val="22"/>
+        </w:rPr>
+        <w:t xml:space="preserve">Who: </w:t>
+      </w:r>
+      <w:r>
+        <w:rPr>
+          <w:sz w:val="22"/>
+          <w:szCs w:val="22"/>
+        </w:rPr>
+        <w:t xml:space="preserve">Parents</w:t>
+      </w:r>
+    </w:p>
+    <w:p>
+      <w:pPr>
+        <w:spacing w:after="100"/>
+      </w:pPr>
+      <w:r>
+        <w:rPr>
+          <w:b/>
+          <w:bCs/>
+          <w:color w:val="0F5132"/>
+          <w:sz w:val="22"/>
+          <w:szCs w:val="22"/>
+        </w:rPr>
+        <w:t xml:space="preserve">What it’s for: </w:t>
+      </w:r>
+      <w:r>
+        <w:rPr>
+          <w:sz w:val="22"/>
+          <w:szCs w:val="22"/>
+        </w:rPr>
+        <w:t xml:space="preserve">Pay a child’s fees in parts on dates the school has set, instead of all at once.</w:t>
+      </w:r>
+    </w:p>
+    <w:p>
+      <w:pPr>
+        <w:spacing w:after="60" w:before="80"/>
+      </w:pPr>
+      <w:r>
+        <w:rPr>
+          <w:b/>
+          <w:bCs/>
+          <w:color w:val="0F5132"/>
+          <w:sz w:val="22"/>
+          <w:szCs w:val="22"/>
+        </w:rPr>
+        <w:t xml:space="preserve">How to use it</w:t>
+      </w:r>
+    </w:p>
+    <w:p>
+      <w:pPr>
+        <w:pStyle w:val="ListParagraph"/>
+        <w:numPr>
+          <w:ilvl w:val="0"/>
+          <w:numId w:val="65"/>
+        </w:numPr>
+        <w:spacing w:after="60"/>
+      </w:pPr>
+      <w:r>
+        <w:rPr>
+          <w:sz w:val="22"/>
+          <w:szCs w:val="22"/>
+        </w:rPr>
+        <w:t xml:space="preserve">On the payment link (or Pay for all your children in the portal), look under the child for “Can’t pay it all at once?”.</w:t>
+      </w:r>
+    </w:p>
+    <w:p>
+      <w:pPr>
+        <w:pStyle w:val="ListParagraph"/>
+        <w:numPr>
+          <w:ilvl w:val="0"/>
+          <w:numId w:val="65"/>
+        </w:numPr>
+        <w:spacing w:after="60"/>
+      </w:pPr>
+      <w:r>
+        <w:rPr>
+          <w:sz w:val="22"/>
+          <w:szCs w:val="22"/>
+        </w:rPr>
+        <w:t xml:space="preserve">Each plan shows what is due and when, and any plan charge. Press Choose, then Yes, choose ….</w:t>
+      </w:r>
+    </w:p>
+    <w:p>
+      <w:pPr>
+        <w:pStyle w:val="ListParagraph"/>
+        <w:numPr>
+          <w:ilvl w:val="0"/>
+          <w:numId w:val="65"/>
+        </w:numPr>
+        <w:spacing w:after="60"/>
+      </w:pPr>
+      <w:r>
+        <w:rPr>
+          <w:sz w:val="22"/>
+          <w:szCs w:val="22"/>
+        </w:rPr>
+        <w:t xml:space="preserve">The page then asks only for the first payment. Reminders follow the plan’s dates.</w:t>
+      </w:r>
+    </w:p>
+    <w:p>
+      <w:pPr>
+        <w:pStyle w:val="Heading2"/>
+        <w:spacing w:after="100" w:before="280"/>
+      </w:pPr>
+      <w:bookmarkStart w:name="_Toc76" w:id="76"/>
       <w:r>
         <w:t xml:space="preserve">Messages and my data</w:t>
       </w:r>
-      <w:bookmarkEnd w:id="74"/>
+      <w:bookmarkEnd w:id="76"/>
     </w:p>
     <w:p>
       <w:pPr>
@@ -10143,7 +10548,7 @@
         <w:pStyle w:val="ListParagraph"/>
         <w:numPr>
           <w:ilvl w:val="0"/>
-          <w:numId w:val="64"/>
+          <w:numId w:val="66"/>
         </w:numPr>
         <w:spacing w:after="60"/>
       </w:pPr>
@@ -10160,7 +10565,7 @@
         <w:pStyle w:val="ListParagraph"/>
         <w:numPr>
           <w:ilvl w:val="0"/>
-          <w:numId w:val="64"/>
+          <w:numId w:val="66"/>
         </w:numPr>
         <w:spacing w:after="60"/>
       </w:pPr>
@@ -10178,11 +10583,11 @@
         <w:pageBreakBefore/>
         <w:spacing w:after="160"/>
       </w:pPr>
-      <w:bookmarkStart w:name="_Toc75" w:id="75"/>
+      <w:bookmarkStart w:name="_Toc77" w:id="77"/>
       <w:r>
         <w:t xml:space="preserve">For the WardPay team</w:t>
       </w:r>
-      <w:bookmarkEnd w:id="75"/>
+      <w:bookmarkEnd w:id="77"/>
     </w:p>
     <w:p>
       <w:pPr>
@@ -10201,11 +10606,11 @@
         <w:pStyle w:val="Heading2"/>
         <w:spacing w:after="100" w:before="280"/>
       </w:pPr>
-      <w:bookmarkStart w:name="_Toc76" w:id="76"/>
+      <w:bookmarkStart w:name="_Toc78" w:id="78"/>
       <w:r>
         <w:t xml:space="preserve">Platform overview and trends</w:t>
       </w:r>
-      <w:bookmarkEnd w:id="76"/>
+      <w:bookmarkEnd w:id="78"/>
     </w:p>
     <w:p>
       <w:pPr>
@@ -10271,7 +10676,7 @@
         <w:pStyle w:val="ListParagraph"/>
         <w:numPr>
           <w:ilvl w:val="0"/>
-          <w:numId w:val="65"/>
+          <w:numId w:val="67"/>
         </w:numPr>
         <w:spacing w:after="60"/>
       </w:pPr>
@@ -10288,11 +10693,11 @@
         <w:pStyle w:val="Heading2"/>
         <w:spacing w:after="100" w:before="280"/>
       </w:pPr>
-      <w:bookmarkStart w:name="_Toc77" w:id="77"/>
+      <w:bookmarkStart w:name="_Toc79" w:id="79"/>
       <w:r>
         <w:t xml:space="preserve">Schools</w:t>
       </w:r>
-      <w:bookmarkEnd w:id="77"/>
+      <w:bookmarkEnd w:id="79"/>
     </w:p>
     <w:p>
       <w:pPr>
@@ -10358,7 +10763,7 @@
         <w:pStyle w:val="ListParagraph"/>
         <w:numPr>
           <w:ilvl w:val="0"/>
-          <w:numId w:val="66"/>
+          <w:numId w:val="68"/>
         </w:numPr>
         <w:spacing w:after="60"/>
       </w:pPr>
@@ -10375,7 +10780,7 @@
         <w:pStyle w:val="ListParagraph"/>
         <w:numPr>
           <w:ilvl w:val="0"/>
-          <w:numId w:val="66"/>
+          <w:numId w:val="68"/>
         </w:numPr>
         <w:spacing w:after="60"/>
       </w:pPr>
@@ -10392,7 +10797,7 @@
         <w:pStyle w:val="ListParagraph"/>
         <w:numPr>
           <w:ilvl w:val="0"/>
-          <w:numId w:val="66"/>
+          <w:numId w:val="68"/>
         </w:numPr>
         <w:spacing w:after="60"/>
       </w:pPr>
@@ -10409,11 +10814,11 @@
         <w:pStyle w:val="Heading2"/>
         <w:spacing w:after="100" w:before="280"/>
       </w:pPr>
-      <w:bookmarkStart w:name="_Toc78" w:id="78"/>
+      <w:bookmarkStart w:name="_Toc80" w:id="80"/>
       <w:r>
         <w:t xml:space="preserve">Subscription billing and plans</w:t>
       </w:r>
-      <w:bookmarkEnd w:id="78"/>
+      <w:bookmarkEnd w:id="80"/>
     </w:p>
     <w:p>
       <w:pPr>
@@ -10479,7 +10884,7 @@
         <w:pStyle w:val="ListParagraph"/>
         <w:numPr>
           <w:ilvl w:val="0"/>
-          <w:numId w:val="67"/>
+          <w:numId w:val="69"/>
         </w:numPr>
         <w:spacing w:after="60"/>
       </w:pPr>
@@ -10496,7 +10901,7 @@
         <w:pStyle w:val="ListParagraph"/>
         <w:numPr>
           <w:ilvl w:val="0"/>
-          <w:numId w:val="67"/>
+          <w:numId w:val="69"/>
         </w:numPr>
         <w:spacing w:after="60"/>
       </w:pPr>
@@ -10513,16 +10918,16 @@
         <w:pStyle w:val="ListParagraph"/>
         <w:numPr>
           <w:ilvl w:val="0"/>
-          <w:numId w:val="67"/>
-        </w:numPr>
-        <w:spacing w:after="60"/>
-      </w:pPr>
-      <w:r>
-        <w:rPr>
-          <w:sz w:val="22"/>
-          <w:szCs w:val="22"/>
-        </w:rPr>
-        <w:t xml:space="preserve">Go to Plans to set the set-up fee and the per-pupil fee, and move a school to another plan.</w:t>
+          <w:numId w:val="69"/>
+        </w:numPr>
+        <w:spacing w:after="60"/>
+      </w:pPr>
+      <w:r>
+        <w:rPr>
+          <w:sz w:val="22"/>
+          <w:szCs w:val="22"/>
+        </w:rPr>
+        <w:t xml:space="preserve">Go to Plans to set the set-up fee, the per-pupil fee and the fee per instalment plan (₦200 to start), and move a school to another plan.</w:t>
       </w:r>
     </w:p>
     <w:p>
@@ -10530,11 +10935,11 @@
         <w:pStyle w:val="Heading2"/>
         <w:spacing w:after="100" w:before="280"/>
       </w:pPr>
-      <w:bookmarkStart w:name="_Toc79" w:id="79"/>
+      <w:bookmarkStart w:name="_Toc81" w:id="81"/>
       <w:r>
         <w:t xml:space="preserve">Problems, providers and support lookup</w:t>
       </w:r>
-      <w:bookmarkEnd w:id="79"/>
+      <w:bookmarkEnd w:id="81"/>
     </w:p>
     <w:p>
       <w:pPr>
@@ -10600,7 +11005,7 @@
         <w:pStyle w:val="ListParagraph"/>
         <w:numPr>
           <w:ilvl w:val="0"/>
-          <w:numId w:val="68"/>
+          <w:numId w:val="70"/>
         </w:numPr>
         <w:spacing w:after="60"/>
       </w:pPr>
@@ -10617,7 +11022,7 @@
         <w:pStyle w:val="ListParagraph"/>
         <w:numPr>
           <w:ilvl w:val="0"/>
-          <w:numId w:val="68"/>
+          <w:numId w:val="70"/>
         </w:numPr>
         <w:spacing w:after="60"/>
       </w:pPr>
@@ -10634,7 +11039,7 @@
         <w:pStyle w:val="ListParagraph"/>
         <w:numPr>
           <w:ilvl w:val="0"/>
-          <w:numId w:val="68"/>
+          <w:numId w:val="70"/>
         </w:numPr>
         <w:spacing w:after="60"/>
       </w:pPr>
@@ -10652,11 +11057,11 @@
         <w:pageBreakBefore/>
         <w:spacing w:after="160"/>
       </w:pPr>
-      <w:bookmarkStart w:name="_Toc80" w:id="80"/>
+      <w:bookmarkStart w:name="_Toc82" w:id="82"/>
       <w:r>
         <w:t xml:space="preserve">What changed in this guide</w:t>
       </w:r>
-      <w:bookmarkEnd w:id="80"/>
+      <w:bookmarkEnd w:id="82"/>
     </w:p>
     <w:tbl>
       <w:tblPr>
@@ -10735,6 +11140,64 @@
                 <w:szCs w:val="21"/>
               </w:rPr>
               <w:t xml:space="preserve">Change</w:t>
+            </w:r>
+          </w:p>
+        </w:tc>
+      </w:tr>
+      <w:tr>
+        <w:tc>
+          <w:tcPr>
+            <w:tcW w:type="dxa" w:w="1900"/>
+            <w:tcBorders>
+              <w:top w:val="single" w:color="D0D7D3" w:sz="4"/>
+              <w:left w:val="single" w:color="D0D7D3" w:sz="4"/>
+              <w:bottom w:val="single" w:color="D0D7D3" w:sz="4"/>
+              <w:right w:val="single" w:color="D0D7D3" w:sz="4"/>
+            </w:tcBorders>
+            <w:tcMar>
+              <w:top w:type="dxa" w:w="80"/>
+              <w:left w:type="dxa" w:w="120"/>
+              <w:bottom w:type="dxa" w:w="80"/>
+              <w:right w:type="dxa" w:w="120"/>
+            </w:tcMar>
+          </w:tcPr>
+          <w:p>
+            <w:r>
+              <w:rPr>
+                <w:b w:val="false"/>
+                <w:bCs w:val="false"/>
+                <w:sz w:val="21"/>
+                <w:szCs w:val="21"/>
+              </w:rPr>
+              <w:t xml:space="preserve">25 Oct 2026</w:t>
+            </w:r>
+          </w:p>
+        </w:tc>
+        <w:tc>
+          <w:tcPr>
+            <w:tcW w:type="dxa" w:w="7738"/>
+            <w:tcBorders>
+              <w:top w:val="single" w:color="D0D7D3" w:sz="4"/>
+              <w:left w:val="single" w:color="D0D7D3" w:sz="4"/>
+              <w:bottom w:val="single" w:color="D0D7D3" w:sz="4"/>
+              <w:right w:val="single" w:color="D0D7D3" w:sz="4"/>
+            </w:tcBorders>
+            <w:tcMar>
+              <w:top w:type="dxa" w:w="80"/>
+              <w:left w:type="dxa" w:w="120"/>
+              <w:bottom w:type="dxa" w:w="80"/>
+              <w:right w:type="dxa" w:w="120"/>
+            </w:tcMar>
+          </w:tcPr>
+          <w:p>
+            <w:r>
+              <w:rPr>
+                <w:b w:val="false"/>
+                <w:bCs w:val="false"/>
+                <w:sz w:val="21"/>
+                <w:szCs w:val="21"/>
+              </w:rPr>
+              <w:t xml:space="preserve">The school’s own instalment plans: set up by staff, chosen by parents; the per-plan fee on WardPay bills.</w:t>
             </w:r>
           </w:p>
         </w:tc>
@@ -11523,6 +11986,18 @@
     </w:lvlOverride>
   </w:num>
   <w:num w:numId="68">
+    <w:abstractNumId w:val="3"/>
+    <w:lvlOverride w:ilvl="0">
+      <w:startOverride w:val="1"/>
+    </w:lvlOverride>
+  </w:num>
+  <w:num w:numId="69">
+    <w:abstractNumId w:val="3"/>
+    <w:lvlOverride w:ilvl="0">
+      <w:startOverride w:val="1"/>
+    </w:lvlOverride>
+  </w:num>
+  <w:num w:numId="70">
     <w:abstractNumId w:val="3"/>
     <w:lvlOverride w:ilvl="0">
       <w:startOverride w:val="1"/>

</xml_diff>

<commit_message>
Staff put a parent's children on a school plan from the pupil's page, and the parent is told
</commit_message>
<xml_diff>
--- a/docs/product/WardPay - user guide.docx
+++ b/docs/product/WardPay - user guide.docx
@@ -912,7 +912,7 @@
           </w:pPr>
           <w:hyperlink w:history="1" w:anchor="_Toc37">
             <w:r>
-              <w:t xml:space="preserve">Writing off debt</w:t>
+              <w:t xml:space="preserve">Putting a family on a plan</w:t>
             </w:r>
             <w:r>
               <w:tab/>
@@ -920,28 +920,6 @@
             <w:r>
               <w:fldChar w:fldCharType="begin" w:dirty="true"/>
               <w:instrText xml:space="preserve">PAGEREF _Toc37 \h</w:instrText>
-              <w:fldChar w:fldCharType="separate"/>
-              <w:fldChar w:fldCharType="end"/>
-            </w:r>
-          </w:hyperlink>
-        </w:p>
-        <w:p>
-          <w:pPr>
-            <w:pStyle w:val="TOC1"/>
-            <w:tabs>
-              <w:tab w:val="right" w:pos="9638" w:leader="dot"/>
-            </w:tabs>
-          </w:pPr>
-          <w:hyperlink w:history="1" w:anchor="_Toc38">
-            <w:r>
-              <w:t xml:space="preserve">Payments</w:t>
-            </w:r>
-            <w:r>
-              <w:tab/>
-            </w:r>
-            <w:r>
-              <w:fldChar w:fldCharType="begin" w:dirty="true"/>
-              <w:instrText xml:space="preserve">PAGEREF _Toc38 \h</w:instrText>
               <w:fldChar w:fldCharType="separate"/>
               <w:fldChar w:fldCharType="end"/>
             </w:r>
@@ -955,9 +933,31 @@
             </w:tabs>
             <w:ind w:left="220"/>
           </w:pPr>
+          <w:hyperlink w:history="1" w:anchor="_Toc38">
+            <w:r>
+              <w:t xml:space="preserve">Writing off debt</w:t>
+            </w:r>
+            <w:r>
+              <w:tab/>
+            </w:r>
+            <w:r>
+              <w:fldChar w:fldCharType="begin" w:dirty="true"/>
+              <w:instrText xml:space="preserve">PAGEREF _Toc38 \h</w:instrText>
+              <w:fldChar w:fldCharType="separate"/>
+              <w:fldChar w:fldCharType="end"/>
+            </w:r>
+          </w:hyperlink>
+        </w:p>
+        <w:p>
+          <w:pPr>
+            <w:pStyle w:val="TOC1"/>
+            <w:tabs>
+              <w:tab w:val="right" w:pos="9638" w:leader="dot"/>
+            </w:tabs>
+          </w:pPr>
           <w:hyperlink w:history="1" w:anchor="_Toc39">
             <w:r>
-              <w:t xml:space="preserve">How parents pay</w:t>
+              <w:t xml:space="preserve">Payments</w:t>
             </w:r>
             <w:r>
               <w:tab/>
@@ -980,7 +980,7 @@
           </w:pPr>
           <w:hyperlink w:history="1" w:anchor="_Toc40">
             <w:r>
-              <w:t xml:space="preserve">Seeing payments</w:t>
+              <w:t xml:space="preserve">How parents pay</w:t>
             </w:r>
             <w:r>
               <w:tab/>
@@ -1003,7 +1003,7 @@
           </w:pPr>
           <w:hyperlink w:history="1" w:anchor="_Toc41">
             <w:r>
-              <w:t xml:space="preserve">Recording cash, teller, POS or a direct transfer</w:t>
+              <w:t xml:space="preserve">Seeing payments</w:t>
             </w:r>
             <w:r>
               <w:tab/>
@@ -1026,7 +1026,7 @@
           </w:pPr>
           <w:hyperlink w:history="1" w:anchor="_Toc42">
             <w:r>
-              <w:t xml:space="preserve">Saying what a payment was for, after it arrived</w:t>
+              <w:t xml:space="preserve">Recording cash, teller, POS or a direct transfer</w:t>
             </w:r>
             <w:r>
               <w:tab/>
@@ -1049,7 +1049,7 @@
           </w:pPr>
           <w:hyperlink w:history="1" w:anchor="_Toc43">
             <w:r>
-              <w:t xml:space="preserve">Reversing a payment</w:t>
+              <w:t xml:space="preserve">Saying what a payment was for, after it arrived</w:t>
             </w:r>
             <w:r>
               <w:tab/>
@@ -1072,7 +1072,7 @@
           </w:pPr>
           <w:hyperlink w:history="1" w:anchor="_Toc44">
             <w:r>
-              <w:t xml:space="preserve">Card payment link for one pupil</w:t>
+              <w:t xml:space="preserve">Reversing a payment</w:t>
             </w:r>
             <w:r>
               <w:tab/>
@@ -1095,7 +1095,7 @@
           </w:pPr>
           <w:hyperlink w:history="1" w:anchor="_Toc45">
             <w:r>
-              <w:t xml:space="preserve">Receipts</w:t>
+              <w:t xml:space="preserve">Card payment link for one pupil</w:t>
             </w:r>
             <w:r>
               <w:tab/>
@@ -1118,7 +1118,7 @@
           </w:pPr>
           <w:hyperlink w:history="1" w:anchor="_Toc46">
             <w:r>
-              <w:t xml:space="preserve">Paid into the bank (Paystack payouts)</w:t>
+              <w:t xml:space="preserve">Receipts</w:t>
             </w:r>
             <w:r>
               <w:tab/>
@@ -1126,28 +1126,6 @@
             <w:r>
               <w:fldChar w:fldCharType="begin" w:dirty="true"/>
               <w:instrText xml:space="preserve">PAGEREF _Toc46 \h</w:instrText>
-              <w:fldChar w:fldCharType="separate"/>
-              <w:fldChar w:fldCharType="end"/>
-            </w:r>
-          </w:hyperlink>
-        </w:p>
-        <w:p>
-          <w:pPr>
-            <w:pStyle w:val="TOC1"/>
-            <w:tabs>
-              <w:tab w:val="right" w:pos="9638" w:leader="dot"/>
-            </w:tabs>
-          </w:pPr>
-          <w:hyperlink w:history="1" w:anchor="_Toc47">
-            <w:r>
-              <w:t xml:space="preserve">Cash and spending</w:t>
-            </w:r>
-            <w:r>
-              <w:tab/>
-            </w:r>
-            <w:r>
-              <w:fldChar w:fldCharType="begin" w:dirty="true"/>
-              <w:instrText xml:space="preserve">PAGEREF _Toc47 \h</w:instrText>
               <w:fldChar w:fldCharType="separate"/>
               <w:fldChar w:fldCharType="end"/>
             </w:r>
@@ -1161,9 +1139,31 @@
             </w:tabs>
             <w:ind w:left="220"/>
           </w:pPr>
+          <w:hyperlink w:history="1" w:anchor="_Toc47">
+            <w:r>
+              <w:t xml:space="preserve">Paid into the bank (Paystack payouts)</w:t>
+            </w:r>
+            <w:r>
+              <w:tab/>
+            </w:r>
+            <w:r>
+              <w:fldChar w:fldCharType="begin" w:dirty="true"/>
+              <w:instrText xml:space="preserve">PAGEREF _Toc47 \h</w:instrText>
+              <w:fldChar w:fldCharType="separate"/>
+              <w:fldChar w:fldCharType="end"/>
+            </w:r>
+          </w:hyperlink>
+        </w:p>
+        <w:p>
+          <w:pPr>
+            <w:pStyle w:val="TOC1"/>
+            <w:tabs>
+              <w:tab w:val="right" w:pos="9638" w:leader="dot"/>
+            </w:tabs>
+          </w:pPr>
           <w:hyperlink w:history="1" w:anchor="_Toc48">
             <w:r>
-              <w:t xml:space="preserve">Cash book</w:t>
+              <w:t xml:space="preserve">Cash and spending</w:t>
             </w:r>
             <w:r>
               <w:tab/>
@@ -1186,7 +1186,7 @@
           </w:pPr>
           <w:hyperlink w:history="1" w:anchor="_Toc49">
             <w:r>
-              <w:t xml:space="preserve">Banking cash, checked by a second person</w:t>
+              <w:t xml:space="preserve">Cash book</w:t>
             </w:r>
             <w:r>
               <w:tab/>
@@ -1209,7 +1209,7 @@
           </w:pPr>
           <w:hyperlink w:history="1" w:anchor="_Toc50">
             <w:r>
-              <w:t xml:space="preserve">Closing the day (drawer count)</w:t>
+              <w:t xml:space="preserve">Banking cash, checked by a second person</w:t>
             </w:r>
             <w:r>
               <w:tab/>
@@ -1232,7 +1232,7 @@
           </w:pPr>
           <w:hyperlink w:history="1" w:anchor="_Toc51">
             <w:r>
-              <w:t xml:space="preserve">Recording spending</w:t>
+              <w:t xml:space="preserve">Closing the day (drawer count)</w:t>
             </w:r>
             <w:r>
               <w:tab/>
@@ -1255,7 +1255,7 @@
           </w:pPr>
           <w:hyperlink w:history="1" w:anchor="_Toc52">
             <w:r>
-              <w:t xml:space="preserve">Income and expenditure</w:t>
+              <w:t xml:space="preserve">Recording spending</w:t>
             </w:r>
             <w:r>
               <w:tab/>
@@ -1263,28 +1263,6 @@
             <w:r>
               <w:fldChar w:fldCharType="begin" w:dirty="true"/>
               <w:instrText xml:space="preserve">PAGEREF _Toc52 \h</w:instrText>
-              <w:fldChar w:fldCharType="separate"/>
-              <w:fldChar w:fldCharType="end"/>
-            </w:r>
-          </w:hyperlink>
-        </w:p>
-        <w:p>
-          <w:pPr>
-            <w:pStyle w:val="TOC1"/>
-            <w:tabs>
-              <w:tab w:val="right" w:pos="9638" w:leader="dot"/>
-            </w:tabs>
-          </w:pPr>
-          <w:hyperlink w:history="1" w:anchor="_Toc53">
-            <w:r>
-              <w:t xml:space="preserve">Messages to parents</w:t>
-            </w:r>
-            <w:r>
-              <w:tab/>
-            </w:r>
-            <w:r>
-              <w:fldChar w:fldCharType="begin" w:dirty="true"/>
-              <w:instrText xml:space="preserve">PAGEREF _Toc53 \h</w:instrText>
               <w:fldChar w:fldCharType="separate"/>
               <w:fldChar w:fldCharType="end"/>
             </w:r>
@@ -1298,9 +1276,31 @@
             </w:tabs>
             <w:ind w:left="220"/>
           </w:pPr>
+          <w:hyperlink w:history="1" w:anchor="_Toc53">
+            <w:r>
+              <w:t xml:space="preserve">Income and expenditure</w:t>
+            </w:r>
+            <w:r>
+              <w:tab/>
+            </w:r>
+            <w:r>
+              <w:fldChar w:fldCharType="begin" w:dirty="true"/>
+              <w:instrText xml:space="preserve">PAGEREF _Toc53 \h</w:instrText>
+              <w:fldChar w:fldCharType="separate"/>
+              <w:fldChar w:fldCharType="end"/>
+            </w:r>
+          </w:hyperlink>
+        </w:p>
+        <w:p>
+          <w:pPr>
+            <w:pStyle w:val="TOC1"/>
+            <w:tabs>
+              <w:tab w:val="right" w:pos="9638" w:leader="dot"/>
+            </w:tabs>
+          </w:pPr>
           <w:hyperlink w:history="1" w:anchor="_Toc54">
             <w:r>
-              <w:t xml:space="preserve">Sent messages</w:t>
+              <w:t xml:space="preserve">Messages to parents</w:t>
             </w:r>
             <w:r>
               <w:tab/>
@@ -1323,7 +1323,7 @@
           </w:pPr>
           <w:hyperlink w:history="1" w:anchor="_Toc55">
             <w:r>
-              <w:t xml:space="preserve">The wording</w:t>
+              <w:t xml:space="preserve">Sent messages</w:t>
             </w:r>
             <w:r>
               <w:tab/>
@@ -1346,7 +1346,7 @@
           </w:pPr>
           <w:hyperlink w:history="1" w:anchor="_Toc56">
             <w:r>
-              <w:t xml:space="preserve">The reminder schedule</w:t>
+              <w:t xml:space="preserve">The wording</w:t>
             </w:r>
             <w:r>
               <w:tab/>
@@ -1354,28 +1354,6 @@
             <w:r>
               <w:fldChar w:fldCharType="begin" w:dirty="true"/>
               <w:instrText xml:space="preserve">PAGEREF _Toc56 \h</w:instrText>
-              <w:fldChar w:fldCharType="separate"/>
-              <w:fldChar w:fldCharType="end"/>
-            </w:r>
-          </w:hyperlink>
-        </w:p>
-        <w:p>
-          <w:pPr>
-            <w:pStyle w:val="TOC1"/>
-            <w:tabs>
-              <w:tab w:val="right" w:pos="9638" w:leader="dot"/>
-            </w:tabs>
-          </w:pPr>
-          <w:hyperlink w:history="1" w:anchor="_Toc57">
-            <w:r>
-              <w:t xml:space="preserve">The Overview page and reports</w:t>
-            </w:r>
-            <w:r>
-              <w:tab/>
-            </w:r>
-            <w:r>
-              <w:fldChar w:fldCharType="begin" w:dirty="true"/>
-              <w:instrText xml:space="preserve">PAGEREF _Toc57 \h</w:instrText>
               <w:fldChar w:fldCharType="separate"/>
               <w:fldChar w:fldCharType="end"/>
             </w:r>
@@ -1389,9 +1367,31 @@
             </w:tabs>
             <w:ind w:left="220"/>
           </w:pPr>
+          <w:hyperlink w:history="1" w:anchor="_Toc57">
+            <w:r>
+              <w:t xml:space="preserve">The reminder schedule</w:t>
+            </w:r>
+            <w:r>
+              <w:tab/>
+            </w:r>
+            <w:r>
+              <w:fldChar w:fldCharType="begin" w:dirty="true"/>
+              <w:instrText xml:space="preserve">PAGEREF _Toc57 \h</w:instrText>
+              <w:fldChar w:fldCharType="separate"/>
+              <w:fldChar w:fldCharType="end"/>
+            </w:r>
+          </w:hyperlink>
+        </w:p>
+        <w:p>
+          <w:pPr>
+            <w:pStyle w:val="TOC1"/>
+            <w:tabs>
+              <w:tab w:val="right" w:pos="9638" w:leader="dot"/>
+            </w:tabs>
+          </w:pPr>
           <w:hyperlink w:history="1" w:anchor="_Toc58">
             <w:r>
-              <w:t xml:space="preserve">Overview</w:t>
+              <w:t xml:space="preserve">The Overview page and reports</w:t>
             </w:r>
             <w:r>
               <w:tab/>
@@ -1414,7 +1414,7 @@
           </w:pPr>
           <w:hyperlink w:history="1" w:anchor="_Toc59">
             <w:r>
-              <w:t xml:space="preserve">Pace and forecast</w:t>
+              <w:t xml:space="preserve">Overview</w:t>
             </w:r>
             <w:r>
               <w:tab/>
@@ -1437,7 +1437,7 @@
           </w:pPr>
           <w:hyperlink w:history="1" w:anchor="_Toc60">
             <w:r>
-              <w:t xml:space="preserve">Debtors</w:t>
+              <w:t xml:space="preserve">Pace and forecast</w:t>
             </w:r>
             <w:r>
               <w:tab/>
@@ -1460,7 +1460,7 @@
           </w:pPr>
           <w:hyperlink w:history="1" w:anchor="_Toc61">
             <w:r>
-              <w:t xml:space="preserve">Money received</w:t>
+              <w:t xml:space="preserve">Debtors</w:t>
             </w:r>
             <w:r>
               <w:tab/>
@@ -1483,7 +1483,7 @@
           </w:pPr>
           <w:hyperlink w:history="1" w:anchor="_Toc62">
             <w:r>
-              <w:t xml:space="preserve">Fee status by pupil</w:t>
+              <w:t xml:space="preserve">Money received</w:t>
             </w:r>
             <w:r>
               <w:tab/>
@@ -1506,7 +1506,7 @@
           </w:pPr>
           <w:hyperlink w:history="1" w:anchor="_Toc63">
             <w:r>
-              <w:t xml:space="preserve">Unusual activity</w:t>
+              <w:t xml:space="preserve">Fee status by pupil</w:t>
             </w:r>
             <w:r>
               <w:tab/>
@@ -1514,28 +1514,6 @@
             <w:r>
               <w:fldChar w:fldCharType="begin" w:dirty="true"/>
               <w:instrText xml:space="preserve">PAGEREF _Toc63 \h</w:instrText>
-              <w:fldChar w:fldCharType="separate"/>
-              <w:fldChar w:fldCharType="end"/>
-            </w:r>
-          </w:hyperlink>
-        </w:p>
-        <w:p>
-          <w:pPr>
-            <w:pStyle w:val="TOC1"/>
-            <w:tabs>
-              <w:tab w:val="right" w:pos="9638" w:leader="dot"/>
-            </w:tabs>
-          </w:pPr>
-          <w:hyperlink w:history="1" w:anchor="_Toc64">
-            <w:r>
-              <w:t xml:space="preserve">For the accountant</w:t>
-            </w:r>
-            <w:r>
-              <w:tab/>
-            </w:r>
-            <w:r>
-              <w:fldChar w:fldCharType="begin" w:dirty="true"/>
-              <w:instrText xml:space="preserve">PAGEREF _Toc64 \h</w:instrText>
               <w:fldChar w:fldCharType="separate"/>
               <w:fldChar w:fldCharType="end"/>
             </w:r>
@@ -1549,9 +1527,31 @@
             </w:tabs>
             <w:ind w:left="220"/>
           </w:pPr>
+          <w:hyperlink w:history="1" w:anchor="_Toc64">
+            <w:r>
+              <w:t xml:space="preserve">Unusual activity</w:t>
+            </w:r>
+            <w:r>
+              <w:tab/>
+            </w:r>
+            <w:r>
+              <w:fldChar w:fldCharType="begin" w:dirty="true"/>
+              <w:instrText xml:space="preserve">PAGEREF _Toc64 \h</w:instrText>
+              <w:fldChar w:fldCharType="separate"/>
+              <w:fldChar w:fldCharType="end"/>
+            </w:r>
+          </w:hyperlink>
+        </w:p>
+        <w:p>
+          <w:pPr>
+            <w:pStyle w:val="TOC1"/>
+            <w:tabs>
+              <w:tab w:val="right" w:pos="9638" w:leader="dot"/>
+            </w:tabs>
+          </w:pPr>
           <w:hyperlink w:history="1" w:anchor="_Toc65">
             <w:r>
-              <w:t xml:space="preserve">The general journal</w:t>
+              <w:t xml:space="preserve">For the accountant</w:t>
             </w:r>
             <w:r>
               <w:tab/>
@@ -1574,7 +1574,7 @@
           </w:pPr>
           <w:hyperlink w:history="1" w:anchor="_Toc66">
             <w:r>
-              <w:t xml:space="preserve">Chart of accounts</w:t>
+              <w:t xml:space="preserve">The general journal</w:t>
             </w:r>
             <w:r>
               <w:tab/>
@@ -1597,7 +1597,7 @@
           </w:pPr>
           <w:hyperlink w:history="1" w:anchor="_Toc67">
             <w:r>
-              <w:t xml:space="preserve">Closing the books (closing a term)</w:t>
+              <w:t xml:space="preserve">Chart of accounts</w:t>
             </w:r>
             <w:r>
               <w:tab/>
@@ -1620,7 +1620,7 @@
           </w:pPr>
           <w:hyperlink w:history="1" w:anchor="_Toc68">
             <w:r>
-              <w:t xml:space="preserve">End-of-session pack</w:t>
+              <w:t xml:space="preserve">Closing the books (closing a term)</w:t>
             </w:r>
             <w:r>
               <w:tab/>
@@ -1628,28 +1628,6 @@
             <w:r>
               <w:fldChar w:fldCharType="begin" w:dirty="true"/>
               <w:instrText xml:space="preserve">PAGEREF _Toc68 \h</w:instrText>
-              <w:fldChar w:fldCharType="separate"/>
-              <w:fldChar w:fldCharType="end"/>
-            </w:r>
-          </w:hyperlink>
-        </w:p>
-        <w:p>
-          <w:pPr>
-            <w:pStyle w:val="TOC1"/>
-            <w:tabs>
-              <w:tab w:val="right" w:pos="9638" w:leader="dot"/>
-            </w:tabs>
-          </w:pPr>
-          <w:hyperlink w:history="1" w:anchor="_Toc69">
-            <w:r>
-              <w:t xml:space="preserve">The school’s own records</w:t>
-            </w:r>
-            <w:r>
-              <w:tab/>
-            </w:r>
-            <w:r>
-              <w:fldChar w:fldCharType="begin" w:dirty="true"/>
-              <w:instrText xml:space="preserve">PAGEREF _Toc69 \h</w:instrText>
               <w:fldChar w:fldCharType="separate"/>
               <w:fldChar w:fldCharType="end"/>
             </w:r>
@@ -1663,9 +1641,31 @@
             </w:tabs>
             <w:ind w:left="220"/>
           </w:pPr>
+          <w:hyperlink w:history="1" w:anchor="_Toc69">
+            <w:r>
+              <w:t xml:space="preserve">End-of-session pack</w:t>
+            </w:r>
+            <w:r>
+              <w:tab/>
+            </w:r>
+            <w:r>
+              <w:fldChar w:fldCharType="begin" w:dirty="true"/>
+              <w:instrText xml:space="preserve">PAGEREF _Toc69 \h</w:instrText>
+              <w:fldChar w:fldCharType="separate"/>
+              <w:fldChar w:fldCharType="end"/>
+            </w:r>
+          </w:hyperlink>
+        </w:p>
+        <w:p>
+          <w:pPr>
+            <w:pStyle w:val="TOC1"/>
+            <w:tabs>
+              <w:tab w:val="right" w:pos="9638" w:leader="dot"/>
+            </w:tabs>
+          </w:pPr>
           <w:hyperlink w:history="1" w:anchor="_Toc70">
             <w:r>
-              <w:t xml:space="preserve">Activity log</w:t>
+              <w:t xml:space="preserve">The school’s own records</w:t>
             </w:r>
             <w:r>
               <w:tab/>
@@ -1688,7 +1688,7 @@
           </w:pPr>
           <w:hyperlink w:history="1" w:anchor="_Toc71">
             <w:r>
-              <w:t xml:space="preserve">Subscription</w:t>
+              <w:t xml:space="preserve">Activity log</w:t>
             </w:r>
             <w:r>
               <w:tab/>
@@ -1696,28 +1696,6 @@
             <w:r>
               <w:fldChar w:fldCharType="begin" w:dirty="true"/>
               <w:instrText xml:space="preserve">PAGEREF _Toc71 \h</w:instrText>
-              <w:fldChar w:fldCharType="separate"/>
-              <w:fldChar w:fldCharType="end"/>
-            </w:r>
-          </w:hyperlink>
-        </w:p>
-        <w:p>
-          <w:pPr>
-            <w:pStyle w:val="TOC1"/>
-            <w:tabs>
-              <w:tab w:val="right" w:pos="9638" w:leader="dot"/>
-            </w:tabs>
-          </w:pPr>
-          <w:hyperlink w:history="1" w:anchor="_Toc72">
-            <w:r>
-              <w:t xml:space="preserve">For parents</w:t>
-            </w:r>
-            <w:r>
-              <w:tab/>
-            </w:r>
-            <w:r>
-              <w:fldChar w:fldCharType="begin" w:dirty="true"/>
-              <w:instrText xml:space="preserve">PAGEREF _Toc72 \h</w:instrText>
               <w:fldChar w:fldCharType="separate"/>
               <w:fldChar w:fldCharType="end"/>
             </w:r>
@@ -1731,9 +1709,31 @@
             </w:tabs>
             <w:ind w:left="220"/>
           </w:pPr>
+          <w:hyperlink w:history="1" w:anchor="_Toc72">
+            <w:r>
+              <w:t xml:space="preserve">Subscription</w:t>
+            </w:r>
+            <w:r>
+              <w:tab/>
+            </w:r>
+            <w:r>
+              <w:fldChar w:fldCharType="begin" w:dirty="true"/>
+              <w:instrText xml:space="preserve">PAGEREF _Toc72 \h</w:instrText>
+              <w:fldChar w:fldCharType="separate"/>
+              <w:fldChar w:fldCharType="end"/>
+            </w:r>
+          </w:hyperlink>
+        </w:p>
+        <w:p>
+          <w:pPr>
+            <w:pStyle w:val="TOC1"/>
+            <w:tabs>
+              <w:tab w:val="right" w:pos="9638" w:leader="dot"/>
+            </w:tabs>
+          </w:pPr>
           <w:hyperlink w:history="1" w:anchor="_Toc73">
             <w:r>
-              <w:t xml:space="preserve">Paying from the message link</w:t>
+              <w:t xml:space="preserve">For parents</w:t>
             </w:r>
             <w:r>
               <w:tab/>
@@ -1756,7 +1756,7 @@
           </w:pPr>
           <w:hyperlink w:history="1" w:anchor="_Toc74">
             <w:r>
-              <w:t xml:space="preserve">The parent portal</w:t>
+              <w:t xml:space="preserve">Paying from the message link</w:t>
             </w:r>
             <w:r>
               <w:tab/>
@@ -1779,7 +1779,7 @@
           </w:pPr>
           <w:hyperlink w:history="1" w:anchor="_Toc75">
             <w:r>
-              <w:t xml:space="preserve">Spreading the fees with a school plan</w:t>
+              <w:t xml:space="preserve">The parent portal</w:t>
             </w:r>
             <w:r>
               <w:tab/>
@@ -1802,7 +1802,7 @@
           </w:pPr>
           <w:hyperlink w:history="1" w:anchor="_Toc76">
             <w:r>
-              <w:t xml:space="preserve">Messages and my data</w:t>
+              <w:t xml:space="preserve">Spreading the fees with a school plan</w:t>
             </w:r>
             <w:r>
               <w:tab/>
@@ -1810,28 +1810,6 @@
             <w:r>
               <w:fldChar w:fldCharType="begin" w:dirty="true"/>
               <w:instrText xml:space="preserve">PAGEREF _Toc76 \h</w:instrText>
-              <w:fldChar w:fldCharType="separate"/>
-              <w:fldChar w:fldCharType="end"/>
-            </w:r>
-          </w:hyperlink>
-        </w:p>
-        <w:p>
-          <w:pPr>
-            <w:pStyle w:val="TOC1"/>
-            <w:tabs>
-              <w:tab w:val="right" w:pos="9638" w:leader="dot"/>
-            </w:tabs>
-          </w:pPr>
-          <w:hyperlink w:history="1" w:anchor="_Toc77">
-            <w:r>
-              <w:t xml:space="preserve">For the WardPay team</w:t>
-            </w:r>
-            <w:r>
-              <w:tab/>
-            </w:r>
-            <w:r>
-              <w:fldChar w:fldCharType="begin" w:dirty="true"/>
-              <w:instrText xml:space="preserve">PAGEREF _Toc77 \h</w:instrText>
               <w:fldChar w:fldCharType="separate"/>
               <w:fldChar w:fldCharType="end"/>
             </w:r>
@@ -1845,9 +1823,31 @@
             </w:tabs>
             <w:ind w:left="220"/>
           </w:pPr>
+          <w:hyperlink w:history="1" w:anchor="_Toc77">
+            <w:r>
+              <w:t xml:space="preserve">Messages and my data</w:t>
+            </w:r>
+            <w:r>
+              <w:tab/>
+            </w:r>
+            <w:r>
+              <w:fldChar w:fldCharType="begin" w:dirty="true"/>
+              <w:instrText xml:space="preserve">PAGEREF _Toc77 \h</w:instrText>
+              <w:fldChar w:fldCharType="separate"/>
+              <w:fldChar w:fldCharType="end"/>
+            </w:r>
+          </w:hyperlink>
+        </w:p>
+        <w:p>
+          <w:pPr>
+            <w:pStyle w:val="TOC1"/>
+            <w:tabs>
+              <w:tab w:val="right" w:pos="9638" w:leader="dot"/>
+            </w:tabs>
+          </w:pPr>
           <w:hyperlink w:history="1" w:anchor="_Toc78">
             <w:r>
-              <w:t xml:space="preserve">Platform overview and trends</w:t>
+              <w:t xml:space="preserve">For the WardPay team</w:t>
             </w:r>
             <w:r>
               <w:tab/>
@@ -1870,7 +1870,7 @@
           </w:pPr>
           <w:hyperlink w:history="1" w:anchor="_Toc79">
             <w:r>
-              <w:t xml:space="preserve">Schools</w:t>
+              <w:t xml:space="preserve">Platform overview and trends</w:t>
             </w:r>
             <w:r>
               <w:tab/>
@@ -1893,7 +1893,7 @@
           </w:pPr>
           <w:hyperlink w:history="1" w:anchor="_Toc80">
             <w:r>
-              <w:t xml:space="preserve">Subscription billing and plans</w:t>
+              <w:t xml:space="preserve">Schools</w:t>
             </w:r>
             <w:r>
               <w:tab/>
@@ -1916,7 +1916,7 @@
           </w:pPr>
           <w:hyperlink w:history="1" w:anchor="_Toc81">
             <w:r>
-              <w:t xml:space="preserve">Problems, providers and support lookup</w:t>
+              <w:t xml:space="preserve">Subscription billing and plans</w:t>
             </w:r>
             <w:r>
               <w:tab/>
@@ -1924,6 +1924,29 @@
             <w:r>
               <w:fldChar w:fldCharType="begin" w:dirty="true"/>
               <w:instrText xml:space="preserve">PAGEREF _Toc81 \h</w:instrText>
+              <w:fldChar w:fldCharType="separate"/>
+              <w:fldChar w:fldCharType="end"/>
+            </w:r>
+          </w:hyperlink>
+        </w:p>
+        <w:p>
+          <w:pPr>
+            <w:pStyle w:val="TOC2"/>
+            <w:tabs>
+              <w:tab w:val="right" w:pos="9638" w:leader="dot"/>
+            </w:tabs>
+            <w:ind w:left="220"/>
+          </w:pPr>
+          <w:hyperlink w:history="1" w:anchor="_Toc82">
+            <w:r>
+              <w:t xml:space="preserve">Problems, providers and support lookup</w:t>
+            </w:r>
+            <w:r>
+              <w:tab/>
+            </w:r>
+            <w:r>
+              <w:fldChar w:fldCharType="begin" w:dirty="true"/>
+              <w:instrText xml:space="preserve">PAGEREF _Toc82 \h</w:instrText>
               <w:fldChar w:fldCharType="separate"/>
               <w:fldChar w:fldCharType="end"/>
             </w:r>
@@ -1936,7 +1959,7 @@
               <w:tab w:val="right" w:pos="9638" w:leader="dot"/>
             </w:tabs>
           </w:pPr>
-          <w:hyperlink w:history="1" w:anchor="_Toc82">
+          <w:hyperlink w:history="1" w:anchor="_Toc83">
             <w:r>
               <w:t xml:space="preserve">What changed in this guide</w:t>
             </w:r>
@@ -1945,7 +1968,7 @@
             </w:r>
             <w:r>
               <w:fldChar w:fldCharType="begin" w:dirty="true"/>
-              <w:instrText xml:space="preserve">PAGEREF _Toc82 \h</w:instrText>
+              <w:instrText xml:space="preserve">PAGEREF _Toc83 \h</w:instrText>
               <w:fldChar w:fldCharType="separate"/>
               <w:fldChar w:fldCharType="end"/>
             </w:r>
@@ -6532,7 +6555,7 @@
           <w:sz w:val="22"/>
           <w:szCs w:val="22"/>
         </w:rPr>
-        <w:t xml:space="preserve">Staff can put a family on any plan, including staff-only ones: open the bill and press Use a school plan.</w:t>
+        <w:t xml:space="preserve">Most parents won’t choose a plan themselves: see “Putting a family on a plan” below.</w:t>
       </w:r>
     </w:p>
     <w:p>
@@ -6559,9 +6582,213 @@
       </w:pPr>
       <w:bookmarkStart w:name="_Toc37" w:id="37"/>
       <w:r>
+        <w:t xml:space="preserve">Putting a family on a plan</w:t>
+      </w:r>
+      <w:bookmarkEnd w:id="37"/>
+    </w:p>
+    <w:p>
+      <w:pPr>
+        <w:spacing w:after="100"/>
+      </w:pPr>
+      <w:r>
+        <w:rPr>
+          <w:b/>
+          <w:bCs/>
+          <w:color w:val="0F5132"/>
+          <w:sz w:val="22"/>
+          <w:szCs w:val="22"/>
+        </w:rPr>
+        <w:t xml:space="preserve">Who: </w:t>
+      </w:r>
+      <w:r>
+        <w:rPr>
+          <w:sz w:val="22"/>
+          <w:szCs w:val="22"/>
+        </w:rPr>
+        <w:t xml:space="preserve">Bursar, school admin, proprietor</w:t>
+      </w:r>
+    </w:p>
+    <w:p>
+      <w:pPr>
+        <w:spacing w:after="100"/>
+      </w:pPr>
+      <w:r>
+        <w:rPr>
+          <w:b/>
+          <w:bCs/>
+          <w:color w:val="0F5132"/>
+          <w:sz w:val="22"/>
+          <w:szCs w:val="22"/>
+        </w:rPr>
+        <w:t xml:space="preserve">What it’s for: </w:t>
+      </w:r>
+      <w:r>
+        <w:rPr>
+          <w:sz w:val="22"/>
+          <w:szCs w:val="22"/>
+        </w:rPr>
+        <w:t xml:space="preserve">For a parent who asks to spread their payments (by phone or at the school): put all their children on one of the school’s plans and have them told, without the parent using the website.</w:t>
+      </w:r>
+    </w:p>
+    <w:p>
+      <w:pPr>
+        <w:spacing w:after="60" w:before="80"/>
+      </w:pPr>
+      <w:r>
+        <w:rPr>
+          <w:b/>
+          <w:bCs/>
+          <w:color w:val="0F5132"/>
+          <w:sz w:val="22"/>
+          <w:szCs w:val="22"/>
+        </w:rPr>
+        <w:t xml:space="preserve">How to use it</w:t>
+      </w:r>
+    </w:p>
+    <w:p>
+      <w:pPr>
+        <w:pStyle w:val="ListParagraph"/>
+        <w:numPr>
+          <w:ilvl w:val="0"/>
+          <w:numId w:val="34"/>
+        </w:numPr>
+        <w:spacing w:after="60"/>
+      </w:pPr>
+      <w:r>
+        <w:rPr>
+          <w:sz w:val="22"/>
+          <w:szCs w:val="22"/>
+        </w:rPr>
+        <w:t xml:space="preserve">Open one of the children from Students. Beside the parent, press Instalment plan.</w:t>
+      </w:r>
+    </w:p>
+    <w:p>
+      <w:pPr>
+        <w:pStyle w:val="ListParagraph"/>
+        <w:numPr>
+          <w:ilvl w:val="0"/>
+          <w:numId w:val="34"/>
+        </w:numPr>
+        <w:spacing w:after="60"/>
+      </w:pPr>
+      <w:r>
+        <w:rPr>
+          <w:sz w:val="22"/>
+          <w:szCs w:val="22"/>
+        </w:rPr>
+        <w:t xml:space="preserve">Choose the plan. Each child shows what they will pay and when, or why they can’t go on it (nothing owed this term, or already on a plan).</w:t>
+      </w:r>
+    </w:p>
+    <w:p>
+      <w:pPr>
+        <w:pStyle w:val="ListParagraph"/>
+        <w:numPr>
+          <w:ilvl w:val="0"/>
+          <w:numId w:val="34"/>
+        </w:numPr>
+        <w:spacing w:after="60"/>
+      </w:pPr>
+      <w:r>
+        <w:rPr>
+          <w:sz w:val="22"/>
+          <w:szCs w:val="22"/>
+        </w:rPr>
+        <w:t xml:space="preserve">Leave “Tell … now by WhatsApp or text” ticked, and press Put on the plan.</w:t>
+      </w:r>
+    </w:p>
+    <w:p>
+      <w:pPr>
+        <w:pStyle w:val="ListParagraph"/>
+        <w:numPr>
+          <w:ilvl w:val="0"/>
+          <w:numId w:val="34"/>
+        </w:numPr>
+        <w:spacing w:after="60"/>
+      </w:pPr>
+      <w:r>
+        <w:rPr>
+          <w:sz w:val="22"/>
+          <w:szCs w:val="22"/>
+        </w:rPr>
+        <w:t xml:space="preserve">To put a single bill on a plan instead, open the bill and press Use a school plan.</w:t>
+      </w:r>
+    </w:p>
+    <w:p>
+      <w:pPr>
+        <w:spacing w:after="60" w:before="80"/>
+      </w:pPr>
+      <w:r>
+        <w:rPr>
+          <w:b/>
+          <w:bCs/>
+          <w:color w:val="0F5132"/>
+          <w:sz w:val="22"/>
+          <w:szCs w:val="22"/>
+        </w:rPr>
+        <w:t xml:space="preserve">Good to know</w:t>
+      </w:r>
+    </w:p>
+    <w:p>
+      <w:pPr>
+        <w:pStyle w:val="ListParagraph"/>
+        <w:numPr>
+          <w:ilvl w:val="0"/>
+          <w:numId w:val="3"/>
+        </w:numPr>
+        <w:spacing w:after="60"/>
+      </w:pPr>
+      <w:r>
+        <w:rPr>
+          <w:sz w:val="22"/>
+          <w:szCs w:val="22"/>
+        </w:rPr>
+        <w:t xml:space="preserve">The parent is sent the first payment due straight away; after that, reminders follow the plan’s dates.</w:t>
+      </w:r>
+    </w:p>
+    <w:p>
+      <w:pPr>
+        <w:pStyle w:val="ListParagraph"/>
+        <w:numPr>
+          <w:ilvl w:val="0"/>
+          <w:numId w:val="3"/>
+        </w:numPr>
+        <w:spacing w:after="60"/>
+      </w:pPr>
+      <w:r>
+        <w:rPr>
+          <w:sz w:val="22"/>
+          <w:szCs w:val="22"/>
+        </w:rPr>
+        <w:t xml:space="preserve">If the parent turned reminders off, no message is sent: let them know yourself.</w:t>
+      </w:r>
+    </w:p>
+    <w:p>
+      <w:pPr>
+        <w:pStyle w:val="ListParagraph"/>
+        <w:numPr>
+          <w:ilvl w:val="0"/>
+          <w:numId w:val="3"/>
+        </w:numPr>
+        <w:spacing w:after="60"/>
+      </w:pPr>
+      <w:r>
+        <w:rPr>
+          <w:sz w:val="22"/>
+          <w:szCs w:val="22"/>
+        </w:rPr>
+        <w:t xml:space="preserve">Staff-only plans (ones parents can’t pick themselves) can be used here.</w:t>
+      </w:r>
+    </w:p>
+    <w:p>
+      <w:pPr>
+        <w:pStyle w:val="Heading2"/>
+        <w:spacing w:after="100" w:before="280"/>
+      </w:pPr>
+      <w:bookmarkStart w:name="_Toc38" w:id="38"/>
+      <w:r>
         <w:t xml:space="preserve">Writing off debt</w:t>
       </w:r>
-      <w:bookmarkEnd w:id="37"/>
+      <w:bookmarkEnd w:id="38"/>
     </w:p>
     <w:p>
       <w:pPr>
@@ -6627,7 +6854,7 @@
         <w:pStyle w:val="ListParagraph"/>
         <w:numPr>
           <w:ilvl w:val="0"/>
-          <w:numId w:val="34"/>
+          <w:numId w:val="35"/>
         </w:numPr>
         <w:spacing w:after="60"/>
       </w:pPr>
@@ -6644,7 +6871,7 @@
         <w:pStyle w:val="ListParagraph"/>
         <w:numPr>
           <w:ilvl w:val="0"/>
-          <w:numId w:val="34"/>
+          <w:numId w:val="35"/>
         </w:numPr>
         <w:spacing w:after="60"/>
       </w:pPr>
@@ -6661,7 +6888,7 @@
         <w:pStyle w:val="ListParagraph"/>
         <w:numPr>
           <w:ilvl w:val="0"/>
-          <w:numId w:val="34"/>
+          <w:numId w:val="35"/>
         </w:numPr>
         <w:spacing w:after="60"/>
       </w:pPr>
@@ -6678,7 +6905,7 @@
         <w:pStyle w:val="ListParagraph"/>
         <w:numPr>
           <w:ilvl w:val="0"/>
-          <w:numId w:val="34"/>
+          <w:numId w:val="35"/>
         </w:numPr>
         <w:spacing w:after="60"/>
       </w:pPr>
@@ -6745,11 +6972,11 @@
         <w:pageBreakBefore/>
         <w:spacing w:after="160"/>
       </w:pPr>
-      <w:bookmarkStart w:name="_Toc38" w:id="38"/>
+      <w:bookmarkStart w:name="_Toc39" w:id="39"/>
       <w:r>
         <w:t xml:space="preserve">Payments</w:t>
       </w:r>
-      <w:bookmarkEnd w:id="38"/>
+      <w:bookmarkEnd w:id="39"/>
     </w:p>
     <w:p>
       <w:pPr>
@@ -6768,11 +6995,11 @@
         <w:pStyle w:val="Heading2"/>
         <w:spacing w:after="100" w:before="280"/>
       </w:pPr>
-      <w:bookmarkStart w:name="_Toc39" w:id="39"/>
+      <w:bookmarkStart w:name="_Toc40" w:id="40"/>
       <w:r>
         <w:t xml:space="preserve">How parents pay</w:t>
       </w:r>
-      <w:bookmarkEnd w:id="39"/>
+      <w:bookmarkEnd w:id="40"/>
     </w:p>
     <w:p>
       <w:pPr>
@@ -6838,7 +7065,7 @@
         <w:pStyle w:val="ListParagraph"/>
         <w:numPr>
           <w:ilvl w:val="0"/>
-          <w:numId w:val="35"/>
+          <w:numId w:val="36"/>
         </w:numPr>
         <w:spacing w:after="60"/>
       </w:pPr>
@@ -6855,7 +7082,7 @@
         <w:pStyle w:val="ListParagraph"/>
         <w:numPr>
           <w:ilvl w:val="0"/>
-          <w:numId w:val="35"/>
+          <w:numId w:val="36"/>
         </w:numPr>
         <w:spacing w:after="60"/>
       </w:pPr>
@@ -6872,7 +7099,7 @@
         <w:pStyle w:val="ListParagraph"/>
         <w:numPr>
           <w:ilvl w:val="0"/>
-          <w:numId w:val="35"/>
+          <w:numId w:val="36"/>
         </w:numPr>
         <w:spacing w:after="60"/>
       </w:pPr>
@@ -6889,7 +7116,7 @@
         <w:pStyle w:val="ListParagraph"/>
         <w:numPr>
           <w:ilvl w:val="0"/>
-          <w:numId w:val="35"/>
+          <w:numId w:val="36"/>
         </w:numPr>
         <w:spacing w:after="60"/>
       </w:pPr>
@@ -6938,11 +7165,11 @@
         <w:pStyle w:val="Heading2"/>
         <w:spacing w:after="100" w:before="280"/>
       </w:pPr>
-      <w:bookmarkStart w:name="_Toc40" w:id="40"/>
+      <w:bookmarkStart w:name="_Toc41" w:id="41"/>
       <w:r>
         <w:t xml:space="preserve">Seeing payments</w:t>
       </w:r>
-      <w:bookmarkEnd w:id="40"/>
+      <w:bookmarkEnd w:id="41"/>
     </w:p>
     <w:p>
       <w:pPr>
@@ -7008,7 +7235,7 @@
         <w:pStyle w:val="ListParagraph"/>
         <w:numPr>
           <w:ilvl w:val="0"/>
-          <w:numId w:val="36"/>
+          <w:numId w:val="37"/>
         </w:numPr>
         <w:spacing w:after="60"/>
       </w:pPr>
@@ -7025,11 +7252,11 @@
         <w:pStyle w:val="Heading2"/>
         <w:spacing w:after="100" w:before="280"/>
       </w:pPr>
-      <w:bookmarkStart w:name="_Toc41" w:id="41"/>
+      <w:bookmarkStart w:name="_Toc42" w:id="42"/>
       <w:r>
         <w:t xml:space="preserve">Recording cash, teller, POS or a direct transfer</w:t>
       </w:r>
-      <w:bookmarkEnd w:id="41"/>
+      <w:bookmarkEnd w:id="42"/>
     </w:p>
     <w:p>
       <w:pPr>
@@ -7095,7 +7322,7 @@
         <w:pStyle w:val="ListParagraph"/>
         <w:numPr>
           <w:ilvl w:val="0"/>
-          <w:numId w:val="37"/>
+          <w:numId w:val="38"/>
         </w:numPr>
         <w:spacing w:after="60"/>
       </w:pPr>
@@ -7112,7 +7339,7 @@
         <w:pStyle w:val="ListParagraph"/>
         <w:numPr>
           <w:ilvl w:val="0"/>
-          <w:numId w:val="37"/>
+          <w:numId w:val="38"/>
         </w:numPr>
         <w:spacing w:after="60"/>
       </w:pPr>
@@ -7129,7 +7356,7 @@
         <w:pStyle w:val="ListParagraph"/>
         <w:numPr>
           <w:ilvl w:val="0"/>
-          <w:numId w:val="37"/>
+          <w:numId w:val="38"/>
         </w:numPr>
         <w:spacing w:after="60"/>
       </w:pPr>
@@ -7178,11 +7405,11 @@
         <w:pStyle w:val="Heading2"/>
         <w:spacing w:after="100" w:before="280"/>
       </w:pPr>
-      <w:bookmarkStart w:name="_Toc42" w:id="42"/>
+      <w:bookmarkStart w:name="_Toc43" w:id="43"/>
       <w:r>
         <w:t xml:space="preserve">Saying what a payment was for, after it arrived</w:t>
       </w:r>
-      <w:bookmarkEnd w:id="42"/>
+      <w:bookmarkEnd w:id="43"/>
     </w:p>
     <w:p>
       <w:pPr>
@@ -7248,7 +7475,7 @@
         <w:pStyle w:val="ListParagraph"/>
         <w:numPr>
           <w:ilvl w:val="0"/>
-          <w:numId w:val="38"/>
+          <w:numId w:val="39"/>
         </w:numPr>
         <w:spacing w:after="60"/>
       </w:pPr>
@@ -7265,7 +7492,7 @@
         <w:pStyle w:val="ListParagraph"/>
         <w:numPr>
           <w:ilvl w:val="0"/>
-          <w:numId w:val="38"/>
+          <w:numId w:val="39"/>
         </w:numPr>
         <w:spacing w:after="60"/>
       </w:pPr>
@@ -7282,11 +7509,11 @@
         <w:pStyle w:val="Heading2"/>
         <w:spacing w:after="100" w:before="280"/>
       </w:pPr>
-      <w:bookmarkStart w:name="_Toc43" w:id="43"/>
+      <w:bookmarkStart w:name="_Toc44" w:id="44"/>
       <w:r>
         <w:t xml:space="preserve">Reversing a payment</w:t>
       </w:r>
-      <w:bookmarkEnd w:id="43"/>
+      <w:bookmarkEnd w:id="44"/>
     </w:p>
     <w:p>
       <w:pPr>
@@ -7352,7 +7579,7 @@
         <w:pStyle w:val="ListParagraph"/>
         <w:numPr>
           <w:ilvl w:val="0"/>
-          <w:numId w:val="39"/>
+          <w:numId w:val="40"/>
         </w:numPr>
         <w:spacing w:after="60"/>
       </w:pPr>
@@ -7369,11 +7596,11 @@
         <w:pStyle w:val="Heading2"/>
         <w:spacing w:after="100" w:before="280"/>
       </w:pPr>
-      <w:bookmarkStart w:name="_Toc44" w:id="44"/>
+      <w:bookmarkStart w:name="_Toc45" w:id="45"/>
       <w:r>
         <w:t xml:space="preserve">Card payment link for one pupil</w:t>
       </w:r>
-      <w:bookmarkEnd w:id="44"/>
+      <w:bookmarkEnd w:id="45"/>
     </w:p>
     <w:p>
       <w:pPr>
@@ -7439,7 +7666,7 @@
         <w:pStyle w:val="ListParagraph"/>
         <w:numPr>
           <w:ilvl w:val="0"/>
-          <w:numId w:val="40"/>
+          <w:numId w:val="41"/>
         </w:numPr>
         <w:spacing w:after="60"/>
       </w:pPr>
@@ -7456,11 +7683,11 @@
         <w:pStyle w:val="Heading2"/>
         <w:spacing w:after="100" w:before="280"/>
       </w:pPr>
-      <w:bookmarkStart w:name="_Toc45" w:id="45"/>
+      <w:bookmarkStart w:name="_Toc46" w:id="46"/>
       <w:r>
         <w:t xml:space="preserve">Receipts</w:t>
       </w:r>
-      <w:bookmarkEnd w:id="45"/>
+      <w:bookmarkEnd w:id="46"/>
     </w:p>
     <w:p>
       <w:pPr>
@@ -7526,7 +7753,7 @@
         <w:pStyle w:val="ListParagraph"/>
         <w:numPr>
           <w:ilvl w:val="0"/>
-          <w:numId w:val="41"/>
+          <w:numId w:val="42"/>
         </w:numPr>
         <w:spacing w:after="60"/>
       </w:pPr>
@@ -7543,7 +7770,7 @@
         <w:pStyle w:val="ListParagraph"/>
         <w:numPr>
           <w:ilvl w:val="0"/>
-          <w:numId w:val="41"/>
+          <w:numId w:val="42"/>
         </w:numPr>
         <w:spacing w:after="60"/>
       </w:pPr>
@@ -7560,7 +7787,7 @@
         <w:pStyle w:val="ListParagraph"/>
         <w:numPr>
           <w:ilvl w:val="0"/>
-          <w:numId w:val="41"/>
+          <w:numId w:val="42"/>
         </w:numPr>
         <w:spacing w:after="60"/>
       </w:pPr>
@@ -7577,11 +7804,11 @@
         <w:pStyle w:val="Heading2"/>
         <w:spacing w:after="100" w:before="280"/>
       </w:pPr>
-      <w:bookmarkStart w:name="_Toc46" w:id="46"/>
+      <w:bookmarkStart w:name="_Toc47" w:id="47"/>
       <w:r>
         <w:t xml:space="preserve">Paid into the bank (Paystack payouts)</w:t>
       </w:r>
-      <w:bookmarkEnd w:id="46"/>
+      <w:bookmarkEnd w:id="47"/>
     </w:p>
     <w:p>
       <w:pPr>
@@ -7647,7 +7874,7 @@
         <w:pStyle w:val="ListParagraph"/>
         <w:numPr>
           <w:ilvl w:val="0"/>
-          <w:numId w:val="42"/>
+          <w:numId w:val="43"/>
         </w:numPr>
         <w:spacing w:after="60"/>
       </w:pPr>
@@ -7664,7 +7891,7 @@
         <w:pStyle w:val="ListParagraph"/>
         <w:numPr>
           <w:ilvl w:val="0"/>
-          <w:numId w:val="42"/>
+          <w:numId w:val="43"/>
         </w:numPr>
         <w:spacing w:after="60"/>
       </w:pPr>
@@ -7681,7 +7908,7 @@
         <w:pStyle w:val="ListParagraph"/>
         <w:numPr>
           <w:ilvl w:val="0"/>
-          <w:numId w:val="42"/>
+          <w:numId w:val="43"/>
         </w:numPr>
         <w:spacing w:after="60"/>
       </w:pPr>
@@ -7698,7 +7925,7 @@
         <w:pStyle w:val="ListParagraph"/>
         <w:numPr>
           <w:ilvl w:val="0"/>
-          <w:numId w:val="42"/>
+          <w:numId w:val="43"/>
         </w:numPr>
         <w:spacing w:after="60"/>
       </w:pPr>
@@ -7716,11 +7943,11 @@
         <w:pageBreakBefore/>
         <w:spacing w:after="160"/>
       </w:pPr>
-      <w:bookmarkStart w:name="_Toc47" w:id="47"/>
+      <w:bookmarkStart w:name="_Toc48" w:id="48"/>
       <w:r>
         <w:t xml:space="preserve">Cash and spending</w:t>
       </w:r>
-      <w:bookmarkEnd w:id="47"/>
+      <w:bookmarkEnd w:id="48"/>
     </w:p>
     <w:p>
       <w:pPr>
@@ -7739,11 +7966,11 @@
         <w:pStyle w:val="Heading2"/>
         <w:spacing w:after="100" w:before="280"/>
       </w:pPr>
-      <w:bookmarkStart w:name="_Toc48" w:id="48"/>
+      <w:bookmarkStart w:name="_Toc49" w:id="49"/>
       <w:r>
         <w:t xml:space="preserve">Cash book</w:t>
       </w:r>
-      <w:bookmarkEnd w:id="48"/>
+      <w:bookmarkEnd w:id="49"/>
     </w:p>
     <w:p>
       <w:pPr>
@@ -7809,7 +8036,7 @@
         <w:pStyle w:val="ListParagraph"/>
         <w:numPr>
           <w:ilvl w:val="0"/>
-          <w:numId w:val="43"/>
+          <w:numId w:val="44"/>
         </w:numPr>
         <w:spacing w:after="60"/>
       </w:pPr>
@@ -7858,11 +8085,11 @@
         <w:pStyle w:val="Heading2"/>
         <w:spacing w:after="100" w:before="280"/>
       </w:pPr>
-      <w:bookmarkStart w:name="_Toc49" w:id="49"/>
+      <w:bookmarkStart w:name="_Toc50" w:id="50"/>
       <w:r>
         <w:t xml:space="preserve">Banking cash, checked by a second person</w:t>
       </w:r>
-      <w:bookmarkEnd w:id="49"/>
+      <w:bookmarkEnd w:id="50"/>
     </w:p>
     <w:p>
       <w:pPr>
@@ -7928,7 +8155,7 @@
         <w:pStyle w:val="ListParagraph"/>
         <w:numPr>
           <w:ilvl w:val="0"/>
-          <w:numId w:val="44"/>
+          <w:numId w:val="45"/>
         </w:numPr>
         <w:spacing w:after="60"/>
       </w:pPr>
@@ -7945,7 +8172,7 @@
         <w:pStyle w:val="ListParagraph"/>
         <w:numPr>
           <w:ilvl w:val="0"/>
-          <w:numId w:val="44"/>
+          <w:numId w:val="45"/>
         </w:numPr>
         <w:spacing w:after="60"/>
       </w:pPr>
@@ -7962,11 +8189,11 @@
         <w:pStyle w:val="Heading2"/>
         <w:spacing w:after="100" w:before="280"/>
       </w:pPr>
-      <w:bookmarkStart w:name="_Toc50" w:id="50"/>
+      <w:bookmarkStart w:name="_Toc51" w:id="51"/>
       <w:r>
         <w:t xml:space="preserve">Closing the day (drawer count)</w:t>
       </w:r>
-      <w:bookmarkEnd w:id="50"/>
+      <w:bookmarkEnd w:id="51"/>
     </w:p>
     <w:p>
       <w:pPr>
@@ -8032,7 +8259,7 @@
         <w:pStyle w:val="ListParagraph"/>
         <w:numPr>
           <w:ilvl w:val="0"/>
-          <w:numId w:val="45"/>
+          <w:numId w:val="46"/>
         </w:numPr>
         <w:spacing w:after="60"/>
       </w:pPr>
@@ -8049,11 +8276,11 @@
         <w:pStyle w:val="Heading2"/>
         <w:spacing w:after="100" w:before="280"/>
       </w:pPr>
-      <w:bookmarkStart w:name="_Toc51" w:id="51"/>
+      <w:bookmarkStart w:name="_Toc52" w:id="52"/>
       <w:r>
         <w:t xml:space="preserve">Recording spending</w:t>
       </w:r>
-      <w:bookmarkEnd w:id="51"/>
+      <w:bookmarkEnd w:id="52"/>
     </w:p>
     <w:p>
       <w:pPr>
@@ -8119,7 +8346,7 @@
         <w:pStyle w:val="ListParagraph"/>
         <w:numPr>
           <w:ilvl w:val="0"/>
-          <w:numId w:val="46"/>
+          <w:numId w:val="47"/>
         </w:numPr>
         <w:spacing w:after="60"/>
       </w:pPr>
@@ -8136,7 +8363,7 @@
         <w:pStyle w:val="ListParagraph"/>
         <w:numPr>
           <w:ilvl w:val="0"/>
-          <w:numId w:val="46"/>
+          <w:numId w:val="47"/>
         </w:numPr>
         <w:spacing w:after="60"/>
       </w:pPr>
@@ -8153,7 +8380,7 @@
         <w:pStyle w:val="ListParagraph"/>
         <w:numPr>
           <w:ilvl w:val="0"/>
-          <w:numId w:val="46"/>
+          <w:numId w:val="47"/>
         </w:numPr>
         <w:spacing w:after="60"/>
       </w:pPr>
@@ -8202,11 +8429,11 @@
         <w:pStyle w:val="Heading2"/>
         <w:spacing w:after="100" w:before="280"/>
       </w:pPr>
-      <w:bookmarkStart w:name="_Toc52" w:id="52"/>
+      <w:bookmarkStart w:name="_Toc53" w:id="53"/>
       <w:r>
         <w:t xml:space="preserve">Income and expenditure</w:t>
       </w:r>
-      <w:bookmarkEnd w:id="52"/>
+      <w:bookmarkEnd w:id="53"/>
     </w:p>
     <w:p>
       <w:pPr>
@@ -8272,7 +8499,7 @@
         <w:pStyle w:val="ListParagraph"/>
         <w:numPr>
           <w:ilvl w:val="0"/>
-          <w:numId w:val="47"/>
+          <w:numId w:val="48"/>
         </w:numPr>
         <w:spacing w:after="60"/>
       </w:pPr>
@@ -8290,11 +8517,11 @@
         <w:pageBreakBefore/>
         <w:spacing w:after="160"/>
       </w:pPr>
-      <w:bookmarkStart w:name="_Toc53" w:id="53"/>
+      <w:bookmarkStart w:name="_Toc54" w:id="54"/>
       <w:r>
         <w:t xml:space="preserve">Messages to parents</w:t>
       </w:r>
-      <w:bookmarkEnd w:id="53"/>
+      <w:bookmarkEnd w:id="54"/>
     </w:p>
     <w:p>
       <w:pPr>
@@ -8313,11 +8540,11 @@
         <w:pStyle w:val="Heading2"/>
         <w:spacing w:after="100" w:before="280"/>
       </w:pPr>
-      <w:bookmarkStart w:name="_Toc54" w:id="54"/>
+      <w:bookmarkStart w:name="_Toc55" w:id="55"/>
       <w:r>
         <w:t xml:space="preserve">Sent messages</w:t>
       </w:r>
-      <w:bookmarkEnd w:id="54"/>
+      <w:bookmarkEnd w:id="55"/>
     </w:p>
     <w:p>
       <w:pPr>
@@ -8383,7 +8610,7 @@
         <w:pStyle w:val="ListParagraph"/>
         <w:numPr>
           <w:ilvl w:val="0"/>
-          <w:numId w:val="48"/>
+          <w:numId w:val="49"/>
         </w:numPr>
         <w:spacing w:after="60"/>
       </w:pPr>
@@ -8400,11 +8627,11 @@
         <w:pStyle w:val="Heading2"/>
         <w:spacing w:after="100" w:before="280"/>
       </w:pPr>
-      <w:bookmarkStart w:name="_Toc55" w:id="55"/>
+      <w:bookmarkStart w:name="_Toc56" w:id="56"/>
       <w:r>
         <w:t xml:space="preserve">The wording</w:t>
       </w:r>
-      <w:bookmarkEnd w:id="55"/>
+      <w:bookmarkEnd w:id="56"/>
     </w:p>
     <w:p>
       <w:pPr>
@@ -8470,7 +8697,7 @@
         <w:pStyle w:val="ListParagraph"/>
         <w:numPr>
           <w:ilvl w:val="0"/>
-          <w:numId w:val="49"/>
+          <w:numId w:val="50"/>
         </w:numPr>
         <w:spacing w:after="60"/>
       </w:pPr>
@@ -8487,7 +8714,7 @@
         <w:pStyle w:val="ListParagraph"/>
         <w:numPr>
           <w:ilvl w:val="0"/>
-          <w:numId w:val="49"/>
+          <w:numId w:val="50"/>
         </w:numPr>
         <w:spacing w:after="60"/>
       </w:pPr>
@@ -8504,7 +8731,7 @@
         <w:pStyle w:val="ListParagraph"/>
         <w:numPr>
           <w:ilvl w:val="0"/>
-          <w:numId w:val="49"/>
+          <w:numId w:val="50"/>
         </w:numPr>
         <w:spacing w:after="60"/>
       </w:pPr>
@@ -8553,11 +8780,11 @@
         <w:pStyle w:val="Heading2"/>
         <w:spacing w:after="100" w:before="280"/>
       </w:pPr>
-      <w:bookmarkStart w:name="_Toc56" w:id="56"/>
+      <w:bookmarkStart w:name="_Toc57" w:id="57"/>
       <w:r>
         <w:t xml:space="preserve">The reminder schedule</w:t>
       </w:r>
-      <w:bookmarkEnd w:id="56"/>
+      <w:bookmarkEnd w:id="57"/>
     </w:p>
     <w:p>
       <w:pPr>
@@ -8623,7 +8850,7 @@
         <w:pStyle w:val="ListParagraph"/>
         <w:numPr>
           <w:ilvl w:val="0"/>
-          <w:numId w:val="50"/>
+          <w:numId w:val="51"/>
         </w:numPr>
         <w:spacing w:after="60"/>
       </w:pPr>
@@ -8640,7 +8867,7 @@
         <w:pStyle w:val="ListParagraph"/>
         <w:numPr>
           <w:ilvl w:val="0"/>
-          <w:numId w:val="50"/>
+          <w:numId w:val="51"/>
         </w:numPr>
         <w:spacing w:after="60"/>
       </w:pPr>
@@ -8657,7 +8884,7 @@
         <w:pStyle w:val="ListParagraph"/>
         <w:numPr>
           <w:ilvl w:val="0"/>
-          <w:numId w:val="50"/>
+          <w:numId w:val="51"/>
         </w:numPr>
         <w:spacing w:after="60"/>
       </w:pPr>
@@ -8675,11 +8902,11 @@
         <w:pageBreakBefore/>
         <w:spacing w:after="160"/>
       </w:pPr>
-      <w:bookmarkStart w:name="_Toc57" w:id="57"/>
+      <w:bookmarkStart w:name="_Toc58" w:id="58"/>
       <w:r>
         <w:t xml:space="preserve">The Overview page and reports</w:t>
       </w:r>
-      <w:bookmarkEnd w:id="57"/>
+      <w:bookmarkEnd w:id="58"/>
     </w:p>
     <w:p>
       <w:pPr>
@@ -8698,11 +8925,11 @@
         <w:pStyle w:val="Heading2"/>
         <w:spacing w:after="100" w:before="280"/>
       </w:pPr>
-      <w:bookmarkStart w:name="_Toc58" w:id="58"/>
+      <w:bookmarkStart w:name="_Toc59" w:id="59"/>
       <w:r>
         <w:t xml:space="preserve">Overview</w:t>
       </w:r>
-      <w:bookmarkEnd w:id="58"/>
+      <w:bookmarkEnd w:id="59"/>
     </w:p>
     <w:p>
       <w:pPr>
@@ -8768,7 +8995,7 @@
         <w:pStyle w:val="ListParagraph"/>
         <w:numPr>
           <w:ilvl w:val="0"/>
-          <w:numId w:val="51"/>
+          <w:numId w:val="52"/>
         </w:numPr>
         <w:spacing w:after="60"/>
       </w:pPr>
@@ -8785,7 +9012,7 @@
         <w:pStyle w:val="ListParagraph"/>
         <w:numPr>
           <w:ilvl w:val="0"/>
-          <w:numId w:val="51"/>
+          <w:numId w:val="52"/>
         </w:numPr>
         <w:spacing w:after="60"/>
       </w:pPr>
@@ -8802,11 +9029,11 @@
         <w:pStyle w:val="Heading2"/>
         <w:spacing w:after="100" w:before="280"/>
       </w:pPr>
-      <w:bookmarkStart w:name="_Toc59" w:id="59"/>
+      <w:bookmarkStart w:name="_Toc60" w:id="60"/>
       <w:r>
         <w:t xml:space="preserve">Pace and forecast</w:t>
       </w:r>
-      <w:bookmarkEnd w:id="59"/>
+      <w:bookmarkEnd w:id="60"/>
     </w:p>
     <w:p>
       <w:pPr>
@@ -8872,7 +9099,7 @@
         <w:pStyle w:val="ListParagraph"/>
         <w:numPr>
           <w:ilvl w:val="0"/>
-          <w:numId w:val="52"/>
+          <w:numId w:val="53"/>
         </w:numPr>
         <w:spacing w:after="60"/>
       </w:pPr>
@@ -8889,7 +9116,7 @@
         <w:pStyle w:val="ListParagraph"/>
         <w:numPr>
           <w:ilvl w:val="0"/>
-          <w:numId w:val="52"/>
+          <w:numId w:val="53"/>
         </w:numPr>
         <w:spacing w:after="60"/>
       </w:pPr>
@@ -8906,7 +9133,7 @@
         <w:pStyle w:val="ListParagraph"/>
         <w:numPr>
           <w:ilvl w:val="0"/>
-          <w:numId w:val="52"/>
+          <w:numId w:val="53"/>
         </w:numPr>
         <w:spacing w:after="60"/>
       </w:pPr>
@@ -8923,11 +9150,11 @@
         <w:pStyle w:val="Heading2"/>
         <w:spacing w:after="100" w:before="280"/>
       </w:pPr>
-      <w:bookmarkStart w:name="_Toc60" w:id="60"/>
+      <w:bookmarkStart w:name="_Toc61" w:id="61"/>
       <w:r>
         <w:t xml:space="preserve">Debtors</w:t>
       </w:r>
-      <w:bookmarkEnd w:id="60"/>
+      <w:bookmarkEnd w:id="61"/>
     </w:p>
     <w:p>
       <w:pPr>
@@ -8993,7 +9220,7 @@
         <w:pStyle w:val="ListParagraph"/>
         <w:numPr>
           <w:ilvl w:val="0"/>
-          <w:numId w:val="53"/>
+          <w:numId w:val="54"/>
         </w:numPr>
         <w:spacing w:after="60"/>
       </w:pPr>
@@ -9010,11 +9237,11 @@
         <w:pStyle w:val="Heading2"/>
         <w:spacing w:after="100" w:before="280"/>
       </w:pPr>
-      <w:bookmarkStart w:name="_Toc61" w:id="61"/>
+      <w:bookmarkStart w:name="_Toc62" w:id="62"/>
       <w:r>
         <w:t xml:space="preserve">Money received</w:t>
       </w:r>
-      <w:bookmarkEnd w:id="61"/>
+      <w:bookmarkEnd w:id="62"/>
     </w:p>
     <w:p>
       <w:pPr>
@@ -9080,7 +9307,7 @@
         <w:pStyle w:val="ListParagraph"/>
         <w:numPr>
           <w:ilvl w:val="0"/>
-          <w:numId w:val="54"/>
+          <w:numId w:val="55"/>
         </w:numPr>
         <w:spacing w:after="60"/>
       </w:pPr>
@@ -9097,11 +9324,11 @@
         <w:pStyle w:val="Heading2"/>
         <w:spacing w:after="100" w:before="280"/>
       </w:pPr>
-      <w:bookmarkStart w:name="_Toc62" w:id="62"/>
+      <w:bookmarkStart w:name="_Toc63" w:id="63"/>
       <w:r>
         <w:t xml:space="preserve">Fee status by pupil</w:t>
       </w:r>
-      <w:bookmarkEnd w:id="62"/>
+      <w:bookmarkEnd w:id="63"/>
     </w:p>
     <w:p>
       <w:pPr>
@@ -9167,7 +9394,7 @@
         <w:pStyle w:val="ListParagraph"/>
         <w:numPr>
           <w:ilvl w:val="0"/>
-          <w:numId w:val="55"/>
+          <w:numId w:val="56"/>
         </w:numPr>
         <w:spacing w:after="60"/>
       </w:pPr>
@@ -9184,11 +9411,11 @@
         <w:pStyle w:val="Heading2"/>
         <w:spacing w:after="100" w:before="280"/>
       </w:pPr>
-      <w:bookmarkStart w:name="_Toc63" w:id="63"/>
+      <w:bookmarkStart w:name="_Toc64" w:id="64"/>
       <w:r>
         <w:t xml:space="preserve">Unusual activity</w:t>
       </w:r>
-      <w:bookmarkEnd w:id="63"/>
+      <w:bookmarkEnd w:id="64"/>
     </w:p>
     <w:p>
       <w:pPr>
@@ -9254,7 +9481,7 @@
         <w:pStyle w:val="ListParagraph"/>
         <w:numPr>
           <w:ilvl w:val="0"/>
-          <w:numId w:val="56"/>
+          <w:numId w:val="57"/>
         </w:numPr>
         <w:spacing w:after="60"/>
       </w:pPr>
@@ -9271,7 +9498,7 @@
         <w:pStyle w:val="ListParagraph"/>
         <w:numPr>
           <w:ilvl w:val="0"/>
-          <w:numId w:val="56"/>
+          <w:numId w:val="57"/>
         </w:numPr>
         <w:spacing w:after="60"/>
       </w:pPr>
@@ -9288,7 +9515,7 @@
         <w:pStyle w:val="ListParagraph"/>
         <w:numPr>
           <w:ilvl w:val="0"/>
-          <w:numId w:val="56"/>
+          <w:numId w:val="57"/>
         </w:numPr>
         <w:spacing w:after="60"/>
       </w:pPr>
@@ -9338,11 +9565,11 @@
         <w:pageBreakBefore/>
         <w:spacing w:after="160"/>
       </w:pPr>
-      <w:bookmarkStart w:name="_Toc64" w:id="64"/>
+      <w:bookmarkStart w:name="_Toc65" w:id="65"/>
       <w:r>
         <w:t xml:space="preserve">For the accountant</w:t>
       </w:r>
-      <w:bookmarkEnd w:id="64"/>
+      <w:bookmarkEnd w:id="65"/>
     </w:p>
     <w:p>
       <w:pPr>
@@ -9361,11 +9588,11 @@
         <w:pStyle w:val="Heading2"/>
         <w:spacing w:after="100" w:before="280"/>
       </w:pPr>
-      <w:bookmarkStart w:name="_Toc65" w:id="65"/>
+      <w:bookmarkStart w:name="_Toc66" w:id="66"/>
       <w:r>
         <w:t xml:space="preserve">The general journal</w:t>
       </w:r>
-      <w:bookmarkEnd w:id="65"/>
+      <w:bookmarkEnd w:id="66"/>
     </w:p>
     <w:p>
       <w:pPr>
@@ -9431,7 +9658,7 @@
         <w:pStyle w:val="ListParagraph"/>
         <w:numPr>
           <w:ilvl w:val="0"/>
-          <w:numId w:val="57"/>
+          <w:numId w:val="58"/>
         </w:numPr>
         <w:spacing w:after="60"/>
       </w:pPr>
@@ -9448,7 +9675,7 @@
         <w:pStyle w:val="ListParagraph"/>
         <w:numPr>
           <w:ilvl w:val="0"/>
-          <w:numId w:val="57"/>
+          <w:numId w:val="58"/>
         </w:numPr>
         <w:spacing w:after="60"/>
       </w:pPr>
@@ -9497,11 +9724,11 @@
         <w:pStyle w:val="Heading2"/>
         <w:spacing w:after="100" w:before="280"/>
       </w:pPr>
-      <w:bookmarkStart w:name="_Toc66" w:id="66"/>
+      <w:bookmarkStart w:name="_Toc67" w:id="67"/>
       <w:r>
         <w:t xml:space="preserve">Chart of accounts</w:t>
       </w:r>
-      <w:bookmarkEnd w:id="66"/>
+      <w:bookmarkEnd w:id="67"/>
     </w:p>
     <w:p>
       <w:pPr>
@@ -9567,7 +9794,7 @@
         <w:pStyle w:val="ListParagraph"/>
         <w:numPr>
           <w:ilvl w:val="0"/>
-          <w:numId w:val="58"/>
+          <w:numId w:val="59"/>
         </w:numPr>
         <w:spacing w:after="60"/>
       </w:pPr>
@@ -9584,11 +9811,11 @@
         <w:pStyle w:val="Heading2"/>
         <w:spacing w:after="100" w:before="280"/>
       </w:pPr>
-      <w:bookmarkStart w:name="_Toc67" w:id="67"/>
+      <w:bookmarkStart w:name="_Toc68" w:id="68"/>
       <w:r>
         <w:t xml:space="preserve">Closing the books (closing a term)</w:t>
       </w:r>
-      <w:bookmarkEnd w:id="67"/>
+      <w:bookmarkEnd w:id="68"/>
     </w:p>
     <w:p>
       <w:pPr>
@@ -9654,7 +9881,7 @@
         <w:pStyle w:val="ListParagraph"/>
         <w:numPr>
           <w:ilvl w:val="0"/>
-          <w:numId w:val="59"/>
+          <w:numId w:val="60"/>
         </w:numPr>
         <w:spacing w:after="60"/>
       </w:pPr>
@@ -9671,7 +9898,7 @@
         <w:pStyle w:val="ListParagraph"/>
         <w:numPr>
           <w:ilvl w:val="0"/>
-          <w:numId w:val="59"/>
+          <w:numId w:val="60"/>
         </w:numPr>
         <w:spacing w:after="60"/>
       </w:pPr>
@@ -9688,7 +9915,7 @@
         <w:pStyle w:val="ListParagraph"/>
         <w:numPr>
           <w:ilvl w:val="0"/>
-          <w:numId w:val="59"/>
+          <w:numId w:val="60"/>
         </w:numPr>
         <w:spacing w:after="60"/>
       </w:pPr>
@@ -9737,11 +9964,11 @@
         <w:pStyle w:val="Heading2"/>
         <w:spacing w:after="100" w:before="280"/>
       </w:pPr>
-      <w:bookmarkStart w:name="_Toc68" w:id="68"/>
+      <w:bookmarkStart w:name="_Toc69" w:id="69"/>
       <w:r>
         <w:t xml:space="preserve">End-of-session pack</w:t>
       </w:r>
-      <w:bookmarkEnd w:id="68"/>
+      <w:bookmarkEnd w:id="69"/>
     </w:p>
     <w:p>
       <w:pPr>
@@ -9807,7 +10034,7 @@
         <w:pStyle w:val="ListParagraph"/>
         <w:numPr>
           <w:ilvl w:val="0"/>
-          <w:numId w:val="60"/>
+          <w:numId w:val="61"/>
         </w:numPr>
         <w:spacing w:after="60"/>
       </w:pPr>
@@ -9824,7 +10051,7 @@
         <w:pStyle w:val="ListParagraph"/>
         <w:numPr>
           <w:ilvl w:val="0"/>
-          <w:numId w:val="60"/>
+          <w:numId w:val="61"/>
         </w:numPr>
         <w:spacing w:after="60"/>
       </w:pPr>
@@ -9874,22 +10101,22 @@
         <w:pageBreakBefore/>
         <w:spacing w:after="160"/>
       </w:pPr>
-      <w:bookmarkStart w:name="_Toc69" w:id="69"/>
+      <w:bookmarkStart w:name="_Toc70" w:id="70"/>
       <w:r>
         <w:t xml:space="preserve">The school’s own records</w:t>
       </w:r>
-      <w:bookmarkEnd w:id="69"/>
+      <w:bookmarkEnd w:id="70"/>
     </w:p>
     <w:p>
       <w:pPr>
         <w:pStyle w:val="Heading2"/>
         <w:spacing w:after="100" w:before="280"/>
       </w:pPr>
-      <w:bookmarkStart w:name="_Toc70" w:id="70"/>
+      <w:bookmarkStart w:name="_Toc71" w:id="71"/>
       <w:r>
         <w:t xml:space="preserve">Activity log</w:t>
       </w:r>
-      <w:bookmarkEnd w:id="70"/>
+      <w:bookmarkEnd w:id="71"/>
     </w:p>
     <w:p>
       <w:pPr>
@@ -9955,7 +10182,7 @@
         <w:pStyle w:val="ListParagraph"/>
         <w:numPr>
           <w:ilvl w:val="0"/>
-          <w:numId w:val="61"/>
+          <w:numId w:val="62"/>
         </w:numPr>
         <w:spacing w:after="60"/>
       </w:pPr>
@@ -9972,11 +10199,11 @@
         <w:pStyle w:val="Heading2"/>
         <w:spacing w:after="100" w:before="280"/>
       </w:pPr>
-      <w:bookmarkStart w:name="_Toc71" w:id="71"/>
+      <w:bookmarkStart w:name="_Toc72" w:id="72"/>
       <w:r>
         <w:t xml:space="preserve">Subscription</w:t>
       </w:r>
-      <w:bookmarkEnd w:id="71"/>
+      <w:bookmarkEnd w:id="72"/>
     </w:p>
     <w:p>
       <w:pPr>
@@ -10042,7 +10269,7 @@
         <w:pStyle w:val="ListParagraph"/>
         <w:numPr>
           <w:ilvl w:val="0"/>
-          <w:numId w:val="62"/>
+          <w:numId w:val="63"/>
         </w:numPr>
         <w:spacing w:after="60"/>
       </w:pPr>
@@ -10092,11 +10319,11 @@
         <w:pageBreakBefore/>
         <w:spacing w:after="160"/>
       </w:pPr>
-      <w:bookmarkStart w:name="_Toc72" w:id="72"/>
+      <w:bookmarkStart w:name="_Toc73" w:id="73"/>
       <w:r>
         <w:t xml:space="preserve">For parents</w:t>
       </w:r>
-      <w:bookmarkEnd w:id="72"/>
+      <w:bookmarkEnd w:id="73"/>
     </w:p>
     <w:p>
       <w:pPr>
@@ -10115,11 +10342,11 @@
         <w:pStyle w:val="Heading2"/>
         <w:spacing w:after="100" w:before="280"/>
       </w:pPr>
-      <w:bookmarkStart w:name="_Toc73" w:id="73"/>
+      <w:bookmarkStart w:name="_Toc74" w:id="74"/>
       <w:r>
         <w:t xml:space="preserve">Paying from the message link</w:t>
       </w:r>
-      <w:bookmarkEnd w:id="73"/>
+      <w:bookmarkEnd w:id="74"/>
     </w:p>
     <w:p>
       <w:pPr>
@@ -10185,7 +10412,7 @@
         <w:pStyle w:val="ListParagraph"/>
         <w:numPr>
           <w:ilvl w:val="0"/>
-          <w:numId w:val="63"/>
+          <w:numId w:val="64"/>
         </w:numPr>
         <w:spacing w:after="60"/>
       </w:pPr>
@@ -10202,7 +10429,7 @@
         <w:pStyle w:val="ListParagraph"/>
         <w:numPr>
           <w:ilvl w:val="0"/>
-          <w:numId w:val="63"/>
+          <w:numId w:val="64"/>
         </w:numPr>
         <w:spacing w:after="60"/>
       </w:pPr>
@@ -10219,7 +10446,7 @@
         <w:pStyle w:val="ListParagraph"/>
         <w:numPr>
           <w:ilvl w:val="0"/>
-          <w:numId w:val="63"/>
+          <w:numId w:val="64"/>
         </w:numPr>
         <w:spacing w:after="60"/>
       </w:pPr>
@@ -10236,11 +10463,11 @@
         <w:pStyle w:val="Heading2"/>
         <w:spacing w:after="100" w:before="280"/>
       </w:pPr>
-      <w:bookmarkStart w:name="_Toc74" w:id="74"/>
+      <w:bookmarkStart w:name="_Toc75" w:id="75"/>
       <w:r>
         <w:t xml:space="preserve">The parent portal</w:t>
       </w:r>
-      <w:bookmarkEnd w:id="74"/>
+      <w:bookmarkEnd w:id="75"/>
     </w:p>
     <w:p>
       <w:pPr>
@@ -10306,7 +10533,7 @@
         <w:pStyle w:val="ListParagraph"/>
         <w:numPr>
           <w:ilvl w:val="0"/>
-          <w:numId w:val="64"/>
+          <w:numId w:val="65"/>
         </w:numPr>
         <w:spacing w:after="60"/>
       </w:pPr>
@@ -10323,7 +10550,7 @@
         <w:pStyle w:val="ListParagraph"/>
         <w:numPr>
           <w:ilvl w:val="0"/>
-          <w:numId w:val="64"/>
+          <w:numId w:val="65"/>
         </w:numPr>
         <w:spacing w:after="60"/>
       </w:pPr>
@@ -10340,7 +10567,7 @@
         <w:pStyle w:val="ListParagraph"/>
         <w:numPr>
           <w:ilvl w:val="0"/>
-          <w:numId w:val="64"/>
+          <w:numId w:val="65"/>
         </w:numPr>
         <w:spacing w:after="60"/>
       </w:pPr>
@@ -10357,11 +10584,11 @@
         <w:pStyle w:val="Heading2"/>
         <w:spacing w:after="100" w:before="280"/>
       </w:pPr>
-      <w:bookmarkStart w:name="_Toc75" w:id="75"/>
+      <w:bookmarkStart w:name="_Toc76" w:id="76"/>
       <w:r>
         <w:t xml:space="preserve">Spreading the fees with a school plan</w:t>
       </w:r>
-      <w:bookmarkEnd w:id="75"/>
+      <w:bookmarkEnd w:id="76"/>
     </w:p>
     <w:p>
       <w:pPr>
@@ -10427,7 +10654,7 @@
         <w:pStyle w:val="ListParagraph"/>
         <w:numPr>
           <w:ilvl w:val="0"/>
-          <w:numId w:val="65"/>
+          <w:numId w:val="66"/>
         </w:numPr>
         <w:spacing w:after="60"/>
       </w:pPr>
@@ -10444,7 +10671,7 @@
         <w:pStyle w:val="ListParagraph"/>
         <w:numPr>
           <w:ilvl w:val="0"/>
-          <w:numId w:val="65"/>
+          <w:numId w:val="66"/>
         </w:numPr>
         <w:spacing w:after="60"/>
       </w:pPr>
@@ -10461,7 +10688,7 @@
         <w:pStyle w:val="ListParagraph"/>
         <w:numPr>
           <w:ilvl w:val="0"/>
-          <w:numId w:val="65"/>
+          <w:numId w:val="66"/>
         </w:numPr>
         <w:spacing w:after="60"/>
       </w:pPr>
@@ -10478,11 +10705,11 @@
         <w:pStyle w:val="Heading2"/>
         <w:spacing w:after="100" w:before="280"/>
       </w:pPr>
-      <w:bookmarkStart w:name="_Toc76" w:id="76"/>
+      <w:bookmarkStart w:name="_Toc77" w:id="77"/>
       <w:r>
         <w:t xml:space="preserve">Messages and my data</w:t>
       </w:r>
-      <w:bookmarkEnd w:id="76"/>
+      <w:bookmarkEnd w:id="77"/>
     </w:p>
     <w:p>
       <w:pPr>
@@ -10548,7 +10775,7 @@
         <w:pStyle w:val="ListParagraph"/>
         <w:numPr>
           <w:ilvl w:val="0"/>
-          <w:numId w:val="66"/>
+          <w:numId w:val="67"/>
         </w:numPr>
         <w:spacing w:after="60"/>
       </w:pPr>
@@ -10565,7 +10792,7 @@
         <w:pStyle w:val="ListParagraph"/>
         <w:numPr>
           <w:ilvl w:val="0"/>
-          <w:numId w:val="66"/>
+          <w:numId w:val="67"/>
         </w:numPr>
         <w:spacing w:after="60"/>
       </w:pPr>
@@ -10583,11 +10810,11 @@
         <w:pageBreakBefore/>
         <w:spacing w:after="160"/>
       </w:pPr>
-      <w:bookmarkStart w:name="_Toc77" w:id="77"/>
+      <w:bookmarkStart w:name="_Toc78" w:id="78"/>
       <w:r>
         <w:t xml:space="preserve">For the WardPay team</w:t>
       </w:r>
-      <w:bookmarkEnd w:id="77"/>
+      <w:bookmarkEnd w:id="78"/>
     </w:p>
     <w:p>
       <w:pPr>
@@ -10606,11 +10833,11 @@
         <w:pStyle w:val="Heading2"/>
         <w:spacing w:after="100" w:before="280"/>
       </w:pPr>
-      <w:bookmarkStart w:name="_Toc78" w:id="78"/>
+      <w:bookmarkStart w:name="_Toc79" w:id="79"/>
       <w:r>
         <w:t xml:space="preserve">Platform overview and trends</w:t>
       </w:r>
-      <w:bookmarkEnd w:id="78"/>
+      <w:bookmarkEnd w:id="79"/>
     </w:p>
     <w:p>
       <w:pPr>
@@ -10676,7 +10903,7 @@
         <w:pStyle w:val="ListParagraph"/>
         <w:numPr>
           <w:ilvl w:val="0"/>
-          <w:numId w:val="67"/>
+          <w:numId w:val="68"/>
         </w:numPr>
         <w:spacing w:after="60"/>
       </w:pPr>
@@ -10693,11 +10920,11 @@
         <w:pStyle w:val="Heading2"/>
         <w:spacing w:after="100" w:before="280"/>
       </w:pPr>
-      <w:bookmarkStart w:name="_Toc79" w:id="79"/>
+      <w:bookmarkStart w:name="_Toc80" w:id="80"/>
       <w:r>
         <w:t xml:space="preserve">Schools</w:t>
       </w:r>
-      <w:bookmarkEnd w:id="79"/>
+      <w:bookmarkEnd w:id="80"/>
     </w:p>
     <w:p>
       <w:pPr>
@@ -10763,7 +10990,7 @@
         <w:pStyle w:val="ListParagraph"/>
         <w:numPr>
           <w:ilvl w:val="0"/>
-          <w:numId w:val="68"/>
+          <w:numId w:val="69"/>
         </w:numPr>
         <w:spacing w:after="60"/>
       </w:pPr>
@@ -10780,7 +11007,7 @@
         <w:pStyle w:val="ListParagraph"/>
         <w:numPr>
           <w:ilvl w:val="0"/>
-          <w:numId w:val="68"/>
+          <w:numId w:val="69"/>
         </w:numPr>
         <w:spacing w:after="60"/>
       </w:pPr>
@@ -10797,7 +11024,7 @@
         <w:pStyle w:val="ListParagraph"/>
         <w:numPr>
           <w:ilvl w:val="0"/>
-          <w:numId w:val="68"/>
+          <w:numId w:val="69"/>
         </w:numPr>
         <w:spacing w:after="60"/>
       </w:pPr>
@@ -10814,11 +11041,11 @@
         <w:pStyle w:val="Heading2"/>
         <w:spacing w:after="100" w:before="280"/>
       </w:pPr>
-      <w:bookmarkStart w:name="_Toc80" w:id="80"/>
+      <w:bookmarkStart w:name="_Toc81" w:id="81"/>
       <w:r>
         <w:t xml:space="preserve">Subscription billing and plans</w:t>
       </w:r>
-      <w:bookmarkEnd w:id="80"/>
+      <w:bookmarkEnd w:id="81"/>
     </w:p>
     <w:p>
       <w:pPr>
@@ -10884,7 +11111,7 @@
         <w:pStyle w:val="ListParagraph"/>
         <w:numPr>
           <w:ilvl w:val="0"/>
-          <w:numId w:val="69"/>
+          <w:numId w:val="70"/>
         </w:numPr>
         <w:spacing w:after="60"/>
       </w:pPr>
@@ -10901,7 +11128,7 @@
         <w:pStyle w:val="ListParagraph"/>
         <w:numPr>
           <w:ilvl w:val="0"/>
-          <w:numId w:val="69"/>
+          <w:numId w:val="70"/>
         </w:numPr>
         <w:spacing w:after="60"/>
       </w:pPr>
@@ -10918,7 +11145,7 @@
         <w:pStyle w:val="ListParagraph"/>
         <w:numPr>
           <w:ilvl w:val="0"/>
-          <w:numId w:val="69"/>
+          <w:numId w:val="70"/>
         </w:numPr>
         <w:spacing w:after="60"/>
       </w:pPr>
@@ -10935,11 +11162,11 @@
         <w:pStyle w:val="Heading2"/>
         <w:spacing w:after="100" w:before="280"/>
       </w:pPr>
-      <w:bookmarkStart w:name="_Toc81" w:id="81"/>
+      <w:bookmarkStart w:name="_Toc82" w:id="82"/>
       <w:r>
         <w:t xml:space="preserve">Problems, providers and support lookup</w:t>
       </w:r>
-      <w:bookmarkEnd w:id="81"/>
+      <w:bookmarkEnd w:id="82"/>
     </w:p>
     <w:p>
       <w:pPr>
@@ -11005,7 +11232,7 @@
         <w:pStyle w:val="ListParagraph"/>
         <w:numPr>
           <w:ilvl w:val="0"/>
-          <w:numId w:val="70"/>
+          <w:numId w:val="71"/>
         </w:numPr>
         <w:spacing w:after="60"/>
       </w:pPr>
@@ -11022,7 +11249,7 @@
         <w:pStyle w:val="ListParagraph"/>
         <w:numPr>
           <w:ilvl w:val="0"/>
-          <w:numId w:val="70"/>
+          <w:numId w:val="71"/>
         </w:numPr>
         <w:spacing w:after="60"/>
       </w:pPr>
@@ -11039,7 +11266,7 @@
         <w:pStyle w:val="ListParagraph"/>
         <w:numPr>
           <w:ilvl w:val="0"/>
-          <w:numId w:val="70"/>
+          <w:numId w:val="71"/>
         </w:numPr>
         <w:spacing w:after="60"/>
       </w:pPr>
@@ -11057,11 +11284,11 @@
         <w:pageBreakBefore/>
         <w:spacing w:after="160"/>
       </w:pPr>
-      <w:bookmarkStart w:name="_Toc82" w:id="82"/>
+      <w:bookmarkStart w:name="_Toc83" w:id="83"/>
       <w:r>
         <w:t xml:space="preserve">What changed in this guide</w:t>
       </w:r>
-      <w:bookmarkEnd w:id="82"/>
+      <w:bookmarkEnd w:id="83"/>
     </w:p>
     <w:tbl>
       <w:tblPr>
@@ -11140,6 +11367,64 @@
                 <w:szCs w:val="21"/>
               </w:rPr>
               <w:t xml:space="preserve">Change</w:t>
+            </w:r>
+          </w:p>
+        </w:tc>
+      </w:tr>
+      <w:tr>
+        <w:tc>
+          <w:tcPr>
+            <w:tcW w:type="dxa" w:w="1900"/>
+            <w:tcBorders>
+              <w:top w:val="single" w:color="D0D7D3" w:sz="4"/>
+              <w:left w:val="single" w:color="D0D7D3" w:sz="4"/>
+              <w:bottom w:val="single" w:color="D0D7D3" w:sz="4"/>
+              <w:right w:val="single" w:color="D0D7D3" w:sz="4"/>
+            </w:tcBorders>
+            <w:tcMar>
+              <w:top w:type="dxa" w:w="80"/>
+              <w:left w:type="dxa" w:w="120"/>
+              <w:bottom w:type="dxa" w:w="80"/>
+              <w:right w:type="dxa" w:w="120"/>
+            </w:tcMar>
+          </w:tcPr>
+          <w:p>
+            <w:r>
+              <w:rPr>
+                <w:b w:val="false"/>
+                <w:bCs w:val="false"/>
+                <w:sz w:val="21"/>
+                <w:szCs w:val="21"/>
+              </w:rPr>
+              <w:t xml:space="preserve">25 Oct 2026</w:t>
+            </w:r>
+          </w:p>
+        </w:tc>
+        <w:tc>
+          <w:tcPr>
+            <w:tcW w:type="dxa" w:w="7738"/>
+            <w:tcBorders>
+              <w:top w:val="single" w:color="D0D7D3" w:sz="4"/>
+              <w:left w:val="single" w:color="D0D7D3" w:sz="4"/>
+              <w:bottom w:val="single" w:color="D0D7D3" w:sz="4"/>
+              <w:right w:val="single" w:color="D0D7D3" w:sz="4"/>
+            </w:tcBorders>
+            <w:tcMar>
+              <w:top w:type="dxa" w:w="80"/>
+              <w:left w:type="dxa" w:w="120"/>
+              <w:bottom w:type="dxa" w:w="80"/>
+              <w:right w:type="dxa" w:w="120"/>
+            </w:tcMar>
+          </w:tcPr>
+          <w:p>
+            <w:r>
+              <w:rPr>
+                <w:b w:val="false"/>
+                <w:bCs w:val="false"/>
+                <w:sz w:val="21"/>
+                <w:szCs w:val="21"/>
+              </w:rPr>
+              <w:t xml:space="preserve">Putting a whole family on a plan from the pupil’s page, and telling the parent by WhatsApp or text.</w:t>
             </w:r>
           </w:p>
         </w:tc>
@@ -11998,6 +12283,12 @@
     </w:lvlOverride>
   </w:num>
   <w:num w:numId="70">
+    <w:abstractNumId w:val="3"/>
+    <w:lvlOverride w:ilvl="0">
+      <w:startOverride w:val="1"/>
+    </w:lvlOverride>
+  </w:num>
+  <w:num w:numId="71">
     <w:abstractNumId w:val="3"/>
     <w:lvlOverride w:ilvl="0">
       <w:startOverride w:val="1"/>

</xml_diff>

<commit_message>
WardPay's standard plan charge: ₦300 a payment plus ₦200, a floor schools can only raise
</commit_message>
<xml_diff>
--- a/docs/product/WardPay - user guide.docx
+++ b/docs/product/WardPay - user guide.docx
@@ -6472,7 +6472,7 @@
           <w:sz w:val="22"/>
           <w:szCs w:val="22"/>
         </w:rPr>
-        <w:t xml:space="preserve">Optionally add a plan charge (a fixed amount or a percentage, up to 20%) to cover the extra payment charges. It goes on the bill when a parent chooses the plan.</w:t>
+        <w:t xml:space="preserve">The plan charge starts at WardPay’s standard (₦300 for each payment plus ₦200, so ₦1,100 for 3 payments), which covers the extra payment charges and reminders. You can charge more (a fixed amount, or a percentage up to 20%), but not less. It goes on the bill when a family goes on the plan.</w:t>
       </w:r>
     </w:p>
     <w:p>
@@ -11154,7 +11154,7 @@
           <w:sz w:val="22"/>
           <w:szCs w:val="22"/>
         </w:rPr>
-        <w:t xml:space="preserve">Go to Plans to set the set-up fee, the per-pupil fee and the fee per instalment plan (₦200 to start), and move a school to another plan.</w:t>
+        <w:t xml:space="preserve">Go to Plans to set the set-up fee, the per-pupil fee, the fee per instalment plan (₦200 to start) and the standard plan charge per payment (₦300 to start), and move a school to another plan.</w:t>
       </w:r>
     </w:p>
     <w:p>
@@ -11367,6 +11367,64 @@
                 <w:szCs w:val="21"/>
               </w:rPr>
               <w:t xml:space="preserve">Change</w:t>
+            </w:r>
+          </w:p>
+        </w:tc>
+      </w:tr>
+      <w:tr>
+        <w:tc>
+          <w:tcPr>
+            <w:tcW w:type="dxa" w:w="1900"/>
+            <w:tcBorders>
+              <w:top w:val="single" w:color="D0D7D3" w:sz="4"/>
+              <w:left w:val="single" w:color="D0D7D3" w:sz="4"/>
+              <w:bottom w:val="single" w:color="D0D7D3" w:sz="4"/>
+              <w:right w:val="single" w:color="D0D7D3" w:sz="4"/>
+            </w:tcBorders>
+            <w:tcMar>
+              <w:top w:type="dxa" w:w="80"/>
+              <w:left w:type="dxa" w:w="120"/>
+              <w:bottom w:type="dxa" w:w="80"/>
+              <w:right w:type="dxa" w:w="120"/>
+            </w:tcMar>
+          </w:tcPr>
+          <w:p>
+            <w:r>
+              <w:rPr>
+                <w:b w:val="false"/>
+                <w:bCs w:val="false"/>
+                <w:sz w:val="21"/>
+                <w:szCs w:val="21"/>
+              </w:rPr>
+              <w:t xml:space="preserve">25 Oct 2026</w:t>
+            </w:r>
+          </w:p>
+        </w:tc>
+        <w:tc>
+          <w:tcPr>
+            <w:tcW w:type="dxa" w:w="7738"/>
+            <w:tcBorders>
+              <w:top w:val="single" w:color="D0D7D3" w:sz="4"/>
+              <w:left w:val="single" w:color="D0D7D3" w:sz="4"/>
+              <w:bottom w:val="single" w:color="D0D7D3" w:sz="4"/>
+              <w:right w:val="single" w:color="D0D7D3" w:sz="4"/>
+            </w:tcBorders>
+            <w:tcMar>
+              <w:top w:type="dxa" w:w="80"/>
+              <w:left w:type="dxa" w:w="120"/>
+              <w:bottom w:type="dxa" w:w="80"/>
+              <w:right w:type="dxa" w:w="120"/>
+            </w:tcMar>
+          </w:tcPr>
+          <w:p>
+            <w:r>
+              <w:rPr>
+                <w:b w:val="false"/>
+                <w:bCs w:val="false"/>
+                <w:sz w:val="21"/>
+                <w:szCs w:val="21"/>
+              </w:rPr>
+              <w:t xml:space="preserve">WardPay’s standard plan charge (₦300 a payment + ₦200), which schools can raise but not lower.</w:t>
             </w:r>
           </w:p>
         </w:tc>

</xml_diff>

<commit_message>
Load test at 10,000 pupils, and the fixes it found: background billing runs, per-pupil queries, outbox connections
</commit_message>
<xml_diff>
--- a/docs/product/WardPay - user guide.docx
+++ b/docs/product/WardPay - user guide.docx
@@ -5750,7 +5750,7 @@
           <w:sz w:val="22"/>
           <w:szCs w:val="22"/>
         </w:rPr>
-        <w:t xml:space="preserve">Press Preview to see the total per class, then Generate … invoices.</w:t>
+        <w:t xml:space="preserve">Press Preview to see the total per class, then Generate … invoices. For a big school the bills take up to a minute; the button says Making the bills… and the result appears by itself.</w:t>
       </w:r>
     </w:p>
     <w:p>
@@ -11367,6 +11367,64 @@
                 <w:szCs w:val="21"/>
               </w:rPr>
               <w:t xml:space="preserve">Change</w:t>
+            </w:r>
+          </w:p>
+        </w:tc>
+      </w:tr>
+      <w:tr>
+        <w:tc>
+          <w:tcPr>
+            <w:tcW w:type="dxa" w:w="1900"/>
+            <w:tcBorders>
+              <w:top w:val="single" w:color="D0D7D3" w:sz="4"/>
+              <w:left w:val="single" w:color="D0D7D3" w:sz="4"/>
+              <w:bottom w:val="single" w:color="D0D7D3" w:sz="4"/>
+              <w:right w:val="single" w:color="D0D7D3" w:sz="4"/>
+            </w:tcBorders>
+            <w:tcMar>
+              <w:top w:type="dxa" w:w="80"/>
+              <w:left w:type="dxa" w:w="120"/>
+              <w:bottom w:type="dxa" w:w="80"/>
+              <w:right w:type="dxa" w:w="120"/>
+            </w:tcMar>
+          </w:tcPr>
+          <w:p>
+            <w:r>
+              <w:rPr>
+                <w:b w:val="false"/>
+                <w:bCs w:val="false"/>
+                <w:sz w:val="21"/>
+                <w:szCs w:val="21"/>
+              </w:rPr>
+              <w:t xml:space="preserve">26 Oct 2026</w:t>
+            </w:r>
+          </w:p>
+        </w:tc>
+        <w:tc>
+          <w:tcPr>
+            <w:tcW w:type="dxa" w:w="7738"/>
+            <w:tcBorders>
+              <w:top w:val="single" w:color="D0D7D3" w:sz="4"/>
+              <w:left w:val="single" w:color="D0D7D3" w:sz="4"/>
+              <w:bottom w:val="single" w:color="D0D7D3" w:sz="4"/>
+              <w:right w:val="single" w:color="D0D7D3" w:sz="4"/>
+            </w:tcBorders>
+            <w:tcMar>
+              <w:top w:type="dxa" w:w="80"/>
+              <w:left w:type="dxa" w:w="120"/>
+              <w:bottom w:type="dxa" w:w="80"/>
+              <w:right w:type="dxa" w:w="120"/>
+            </w:tcMar>
+          </w:tcPr>
+          <w:p>
+            <w:r>
+              <w:rPr>
+                <w:b w:val="false"/>
+                <w:bCs w:val="false"/>
+                <w:sz w:val="21"/>
+                <w:szCs w:val="21"/>
+              </w:rPr>
+              <w:t xml:space="preserve">Generating a big school’s bills now runs in the background and shows the result when done.</w:t>
             </w:r>
           </w:p>
         </w:tc>

</xml_diff>

<commit_message>
Schools see each WardPay bill line by line, the instalment plan fee and plans waiting for the next bill
</commit_message>
<xml_diff>
--- a/docs/product/WardPay - user guide.docx
+++ b/docs/product/WardPay - user guide.docx
@@ -10246,7 +10246,7 @@
           <w:sz w:val="22"/>
           <w:szCs w:val="22"/>
         </w:rPr>
-        <w:t xml:space="preserve">What the school pays for WardPay (a set-up fee and a fee per pupil each term), how to pay, and the bills.</w:t>
+        <w:t xml:space="preserve">What the school pays for WardPay (a set-up fee once, a fee per pupil each term, and a small fee for each family put on an instalment plan), how to pay, and the bills.</w:t>
       </w:r>
     </w:p>
     <w:p>
@@ -10278,7 +10278,41 @@
           <w:sz w:val="22"/>
           <w:szCs w:val="22"/>
         </w:rPr>
-        <w:t xml:space="preserve">Go to Setup → Subscription. Download a bill as a PDF, or press Pay by card; it shows as paid as soon as the payment clears.</w:t>
+        <w:t xml:space="preserve">Go to Setup → Subscription. The plan card shows the prices, what this term’s pupils cost, and how many instalment plans the next bill will include.</w:t>
+      </w:r>
+    </w:p>
+    <w:p>
+      <w:pPr>
+        <w:pStyle w:val="ListParagraph"/>
+        <w:numPr>
+          <w:ilvl w:val="0"/>
+          <w:numId w:val="63"/>
+        </w:numPr>
+        <w:spacing w:after="60"/>
+      </w:pPr>
+      <w:r>
+        <w:rPr>
+          <w:sz w:val="22"/>
+          <w:szCs w:val="22"/>
+        </w:rPr>
+        <w:t xml:space="preserve">Under each bill, press What it’s for to see it line by line (set-up fee, pupils × price, instalment plans × fee, any discount).</w:t>
+      </w:r>
+    </w:p>
+    <w:p>
+      <w:pPr>
+        <w:pStyle w:val="ListParagraph"/>
+        <w:numPr>
+          <w:ilvl w:val="0"/>
+          <w:numId w:val="63"/>
+        </w:numPr>
+        <w:spacing w:after="60"/>
+      </w:pPr>
+      <w:r>
+        <w:rPr>
+          <w:sz w:val="22"/>
+          <w:szCs w:val="22"/>
+        </w:rPr>
+        <w:t xml:space="preserve">Download a bill as a PDF, or press Pay by card; it shows as paid as soon as the payment clears.</w:t>
       </w:r>
     </w:p>
     <w:p>
@@ -11367,6 +11401,64 @@
                 <w:szCs w:val="21"/>
               </w:rPr>
               <w:t xml:space="preserve">Change</w:t>
+            </w:r>
+          </w:p>
+        </w:tc>
+      </w:tr>
+      <w:tr>
+        <w:tc>
+          <w:tcPr>
+            <w:tcW w:type="dxa" w:w="1900"/>
+            <w:tcBorders>
+              <w:top w:val="single" w:color="D0D7D3" w:sz="4"/>
+              <w:left w:val="single" w:color="D0D7D3" w:sz="4"/>
+              <w:bottom w:val="single" w:color="D0D7D3" w:sz="4"/>
+              <w:right w:val="single" w:color="D0D7D3" w:sz="4"/>
+            </w:tcBorders>
+            <w:tcMar>
+              <w:top w:type="dxa" w:w="80"/>
+              <w:left w:type="dxa" w:w="120"/>
+              <w:bottom w:type="dxa" w:w="80"/>
+              <w:right w:type="dxa" w:w="120"/>
+            </w:tcMar>
+          </w:tcPr>
+          <w:p>
+            <w:r>
+              <w:rPr>
+                <w:b w:val="false"/>
+                <w:bCs w:val="false"/>
+                <w:sz w:val="21"/>
+                <w:szCs w:val="21"/>
+              </w:rPr>
+              <w:t xml:space="preserve">26 Oct 2026</w:t>
+            </w:r>
+          </w:p>
+        </w:tc>
+        <w:tc>
+          <w:tcPr>
+            <w:tcW w:type="dxa" w:w="7738"/>
+            <w:tcBorders>
+              <w:top w:val="single" w:color="D0D7D3" w:sz="4"/>
+              <w:left w:val="single" w:color="D0D7D3" w:sz="4"/>
+              <w:bottom w:val="single" w:color="D0D7D3" w:sz="4"/>
+              <w:right w:val="single" w:color="D0D7D3" w:sz="4"/>
+            </w:tcBorders>
+            <w:tcMar>
+              <w:top w:type="dxa" w:w="80"/>
+              <w:left w:type="dxa" w:w="120"/>
+              <w:bottom w:type="dxa" w:w="80"/>
+              <w:right w:type="dxa" w:w="120"/>
+            </w:tcMar>
+          </w:tcPr>
+          <w:p>
+            <w:r>
+              <w:rPr>
+                <w:b w:val="false"/>
+                <w:bCs w:val="false"/>
+                <w:sz w:val="21"/>
+                <w:szCs w:val="21"/>
+              </w:rPr>
+              <w:t xml:space="preserve">Subscription: each WardPay bill line by line, the instalment plan fee, and plans waiting for the next bill.</w:t>
             </w:r>
           </w:p>
         </w:tc>

</xml_diff>

<commit_message>
School groups: head-office owner and central bursar sign in once and switch between branches
A group sits above several schools (branches), each still its own tenant. Head-office
staff belong to the group, start in its first branch, switch with POST /auth/branch and
act there as that branch's proprietor or bursar; without a usable branch their session
has no tenant scope. The platform admin creates groups, adds and removes branches and
invites, deactivates and helps head-office staff. Console branch menu and chooser,
platform School groups pages, docs and Word guides.
</commit_message>
<xml_diff>
--- a/docs/product/WardPay - user guide.docx
+++ b/docs/product/WardPay - user guide.docx
@@ -1916,7 +1916,7 @@
           </w:pPr>
           <w:hyperlink w:history="1" w:anchor="_Toc81">
             <w:r>
-              <w:t xml:space="preserve">Subscription billing and plans</w:t>
+              <w:t xml:space="preserve">School groups (several branches, one owner)</w:t>
             </w:r>
             <w:r>
               <w:tab/>
@@ -1939,7 +1939,7 @@
           </w:pPr>
           <w:hyperlink w:history="1" w:anchor="_Toc82">
             <w:r>
-              <w:t xml:space="preserve">Problems, providers and support lookup</w:t>
+              <w:t xml:space="preserve">Subscription billing and plans</w:t>
             </w:r>
             <w:r>
               <w:tab/>
@@ -1947,6 +1947,29 @@
             <w:r>
               <w:fldChar w:fldCharType="begin" w:dirty="true"/>
               <w:instrText xml:space="preserve">PAGEREF _Toc82 \h</w:instrText>
+              <w:fldChar w:fldCharType="separate"/>
+              <w:fldChar w:fldCharType="end"/>
+            </w:r>
+          </w:hyperlink>
+        </w:p>
+        <w:p>
+          <w:pPr>
+            <w:pStyle w:val="TOC2"/>
+            <w:tabs>
+              <w:tab w:val="right" w:pos="9638" w:leader="dot"/>
+            </w:tabs>
+            <w:ind w:left="220"/>
+          </w:pPr>
+          <w:hyperlink w:history="1" w:anchor="_Toc83">
+            <w:r>
+              <w:t xml:space="preserve">Problems, providers and support lookup</w:t>
+            </w:r>
+            <w:r>
+              <w:tab/>
+            </w:r>
+            <w:r>
+              <w:fldChar w:fldCharType="begin" w:dirty="true"/>
+              <w:instrText xml:space="preserve">PAGEREF _Toc83 \h</w:instrText>
               <w:fldChar w:fldCharType="separate"/>
               <w:fldChar w:fldCharType="end"/>
             </w:r>
@@ -1959,7 +1982,7 @@
               <w:tab w:val="right" w:pos="9638" w:leader="dot"/>
             </w:tabs>
           </w:pPr>
-          <w:hyperlink w:history="1" w:anchor="_Toc83">
+          <w:hyperlink w:history="1" w:anchor="_Toc84">
             <w:r>
               <w:t xml:space="preserve">What changed in this guide</w:t>
             </w:r>
@@ -1968,7 +1991,7 @@
             </w:r>
             <w:r>
               <w:fldChar w:fldCharType="begin" w:dirty="true"/>
-              <w:instrText xml:space="preserve">PAGEREF _Toc83 \h</w:instrText>
+              <w:instrText xml:space="preserve">PAGEREF _Toc84 \h</w:instrText>
               <w:fldChar w:fldCharType="separate"/>
               <w:fldChar w:fldCharType="end"/>
             </w:r>
@@ -2303,7 +2326,7 @@
                 <w:sz w:val="21"/>
                 <w:szCs w:val="21"/>
               </w:rPr>
-              <w:t xml:space="preserve">Parent</w:t>
+              <w:t xml:space="preserve">Head office (school groups)</w:t>
             </w:r>
           </w:p>
         </w:tc>
@@ -2331,7 +2354,7 @@
                 <w:sz w:val="21"/>
                 <w:szCs w:val="21"/>
               </w:rPr>
-              <w:t xml:space="preserve">Their own children only: balances, paying, receipts, their messages and their data.</w:t>
+              <w:t xml:space="preserve">For an owner with several branches: the owner works in every branch as its proprietor, a central bursar as its bursar, one branch at a time.</w:t>
             </w:r>
           </w:p>
         </w:tc>
@@ -2361,7 +2384,7 @@
                 <w:sz w:val="21"/>
                 <w:szCs w:val="21"/>
               </w:rPr>
-              <w:t xml:space="preserve">WardPay team (platform admin)</w:t>
+              <w:t xml:space="preserve">Parent</w:t>
             </w:r>
           </w:p>
         </w:tc>
@@ -2389,6 +2412,64 @@
                 <w:sz w:val="21"/>
                 <w:szCs w:val="21"/>
               </w:rPr>
+              <w:t xml:space="preserve">Their own children only: balances, paying, receipts, their messages and their data.</w:t>
+            </w:r>
+          </w:p>
+        </w:tc>
+      </w:tr>
+      <w:tr>
+        <w:tc>
+          <w:tcPr>
+            <w:tcW w:type="dxa" w:w="2600"/>
+            <w:tcBorders>
+              <w:top w:val="single" w:color="D0D7D3" w:sz="4"/>
+              <w:left w:val="single" w:color="D0D7D3" w:sz="4"/>
+              <w:bottom w:val="single" w:color="D0D7D3" w:sz="4"/>
+              <w:right w:val="single" w:color="D0D7D3" w:sz="4"/>
+            </w:tcBorders>
+            <w:tcMar>
+              <w:top w:type="dxa" w:w="80"/>
+              <w:left w:type="dxa" w:w="120"/>
+              <w:bottom w:type="dxa" w:w="80"/>
+              <w:right w:type="dxa" w:w="120"/>
+            </w:tcMar>
+          </w:tcPr>
+          <w:p>
+            <w:r>
+              <w:rPr>
+                <w:b w:val="false"/>
+                <w:bCs w:val="false"/>
+                <w:sz w:val="21"/>
+                <w:szCs w:val="21"/>
+              </w:rPr>
+              <w:t xml:space="preserve">WardPay team (platform admin)</w:t>
+            </w:r>
+          </w:p>
+        </w:tc>
+        <w:tc>
+          <w:tcPr>
+            <w:tcW w:type="dxa" w:w="7038"/>
+            <w:tcBorders>
+              <w:top w:val="single" w:color="D0D7D3" w:sz="4"/>
+              <w:left w:val="single" w:color="D0D7D3" w:sz="4"/>
+              <w:bottom w:val="single" w:color="D0D7D3" w:sz="4"/>
+              <w:right w:val="single" w:color="D0D7D3" w:sz="4"/>
+            </w:tcBorders>
+            <w:tcMar>
+              <w:top w:type="dxa" w:w="80"/>
+              <w:left w:type="dxa" w:w="120"/>
+              <w:bottom w:type="dxa" w:w="80"/>
+              <w:right w:type="dxa" w:w="120"/>
+            </w:tcMar>
+          </w:tcPr>
+          <w:p>
+            <w:r>
+              <w:rPr>
+                <w:b w:val="false"/>
+                <w:bCs w:val="false"/>
+                <w:sz w:val="21"/>
+                <w:szCs w:val="21"/>
+              </w:rPr>
               <w:t xml:space="preserve">Runs the service for every school: schools, subscription bills, prices, providers and support. Never sees children’s details.</w:t>
             </w:r>
           </w:p>
@@ -11077,7 +11158,7 @@
       </w:pPr>
       <w:bookmarkStart w:name="_Toc81" w:id="81"/>
       <w:r>
-        <w:t xml:space="preserve">Subscription billing and plans</w:t>
+        <w:t xml:space="preserve">School groups (several branches, one owner)</w:t>
       </w:r>
       <w:bookmarkEnd w:id="81"/>
     </w:p>
@@ -11100,7 +11181,7 @@
           <w:sz w:val="22"/>
           <w:szCs w:val="22"/>
         </w:rPr>
-        <w:t xml:space="preserve">Platform admin</w:t>
+        <w:t xml:space="preserve">Platform admin; then the owner and central bursar</w:t>
       </w:r>
     </w:p>
     <w:p>
@@ -11122,7 +11203,7 @@
           <w:sz w:val="22"/>
           <w:szCs w:val="22"/>
         </w:rPr>
-        <w:t xml:space="preserve">Bill every school for the term, record payments, and set prices.</w:t>
+        <w:t xml:space="preserve">Lets an owner with several branches or campuses sign in once and work in any branch. Each branch stays its own school: its own pupils, bills, receipt numbers, bank account and WardPay bill. Branch staff still see only their own branch.</w:t>
       </w:r>
     </w:p>
     <w:p>
@@ -11154,7 +11235,7 @@
           <w:sz w:val="22"/>
           <w:szCs w:val="22"/>
         </w:rPr>
-        <w:t xml:space="preserve">Go to Billing and press Bill this term; Preview, then Send … bills. A school is never billed twice for a term.</w:t>
+        <w:t xml:space="preserve">Platform console: go to School groups, type the group’s name and press Add group.</w:t>
       </w:r>
     </w:p>
     <w:p>
@@ -11171,7 +11252,7 @@
           <w:sz w:val="22"/>
           <w:szCs w:val="22"/>
         </w:rPr>
-        <w:t xml:space="preserve">On a bill: Record payment (a bank transfer), Adjust (waive the set-up fee or give a discount), Change due date, Void, or Download PDF.</w:t>
+        <w:t xml:space="preserve">On the group’s page, type a school’s name under Add a school and press Add as a branch. Do this for each branch.</w:t>
       </w:r>
     </w:p>
     <w:p>
@@ -11188,7 +11269,73 @@
           <w:sz w:val="22"/>
           <w:szCs w:val="22"/>
         </w:rPr>
-        <w:t xml:space="preserve">Go to Plans to set the set-up fee, the per-pupil fee, the fee per instalment plan (₦200 to start) and the standard plan charge per payment (₦300 to start), and move a school to another plan.</w:t>
+        <w:t xml:space="preserve">Under Head office, fill in the owner’s name and email, choose Owner or Central bursar and press Send invite. They choose a password from the email and turn on two-factor sign-in.</w:t>
+      </w:r>
+    </w:p>
+    <w:p>
+      <w:pPr>
+        <w:pStyle w:val="ListParagraph"/>
+        <w:numPr>
+          <w:ilvl w:val="0"/>
+          <w:numId w:val="70"/>
+        </w:numPr>
+        <w:spacing w:after="60"/>
+      </w:pPr>
+      <w:r>
+        <w:rPr>
+          <w:sz w:val="22"/>
+          <w:szCs w:val="22"/>
+        </w:rPr>
+        <w:t xml:space="preserve">Head office: after signing in, pick the branch from the Branch menu under the logo. Everything on screen is then that branch; pick another branch to switch.</w:t>
+      </w:r>
+    </w:p>
+    <w:p>
+      <w:pPr>
+        <w:pStyle w:val="ListParagraph"/>
+        <w:numPr>
+          <w:ilvl w:val="0"/>
+          <w:numId w:val="70"/>
+        </w:numPr>
+        <w:spacing w:after="60"/>
+      </w:pPr>
+      <w:r>
+        <w:rPr>
+          <w:sz w:val="22"/>
+          <w:szCs w:val="22"/>
+        </w:rPr>
+        <w:t xml:space="preserve">To take a branch out press Take out; to stop someone press Deactivate. Either takes effect at once.</w:t>
+      </w:r>
+    </w:p>
+    <w:p>
+      <w:pPr>
+        <w:spacing w:after="60" w:before="80"/>
+      </w:pPr>
+      <w:r>
+        <w:rPr>
+          <w:b/>
+          <w:bCs/>
+          <w:color w:val="0F5132"/>
+          <w:sz w:val="22"/>
+          <w:szCs w:val="22"/>
+        </w:rPr>
+        <w:t xml:space="preserve">Good to know</w:t>
+      </w:r>
+    </w:p>
+    <w:p>
+      <w:pPr>
+        <w:pStyle w:val="ListParagraph"/>
+        <w:numPr>
+          <w:ilvl w:val="0"/>
+          <w:numId w:val="3"/>
+        </w:numPr>
+        <w:spacing w:after="60"/>
+      </w:pPr>
+      <w:r>
+        <w:rPr>
+          <w:sz w:val="22"/>
+          <w:szCs w:val="22"/>
+        </w:rPr>
+        <w:t xml:space="preserve">Combined figures for all branches, and parents with children in several branches, are coming next.</w:t>
       </w:r>
     </w:p>
     <w:p>
@@ -11198,9 +11345,130 @@
       </w:pPr>
       <w:bookmarkStart w:name="_Toc82" w:id="82"/>
       <w:r>
+        <w:t xml:space="preserve">Subscription billing and plans</w:t>
+      </w:r>
+      <w:bookmarkEnd w:id="82"/>
+    </w:p>
+    <w:p>
+      <w:pPr>
+        <w:spacing w:after="100"/>
+      </w:pPr>
+      <w:r>
+        <w:rPr>
+          <w:b/>
+          <w:bCs/>
+          <w:color w:val="0F5132"/>
+          <w:sz w:val="22"/>
+          <w:szCs w:val="22"/>
+        </w:rPr>
+        <w:t xml:space="preserve">Who: </w:t>
+      </w:r>
+      <w:r>
+        <w:rPr>
+          <w:sz w:val="22"/>
+          <w:szCs w:val="22"/>
+        </w:rPr>
+        <w:t xml:space="preserve">Platform admin</w:t>
+      </w:r>
+    </w:p>
+    <w:p>
+      <w:pPr>
+        <w:spacing w:after="100"/>
+      </w:pPr>
+      <w:r>
+        <w:rPr>
+          <w:b/>
+          <w:bCs/>
+          <w:color w:val="0F5132"/>
+          <w:sz w:val="22"/>
+          <w:szCs w:val="22"/>
+        </w:rPr>
+        <w:t xml:space="preserve">What it’s for: </w:t>
+      </w:r>
+      <w:r>
+        <w:rPr>
+          <w:sz w:val="22"/>
+          <w:szCs w:val="22"/>
+        </w:rPr>
+        <w:t xml:space="preserve">Bill every school for the term, record payments, and set prices.</w:t>
+      </w:r>
+    </w:p>
+    <w:p>
+      <w:pPr>
+        <w:spacing w:after="60" w:before="80"/>
+      </w:pPr>
+      <w:r>
+        <w:rPr>
+          <w:b/>
+          <w:bCs/>
+          <w:color w:val="0F5132"/>
+          <w:sz w:val="22"/>
+          <w:szCs w:val="22"/>
+        </w:rPr>
+        <w:t xml:space="preserve">How to use it</w:t>
+      </w:r>
+    </w:p>
+    <w:p>
+      <w:pPr>
+        <w:pStyle w:val="ListParagraph"/>
+        <w:numPr>
+          <w:ilvl w:val="0"/>
+          <w:numId w:val="71"/>
+        </w:numPr>
+        <w:spacing w:after="60"/>
+      </w:pPr>
+      <w:r>
+        <w:rPr>
+          <w:sz w:val="22"/>
+          <w:szCs w:val="22"/>
+        </w:rPr>
+        <w:t xml:space="preserve">Go to Billing and press Bill this term; Preview, then Send … bills. A school is never billed twice for a term.</w:t>
+      </w:r>
+    </w:p>
+    <w:p>
+      <w:pPr>
+        <w:pStyle w:val="ListParagraph"/>
+        <w:numPr>
+          <w:ilvl w:val="0"/>
+          <w:numId w:val="71"/>
+        </w:numPr>
+        <w:spacing w:after="60"/>
+      </w:pPr>
+      <w:r>
+        <w:rPr>
+          <w:sz w:val="22"/>
+          <w:szCs w:val="22"/>
+        </w:rPr>
+        <w:t xml:space="preserve">On a bill: Record payment (a bank transfer), Adjust (waive the set-up fee or give a discount), Change due date, Void, or Download PDF.</w:t>
+      </w:r>
+    </w:p>
+    <w:p>
+      <w:pPr>
+        <w:pStyle w:val="ListParagraph"/>
+        <w:numPr>
+          <w:ilvl w:val="0"/>
+          <w:numId w:val="71"/>
+        </w:numPr>
+        <w:spacing w:after="60"/>
+      </w:pPr>
+      <w:r>
+        <w:rPr>
+          <w:sz w:val="22"/>
+          <w:szCs w:val="22"/>
+        </w:rPr>
+        <w:t xml:space="preserve">Go to Plans to set the set-up fee, the per-pupil fee, the fee per instalment plan (₦200 to start) and the standard plan charge per payment (₦300 to start), and move a school to another plan.</w:t>
+      </w:r>
+    </w:p>
+    <w:p>
+      <w:pPr>
+        <w:pStyle w:val="Heading2"/>
+        <w:spacing w:after="100" w:before="280"/>
+      </w:pPr>
+      <w:bookmarkStart w:name="_Toc83" w:id="83"/>
+      <w:r>
         <w:t xml:space="preserve">Problems, providers and support lookup</w:t>
       </w:r>
-      <w:bookmarkEnd w:id="82"/>
+      <w:bookmarkEnd w:id="83"/>
     </w:p>
     <w:p>
       <w:pPr>
@@ -11266,7 +11534,7 @@
         <w:pStyle w:val="ListParagraph"/>
         <w:numPr>
           <w:ilvl w:val="0"/>
-          <w:numId w:val="71"/>
+          <w:numId w:val="72"/>
         </w:numPr>
         <w:spacing w:after="60"/>
       </w:pPr>
@@ -11283,7 +11551,7 @@
         <w:pStyle w:val="ListParagraph"/>
         <w:numPr>
           <w:ilvl w:val="0"/>
-          <w:numId w:val="71"/>
+          <w:numId w:val="72"/>
         </w:numPr>
         <w:spacing w:after="60"/>
       </w:pPr>
@@ -11300,7 +11568,7 @@
         <w:pStyle w:val="ListParagraph"/>
         <w:numPr>
           <w:ilvl w:val="0"/>
-          <w:numId w:val="71"/>
+          <w:numId w:val="72"/>
         </w:numPr>
         <w:spacing w:after="60"/>
       </w:pPr>
@@ -11318,11 +11586,11 @@
         <w:pageBreakBefore/>
         <w:spacing w:after="160"/>
       </w:pPr>
-      <w:bookmarkStart w:name="_Toc83" w:id="83"/>
+      <w:bookmarkStart w:name="_Toc84" w:id="84"/>
       <w:r>
         <w:t xml:space="preserve">What changed in this guide</w:t>
       </w:r>
-      <w:bookmarkEnd w:id="83"/>
+      <w:bookmarkEnd w:id="84"/>
     </w:p>
     <w:tbl>
       <w:tblPr>
@@ -11401,6 +11669,64 @@
                 <w:szCs w:val="21"/>
               </w:rPr>
               <w:t xml:space="preserve">Change</w:t>
+            </w:r>
+          </w:p>
+        </w:tc>
+      </w:tr>
+      <w:tr>
+        <w:tc>
+          <w:tcPr>
+            <w:tcW w:type="dxa" w:w="1900"/>
+            <w:tcBorders>
+              <w:top w:val="single" w:color="D0D7D3" w:sz="4"/>
+              <w:left w:val="single" w:color="D0D7D3" w:sz="4"/>
+              <w:bottom w:val="single" w:color="D0D7D3" w:sz="4"/>
+              <w:right w:val="single" w:color="D0D7D3" w:sz="4"/>
+            </w:tcBorders>
+            <w:tcMar>
+              <w:top w:type="dxa" w:w="80"/>
+              <w:left w:type="dxa" w:w="120"/>
+              <w:bottom w:type="dxa" w:w="80"/>
+              <w:right w:type="dxa" w:w="120"/>
+            </w:tcMar>
+          </w:tcPr>
+          <w:p>
+            <w:r>
+              <w:rPr>
+                <w:b w:val="false"/>
+                <w:bCs w:val="false"/>
+                <w:sz w:val="21"/>
+                <w:szCs w:val="21"/>
+              </w:rPr>
+              <w:t xml:space="preserve">27 Oct 2026</w:t>
+            </w:r>
+          </w:p>
+        </w:tc>
+        <w:tc>
+          <w:tcPr>
+            <w:tcW w:type="dxa" w:w="7738"/>
+            <w:tcBorders>
+              <w:top w:val="single" w:color="D0D7D3" w:sz="4"/>
+              <w:left w:val="single" w:color="D0D7D3" w:sz="4"/>
+              <w:bottom w:val="single" w:color="D0D7D3" w:sz="4"/>
+              <w:right w:val="single" w:color="D0D7D3" w:sz="4"/>
+            </w:tcBorders>
+            <w:tcMar>
+              <w:top w:type="dxa" w:w="80"/>
+              <w:left w:type="dxa" w:w="120"/>
+              <w:bottom w:type="dxa" w:w="80"/>
+              <w:right w:type="dxa" w:w="120"/>
+            </w:tcMar>
+          </w:tcPr>
+          <w:p>
+            <w:r>
+              <w:rPr>
+                <w:b w:val="false"/>
+                <w:bCs w:val="false"/>
+                <w:sz w:val="21"/>
+                <w:szCs w:val="21"/>
+              </w:rPr>
+              <w:t xml:space="preserve">School groups: an owner with several branches signs in once and switches branch from a menu; set up by the WardPay team.</w:t>
             </w:r>
           </w:p>
         </w:tc>
@@ -12497,6 +12823,12 @@
     </w:lvlOverride>
   </w:num>
   <w:num w:numId="71">
+    <w:abstractNumId w:val="3"/>
+    <w:lvlOverride w:ilvl="0">
+      <w:startOverride w:val="1"/>
+    </w:lvlOverride>
+  </w:num>
+  <w:num w:numId="72">
     <w:abstractNumId w:val="3"/>
     <w:lvlOverride w:ilvl="0">
       <w:startOverride w:val="1"/>

</xml_diff>

<commit_message>
All branches: head office sees every branch's money side by side with the group's totals
GET /reports/group (and an Excel download) gives the owner and central bursar each
branch's current-term bills, collected, owed, credit, money received and cash awaiting
approval, plus the group's totals and 30-day takings. Figures only. A dedicated
dependency reads across the group's active branches with every query filtered to them,
one query per figure whatever the number of branches. Console All branches page with
a jump into each branch; docs and Word guides updated.
</commit_message>
<xml_diff>
--- a/docs/product/WardPay - user guide.docx
+++ b/docs/product/WardPay - user guide.docx
@@ -11308,6 +11308,23 @@
     </w:p>
     <w:p>
       <w:pPr>
+        <w:pStyle w:val="ListParagraph"/>
+        <w:numPr>
+          <w:ilvl w:val="0"/>
+          <w:numId w:val="70"/>
+        </w:numPr>
+        <w:spacing w:after="60"/>
+      </w:pPr>
+      <w:r>
+        <w:rPr>
+          <w:sz w:val="22"/>
+          <w:szCs w:val="22"/>
+        </w:rPr>
+        <w:t xml:space="preserve">Head office: press All branches in the menu to see every branch’s money side by side with the group’s totals. Press Download Excel for a copy, or Work in this branch to open one.</w:t>
+      </w:r>
+    </w:p>
+    <w:p>
+      <w:pPr>
         <w:spacing w:after="60" w:before="80"/>
       </w:pPr>
       <w:r>
@@ -11335,7 +11352,7 @@
           <w:sz w:val="22"/>
           <w:szCs w:val="22"/>
         </w:rPr>
-        <w:t xml:space="preserve">Combined figures for all branches, and parents with children in several branches, are coming next.</w:t>
+        <w:t xml:space="preserve">All branches shows money only, never pupils’ or parents’ details. Parents with children in several branches are coming next.</w:t>
       </w:r>
     </w:p>
     <w:p>
@@ -11669,6 +11686,64 @@
                 <w:szCs w:val="21"/>
               </w:rPr>
               <w:t xml:space="preserve">Change</w:t>
+            </w:r>
+          </w:p>
+        </w:tc>
+      </w:tr>
+      <w:tr>
+        <w:tc>
+          <w:tcPr>
+            <w:tcW w:type="dxa" w:w="1900"/>
+            <w:tcBorders>
+              <w:top w:val="single" w:color="D0D7D3" w:sz="4"/>
+              <w:left w:val="single" w:color="D0D7D3" w:sz="4"/>
+              <w:bottom w:val="single" w:color="D0D7D3" w:sz="4"/>
+              <w:right w:val="single" w:color="D0D7D3" w:sz="4"/>
+            </w:tcBorders>
+            <w:tcMar>
+              <w:top w:type="dxa" w:w="80"/>
+              <w:left w:type="dxa" w:w="120"/>
+              <w:bottom w:type="dxa" w:w="80"/>
+              <w:right w:type="dxa" w:w="120"/>
+            </w:tcMar>
+          </w:tcPr>
+          <w:p>
+            <w:r>
+              <w:rPr>
+                <w:b w:val="false"/>
+                <w:bCs w:val="false"/>
+                <w:sz w:val="21"/>
+                <w:szCs w:val="21"/>
+              </w:rPr>
+              <w:t xml:space="preserve">27 Oct 2026</w:t>
+            </w:r>
+          </w:p>
+        </w:tc>
+        <w:tc>
+          <w:tcPr>
+            <w:tcW w:type="dxa" w:w="7738"/>
+            <w:tcBorders>
+              <w:top w:val="single" w:color="D0D7D3" w:sz="4"/>
+              <w:left w:val="single" w:color="D0D7D3" w:sz="4"/>
+              <w:bottom w:val="single" w:color="D0D7D3" w:sz="4"/>
+              <w:right w:val="single" w:color="D0D7D3" w:sz="4"/>
+            </w:tcBorders>
+            <w:tcMar>
+              <w:top w:type="dxa" w:w="80"/>
+              <w:left w:type="dxa" w:w="120"/>
+              <w:bottom w:type="dxa" w:w="80"/>
+              <w:right w:type="dxa" w:w="120"/>
+            </w:tcMar>
+          </w:tcPr>
+          <w:p>
+            <w:r>
+              <w:rPr>
+                <w:b w:val="false"/>
+                <w:bCs w:val="false"/>
+                <w:sz w:val="21"/>
+                <w:szCs w:val="21"/>
+              </w:rPr>
+              <w:t xml:space="preserve">All branches: head office sees every branch’s money side by side, with totals and an Excel download.</w:t>
             </w:r>
           </w:p>
         </w:tc>

</xml_diff>

<commit_message>
Parents with children at several branches of a school group sign in once and switch branch
When all of a parent's schools are branches of one group they're signed straight in.
The home page lists their children at the group's other branches with what's owed, and
switching moves the session to their own record at that branch without a new code (the
old access token stops working, the switch is audited). Paying stays per branch, so it
works whether branches share a bank account or not. Docs and Word guides updated.
</commit_message>
<xml_diff>
--- a/docs/product/WardPay - user guide.docx
+++ b/docs/product/WardPay - user guide.docx
@@ -10674,7 +10674,7 @@
           <w:sz w:val="22"/>
           <w:szCs w:val="22"/>
         </w:rPr>
-        <w:t xml:space="preserve">If you have children at more than one school, choose the school.</w:t>
+        <w:t xml:space="preserve">If you have children at more than one school, choose the school. If they are all branches of one group there is nothing to choose: other branches appear under At other branches, with what is owed there; press Open … to see and pay for those children.</w:t>
       </w:r>
     </w:p>
     <w:p>
@@ -11686,6 +11686,64 @@
                 <w:szCs w:val="21"/>
               </w:rPr>
               <w:t xml:space="preserve">Change</w:t>
+            </w:r>
+          </w:p>
+        </w:tc>
+      </w:tr>
+      <w:tr>
+        <w:tc>
+          <w:tcPr>
+            <w:tcW w:type="dxa" w:w="1900"/>
+            <w:tcBorders>
+              <w:top w:val="single" w:color="D0D7D3" w:sz="4"/>
+              <w:left w:val="single" w:color="D0D7D3" w:sz="4"/>
+              <w:bottom w:val="single" w:color="D0D7D3" w:sz="4"/>
+              <w:right w:val="single" w:color="D0D7D3" w:sz="4"/>
+            </w:tcBorders>
+            <w:tcMar>
+              <w:top w:type="dxa" w:w="80"/>
+              <w:left w:type="dxa" w:w="120"/>
+              <w:bottom w:type="dxa" w:w="80"/>
+              <w:right w:type="dxa" w:w="120"/>
+            </w:tcMar>
+          </w:tcPr>
+          <w:p>
+            <w:r>
+              <w:rPr>
+                <w:b w:val="false"/>
+                <w:bCs w:val="false"/>
+                <w:sz w:val="21"/>
+                <w:szCs w:val="21"/>
+              </w:rPr>
+              <w:t xml:space="preserve">27 Oct 2026</w:t>
+            </w:r>
+          </w:p>
+        </w:tc>
+        <w:tc>
+          <w:tcPr>
+            <w:tcW w:type="dxa" w:w="7738"/>
+            <w:tcBorders>
+              <w:top w:val="single" w:color="D0D7D3" w:sz="4"/>
+              <w:left w:val="single" w:color="D0D7D3" w:sz="4"/>
+              <w:bottom w:val="single" w:color="D0D7D3" w:sz="4"/>
+              <w:right w:val="single" w:color="D0D7D3" w:sz="4"/>
+            </w:tcBorders>
+            <w:tcMar>
+              <w:top w:type="dxa" w:w="80"/>
+              <w:left w:type="dxa" w:w="120"/>
+              <w:bottom w:type="dxa" w:w="80"/>
+              <w:right w:type="dxa" w:w="120"/>
+            </w:tcMar>
+          </w:tcPr>
+          <w:p>
+            <w:r>
+              <w:rPr>
+                <w:b w:val="false"/>
+                <w:bCs w:val="false"/>
+                <w:sz w:val="21"/>
+                <w:szCs w:val="21"/>
+              </w:rPr>
+              <w:t xml:space="preserve">Parents with children at several branches of a group sign in once and open each branch from their home page.</w:t>
             </w:r>
           </w:p>
         </w:tc>

</xml_diff>

<commit_message>
Each school chooses who pays the charge on online payments: the school, or the parent on top
Payment settings gains 'Charges on online payments' (proprietor, audited): the school
bears Paystack's checkout charge (default) or parents pay it on top, grossed up so the
school receives the fees in full. The payment intent keeps fees and charge apart, a
checkout is recorded only for exactly that total, and bills are credited with the fees
only. Parents see the charge on the pay button and a note pointing to the cheaper
transfer into the child's account number; staff payment links show it too. Docs, Word
guides and owner to-do updated.
</commit_message>
<xml_diff>
--- a/docs/product/WardPay - user guide.docx
+++ b/docs/product/WardPay - user guide.docx
@@ -492,37 +492,37 @@
         </w:p>
         <w:p>
           <w:pPr>
-            <w:pStyle w:val="TOC1"/>
-            <w:tabs>
-              <w:tab w:val="right" w:pos="9638" w:leader="dot"/>
-            </w:tabs>
-          </w:pPr>
-          <w:hyperlink w:history="1" w:anchor="_Toc19">
-            <w:r>
-              <w:t xml:space="preserve">Pupils and parents</w:t>
-            </w:r>
-            <w:r>
-              <w:tab/>
-            </w:r>
-            <w:r>
-              <w:fldChar w:fldCharType="begin" w:dirty="true"/>
-              <w:instrText xml:space="preserve">PAGEREF _Toc19 \h</w:instrText>
-              <w:fldChar w:fldCharType="separate"/>
-              <w:fldChar w:fldCharType="end"/>
-            </w:r>
-          </w:hyperlink>
-        </w:p>
-        <w:p>
-          <w:pPr>
             <w:pStyle w:val="TOC2"/>
             <w:tabs>
               <w:tab w:val="right" w:pos="9638" w:leader="dot"/>
             </w:tabs>
             <w:ind w:left="220"/>
           </w:pPr>
+          <w:hyperlink w:history="1" w:anchor="_Toc19">
+            <w:r>
+              <w:t xml:space="preserve">Payment settings: charges on online payments</w:t>
+            </w:r>
+            <w:r>
+              <w:tab/>
+            </w:r>
+            <w:r>
+              <w:fldChar w:fldCharType="begin" w:dirty="true"/>
+              <w:instrText xml:space="preserve">PAGEREF _Toc19 \h</w:instrText>
+              <w:fldChar w:fldCharType="separate"/>
+              <w:fldChar w:fldCharType="end"/>
+            </w:r>
+          </w:hyperlink>
+        </w:p>
+        <w:p>
+          <w:pPr>
+            <w:pStyle w:val="TOC1"/>
+            <w:tabs>
+              <w:tab w:val="right" w:pos="9638" w:leader="dot"/>
+            </w:tabs>
+          </w:pPr>
           <w:hyperlink w:history="1" w:anchor="_Toc20">
             <w:r>
-              <w:t xml:space="preserve">Finding pupils</w:t>
+              <w:t xml:space="preserve">Pupils and parents</w:t>
             </w:r>
             <w:r>
               <w:tab/>
@@ -545,7 +545,7 @@
           </w:pPr>
           <w:hyperlink w:history="1" w:anchor="_Toc21">
             <w:r>
-              <w:t xml:space="preserve">Adding a pupil</w:t>
+              <w:t xml:space="preserve">Finding pupils</w:t>
             </w:r>
             <w:r>
               <w:tab/>
@@ -568,7 +568,7 @@
           </w:pPr>
           <w:hyperlink w:history="1" w:anchor="_Toc22">
             <w:r>
-              <w:t xml:space="preserve">Importing pupils from a spreadsheet</w:t>
+              <w:t xml:space="preserve">Adding a pupil</w:t>
             </w:r>
             <w:r>
               <w:tab/>
@@ -591,7 +591,7 @@
           </w:pPr>
           <w:hyperlink w:history="1" w:anchor="_Toc23">
             <w:r>
-              <w:t xml:space="preserve">The pupil’s page</w:t>
+              <w:t xml:space="preserve">Importing pupils from a spreadsheet</w:t>
             </w:r>
             <w:r>
               <w:tab/>
@@ -614,7 +614,7 @@
           </w:pPr>
           <w:hyperlink w:history="1" w:anchor="_Toc24">
             <w:r>
-              <w:t xml:space="preserve">Parents and guardians</w:t>
+              <w:t xml:space="preserve">The pupil’s page</w:t>
             </w:r>
             <w:r>
               <w:tab/>
@@ -637,7 +637,7 @@
           </w:pPr>
           <w:hyperlink w:history="1" w:anchor="_Toc25">
             <w:r>
-              <w:t xml:space="preserve">Sending one reminder now</w:t>
+              <w:t xml:space="preserve">Parents and guardians</w:t>
             </w:r>
             <w:r>
               <w:tab/>
@@ -660,7 +660,7 @@
           </w:pPr>
           <w:hyperlink w:history="1" w:anchor="_Toc26">
             <w:r>
-              <w:t xml:space="preserve">The family payment link</w:t>
+              <w:t xml:space="preserve">Sending one reminder now</w:t>
             </w:r>
             <w:r>
               <w:tab/>
@@ -683,7 +683,7 @@
           </w:pPr>
           <w:hyperlink w:history="1" w:anchor="_Toc27">
             <w:r>
-              <w:t xml:space="preserve">Pay cards</w:t>
+              <w:t xml:space="preserve">The family payment link</w:t>
             </w:r>
             <w:r>
               <w:tab/>
@@ -706,7 +706,7 @@
           </w:pPr>
           <w:hyperlink w:history="1" w:anchor="_Toc28">
             <w:r>
-              <w:t xml:space="preserve">A parent’s data: export and erase</w:t>
+              <w:t xml:space="preserve">Pay cards</w:t>
             </w:r>
             <w:r>
               <w:tab/>
@@ -714,28 +714,6 @@
             <w:r>
               <w:fldChar w:fldCharType="begin" w:dirty="true"/>
               <w:instrText xml:space="preserve">PAGEREF _Toc28 \h</w:instrText>
-              <w:fldChar w:fldCharType="separate"/>
-              <w:fldChar w:fldCharType="end"/>
-            </w:r>
-          </w:hyperlink>
-        </w:p>
-        <w:p>
-          <w:pPr>
-            <w:pStyle w:val="TOC1"/>
-            <w:tabs>
-              <w:tab w:val="right" w:pos="9638" w:leader="dot"/>
-            </w:tabs>
-          </w:pPr>
-          <w:hyperlink w:history="1" w:anchor="_Toc29">
-            <w:r>
-              <w:t xml:space="preserve">Bills</w:t>
-            </w:r>
-            <w:r>
-              <w:tab/>
-            </w:r>
-            <w:r>
-              <w:fldChar w:fldCharType="begin" w:dirty="true"/>
-              <w:instrText xml:space="preserve">PAGEREF _Toc29 \h</w:instrText>
               <w:fldChar w:fldCharType="separate"/>
               <w:fldChar w:fldCharType="end"/>
             </w:r>
@@ -749,9 +727,31 @@
             </w:tabs>
             <w:ind w:left="220"/>
           </w:pPr>
+          <w:hyperlink w:history="1" w:anchor="_Toc29">
+            <w:r>
+              <w:t xml:space="preserve">A parent’s data: export and erase</w:t>
+            </w:r>
+            <w:r>
+              <w:tab/>
+            </w:r>
+            <w:r>
+              <w:fldChar w:fldCharType="begin" w:dirty="true"/>
+              <w:instrText xml:space="preserve">PAGEREF _Toc29 \h</w:instrText>
+              <w:fldChar w:fldCharType="separate"/>
+              <w:fldChar w:fldCharType="end"/>
+            </w:r>
+          </w:hyperlink>
+        </w:p>
+        <w:p>
+          <w:pPr>
+            <w:pStyle w:val="TOC1"/>
+            <w:tabs>
+              <w:tab w:val="right" w:pos="9638" w:leader="dot"/>
+            </w:tabs>
+          </w:pPr>
           <w:hyperlink w:history="1" w:anchor="_Toc30">
             <w:r>
-              <w:t xml:space="preserve">Generating the term’s bills</w:t>
+              <w:t xml:space="preserve">Bills</w:t>
             </w:r>
             <w:r>
               <w:tab/>
@@ -774,7 +774,7 @@
           </w:pPr>
           <w:hyperlink w:history="1" w:anchor="_Toc31">
             <w:r>
-              <w:t xml:space="preserve">Adding a fee to some classes after the bills have gone out</w:t>
+              <w:t xml:space="preserve">Generating the term’s bills</w:t>
             </w:r>
             <w:r>
               <w:tab/>
@@ -797,7 +797,7 @@
           </w:pPr>
           <w:hyperlink w:history="1" w:anchor="_Toc32">
             <w:r>
-              <w:t xml:space="preserve">Exempting a pupil from a fee</w:t>
+              <w:t xml:space="preserve">Adding a fee to some classes after the bills have gone out</w:t>
             </w:r>
             <w:r>
               <w:tab/>
@@ -820,7 +820,7 @@
           </w:pPr>
           <w:hyperlink w:history="1" w:anchor="_Toc33">
             <w:r>
-              <w:t xml:space="preserve">One-off charges and opening balances</w:t>
+              <w:t xml:space="preserve">Exempting a pupil from a fee</w:t>
             </w:r>
             <w:r>
               <w:tab/>
@@ -843,7 +843,7 @@
           </w:pPr>
           <w:hyperlink w:history="1" w:anchor="_Toc34">
             <w:r>
-              <w:t xml:space="preserve">Correcting a bill, adding a charge, voiding a bill</w:t>
+              <w:t xml:space="preserve">One-off charges and opening balances</w:t>
             </w:r>
             <w:r>
               <w:tab/>
@@ -866,7 +866,7 @@
           </w:pPr>
           <w:hyperlink w:history="1" w:anchor="_Toc35">
             <w:r>
-              <w:t xml:space="preserve">Paying in instalments (payment plans)</w:t>
+              <w:t xml:space="preserve">Correcting a bill, adding a charge, voiding a bill</w:t>
             </w:r>
             <w:r>
               <w:tab/>
@@ -889,7 +889,7 @@
           </w:pPr>
           <w:hyperlink w:history="1" w:anchor="_Toc36">
             <w:r>
-              <w:t xml:space="preserve">The school’s own instalment plans</w:t>
+              <w:t xml:space="preserve">Paying in instalments (payment plans)</w:t>
             </w:r>
             <w:r>
               <w:tab/>
@@ -912,7 +912,7 @@
           </w:pPr>
           <w:hyperlink w:history="1" w:anchor="_Toc37">
             <w:r>
-              <w:t xml:space="preserve">Putting a family on a plan</w:t>
+              <w:t xml:space="preserve">The school’s own instalment plans</w:t>
             </w:r>
             <w:r>
               <w:tab/>
@@ -935,7 +935,7 @@
           </w:pPr>
           <w:hyperlink w:history="1" w:anchor="_Toc38">
             <w:r>
-              <w:t xml:space="preserve">Writing off debt</w:t>
+              <w:t xml:space="preserve">Putting a family on a plan</w:t>
             </w:r>
             <w:r>
               <w:tab/>
@@ -943,28 +943,6 @@
             <w:r>
               <w:fldChar w:fldCharType="begin" w:dirty="true"/>
               <w:instrText xml:space="preserve">PAGEREF _Toc38 \h</w:instrText>
-              <w:fldChar w:fldCharType="separate"/>
-              <w:fldChar w:fldCharType="end"/>
-            </w:r>
-          </w:hyperlink>
-        </w:p>
-        <w:p>
-          <w:pPr>
-            <w:pStyle w:val="TOC1"/>
-            <w:tabs>
-              <w:tab w:val="right" w:pos="9638" w:leader="dot"/>
-            </w:tabs>
-          </w:pPr>
-          <w:hyperlink w:history="1" w:anchor="_Toc39">
-            <w:r>
-              <w:t xml:space="preserve">Payments</w:t>
-            </w:r>
-            <w:r>
-              <w:tab/>
-            </w:r>
-            <w:r>
-              <w:fldChar w:fldCharType="begin" w:dirty="true"/>
-              <w:instrText xml:space="preserve">PAGEREF _Toc39 \h</w:instrText>
               <w:fldChar w:fldCharType="separate"/>
               <w:fldChar w:fldCharType="end"/>
             </w:r>
@@ -978,9 +956,31 @@
             </w:tabs>
             <w:ind w:left="220"/>
           </w:pPr>
+          <w:hyperlink w:history="1" w:anchor="_Toc39">
+            <w:r>
+              <w:t xml:space="preserve">Writing off debt</w:t>
+            </w:r>
+            <w:r>
+              <w:tab/>
+            </w:r>
+            <w:r>
+              <w:fldChar w:fldCharType="begin" w:dirty="true"/>
+              <w:instrText xml:space="preserve">PAGEREF _Toc39 \h</w:instrText>
+              <w:fldChar w:fldCharType="separate"/>
+              <w:fldChar w:fldCharType="end"/>
+            </w:r>
+          </w:hyperlink>
+        </w:p>
+        <w:p>
+          <w:pPr>
+            <w:pStyle w:val="TOC1"/>
+            <w:tabs>
+              <w:tab w:val="right" w:pos="9638" w:leader="dot"/>
+            </w:tabs>
+          </w:pPr>
           <w:hyperlink w:history="1" w:anchor="_Toc40">
             <w:r>
-              <w:t xml:space="preserve">How parents pay</w:t>
+              <w:t xml:space="preserve">Payments</w:t>
             </w:r>
             <w:r>
               <w:tab/>
@@ -1003,7 +1003,7 @@
           </w:pPr>
           <w:hyperlink w:history="1" w:anchor="_Toc41">
             <w:r>
-              <w:t xml:space="preserve">Seeing payments</w:t>
+              <w:t xml:space="preserve">How parents pay</w:t>
             </w:r>
             <w:r>
               <w:tab/>
@@ -1026,7 +1026,7 @@
           </w:pPr>
           <w:hyperlink w:history="1" w:anchor="_Toc42">
             <w:r>
-              <w:t xml:space="preserve">Recording cash, teller, POS or a direct transfer</w:t>
+              <w:t xml:space="preserve">Seeing payments</w:t>
             </w:r>
             <w:r>
               <w:tab/>
@@ -1049,7 +1049,7 @@
           </w:pPr>
           <w:hyperlink w:history="1" w:anchor="_Toc43">
             <w:r>
-              <w:t xml:space="preserve">Saying what a payment was for, after it arrived</w:t>
+              <w:t xml:space="preserve">Recording cash, teller, POS or a direct transfer</w:t>
             </w:r>
             <w:r>
               <w:tab/>
@@ -1072,7 +1072,7 @@
           </w:pPr>
           <w:hyperlink w:history="1" w:anchor="_Toc44">
             <w:r>
-              <w:t xml:space="preserve">Reversing a payment</w:t>
+              <w:t xml:space="preserve">Saying what a payment was for, after it arrived</w:t>
             </w:r>
             <w:r>
               <w:tab/>
@@ -1095,7 +1095,7 @@
           </w:pPr>
           <w:hyperlink w:history="1" w:anchor="_Toc45">
             <w:r>
-              <w:t xml:space="preserve">Card payment link for one pupil</w:t>
+              <w:t xml:space="preserve">Reversing a payment</w:t>
             </w:r>
             <w:r>
               <w:tab/>
@@ -1118,7 +1118,7 @@
           </w:pPr>
           <w:hyperlink w:history="1" w:anchor="_Toc46">
             <w:r>
-              <w:t xml:space="preserve">Receipts</w:t>
+              <w:t xml:space="preserve">Card payment link for one pupil</w:t>
             </w:r>
             <w:r>
               <w:tab/>
@@ -1141,7 +1141,7 @@
           </w:pPr>
           <w:hyperlink w:history="1" w:anchor="_Toc47">
             <w:r>
-              <w:t xml:space="preserve">Paid into the bank (Paystack payouts)</w:t>
+              <w:t xml:space="preserve">Receipts</w:t>
             </w:r>
             <w:r>
               <w:tab/>
@@ -1149,28 +1149,6 @@
             <w:r>
               <w:fldChar w:fldCharType="begin" w:dirty="true"/>
               <w:instrText xml:space="preserve">PAGEREF _Toc47 \h</w:instrText>
-              <w:fldChar w:fldCharType="separate"/>
-              <w:fldChar w:fldCharType="end"/>
-            </w:r>
-          </w:hyperlink>
-        </w:p>
-        <w:p>
-          <w:pPr>
-            <w:pStyle w:val="TOC1"/>
-            <w:tabs>
-              <w:tab w:val="right" w:pos="9638" w:leader="dot"/>
-            </w:tabs>
-          </w:pPr>
-          <w:hyperlink w:history="1" w:anchor="_Toc48">
-            <w:r>
-              <w:t xml:space="preserve">Cash and spending</w:t>
-            </w:r>
-            <w:r>
-              <w:tab/>
-            </w:r>
-            <w:r>
-              <w:fldChar w:fldCharType="begin" w:dirty="true"/>
-              <w:instrText xml:space="preserve">PAGEREF _Toc48 \h</w:instrText>
               <w:fldChar w:fldCharType="separate"/>
               <w:fldChar w:fldCharType="end"/>
             </w:r>
@@ -1184,9 +1162,31 @@
             </w:tabs>
             <w:ind w:left="220"/>
           </w:pPr>
+          <w:hyperlink w:history="1" w:anchor="_Toc48">
+            <w:r>
+              <w:t xml:space="preserve">Paid into the bank (Paystack payouts)</w:t>
+            </w:r>
+            <w:r>
+              <w:tab/>
+            </w:r>
+            <w:r>
+              <w:fldChar w:fldCharType="begin" w:dirty="true"/>
+              <w:instrText xml:space="preserve">PAGEREF _Toc48 \h</w:instrText>
+              <w:fldChar w:fldCharType="separate"/>
+              <w:fldChar w:fldCharType="end"/>
+            </w:r>
+          </w:hyperlink>
+        </w:p>
+        <w:p>
+          <w:pPr>
+            <w:pStyle w:val="TOC1"/>
+            <w:tabs>
+              <w:tab w:val="right" w:pos="9638" w:leader="dot"/>
+            </w:tabs>
+          </w:pPr>
           <w:hyperlink w:history="1" w:anchor="_Toc49">
             <w:r>
-              <w:t xml:space="preserve">Cash book</w:t>
+              <w:t xml:space="preserve">Cash and spending</w:t>
             </w:r>
             <w:r>
               <w:tab/>
@@ -1209,7 +1209,7 @@
           </w:pPr>
           <w:hyperlink w:history="1" w:anchor="_Toc50">
             <w:r>
-              <w:t xml:space="preserve">Banking cash, checked by a second person</w:t>
+              <w:t xml:space="preserve">Cash book</w:t>
             </w:r>
             <w:r>
               <w:tab/>
@@ -1232,7 +1232,7 @@
           </w:pPr>
           <w:hyperlink w:history="1" w:anchor="_Toc51">
             <w:r>
-              <w:t xml:space="preserve">Closing the day (drawer count)</w:t>
+              <w:t xml:space="preserve">Banking cash, checked by a second person</w:t>
             </w:r>
             <w:r>
               <w:tab/>
@@ -1255,7 +1255,7 @@
           </w:pPr>
           <w:hyperlink w:history="1" w:anchor="_Toc52">
             <w:r>
-              <w:t xml:space="preserve">Recording spending</w:t>
+              <w:t xml:space="preserve">Closing the day (drawer count)</w:t>
             </w:r>
             <w:r>
               <w:tab/>
@@ -1278,7 +1278,7 @@
           </w:pPr>
           <w:hyperlink w:history="1" w:anchor="_Toc53">
             <w:r>
-              <w:t xml:space="preserve">Income and expenditure</w:t>
+              <w:t xml:space="preserve">Recording spending</w:t>
             </w:r>
             <w:r>
               <w:tab/>
@@ -1286,28 +1286,6 @@
             <w:r>
               <w:fldChar w:fldCharType="begin" w:dirty="true"/>
               <w:instrText xml:space="preserve">PAGEREF _Toc53 \h</w:instrText>
-              <w:fldChar w:fldCharType="separate"/>
-              <w:fldChar w:fldCharType="end"/>
-            </w:r>
-          </w:hyperlink>
-        </w:p>
-        <w:p>
-          <w:pPr>
-            <w:pStyle w:val="TOC1"/>
-            <w:tabs>
-              <w:tab w:val="right" w:pos="9638" w:leader="dot"/>
-            </w:tabs>
-          </w:pPr>
-          <w:hyperlink w:history="1" w:anchor="_Toc54">
-            <w:r>
-              <w:t xml:space="preserve">Messages to parents</w:t>
-            </w:r>
-            <w:r>
-              <w:tab/>
-            </w:r>
-            <w:r>
-              <w:fldChar w:fldCharType="begin" w:dirty="true"/>
-              <w:instrText xml:space="preserve">PAGEREF _Toc54 \h</w:instrText>
               <w:fldChar w:fldCharType="separate"/>
               <w:fldChar w:fldCharType="end"/>
             </w:r>
@@ -1321,9 +1299,31 @@
             </w:tabs>
             <w:ind w:left="220"/>
           </w:pPr>
+          <w:hyperlink w:history="1" w:anchor="_Toc54">
+            <w:r>
+              <w:t xml:space="preserve">Income and expenditure</w:t>
+            </w:r>
+            <w:r>
+              <w:tab/>
+            </w:r>
+            <w:r>
+              <w:fldChar w:fldCharType="begin" w:dirty="true"/>
+              <w:instrText xml:space="preserve">PAGEREF _Toc54 \h</w:instrText>
+              <w:fldChar w:fldCharType="separate"/>
+              <w:fldChar w:fldCharType="end"/>
+            </w:r>
+          </w:hyperlink>
+        </w:p>
+        <w:p>
+          <w:pPr>
+            <w:pStyle w:val="TOC1"/>
+            <w:tabs>
+              <w:tab w:val="right" w:pos="9638" w:leader="dot"/>
+            </w:tabs>
+          </w:pPr>
           <w:hyperlink w:history="1" w:anchor="_Toc55">
             <w:r>
-              <w:t xml:space="preserve">Sent messages</w:t>
+              <w:t xml:space="preserve">Messages to parents</w:t>
             </w:r>
             <w:r>
               <w:tab/>
@@ -1346,7 +1346,7 @@
           </w:pPr>
           <w:hyperlink w:history="1" w:anchor="_Toc56">
             <w:r>
-              <w:t xml:space="preserve">The wording</w:t>
+              <w:t xml:space="preserve">Sent messages</w:t>
             </w:r>
             <w:r>
               <w:tab/>
@@ -1369,7 +1369,7 @@
           </w:pPr>
           <w:hyperlink w:history="1" w:anchor="_Toc57">
             <w:r>
-              <w:t xml:space="preserve">The reminder schedule</w:t>
+              <w:t xml:space="preserve">The wording</w:t>
             </w:r>
             <w:r>
               <w:tab/>
@@ -1377,28 +1377,6 @@
             <w:r>
               <w:fldChar w:fldCharType="begin" w:dirty="true"/>
               <w:instrText xml:space="preserve">PAGEREF _Toc57 \h</w:instrText>
-              <w:fldChar w:fldCharType="separate"/>
-              <w:fldChar w:fldCharType="end"/>
-            </w:r>
-          </w:hyperlink>
-        </w:p>
-        <w:p>
-          <w:pPr>
-            <w:pStyle w:val="TOC1"/>
-            <w:tabs>
-              <w:tab w:val="right" w:pos="9638" w:leader="dot"/>
-            </w:tabs>
-          </w:pPr>
-          <w:hyperlink w:history="1" w:anchor="_Toc58">
-            <w:r>
-              <w:t xml:space="preserve">The Overview page and reports</w:t>
-            </w:r>
-            <w:r>
-              <w:tab/>
-            </w:r>
-            <w:r>
-              <w:fldChar w:fldCharType="begin" w:dirty="true"/>
-              <w:instrText xml:space="preserve">PAGEREF _Toc58 \h</w:instrText>
               <w:fldChar w:fldCharType="separate"/>
               <w:fldChar w:fldCharType="end"/>
             </w:r>
@@ -1412,9 +1390,31 @@
             </w:tabs>
             <w:ind w:left="220"/>
           </w:pPr>
+          <w:hyperlink w:history="1" w:anchor="_Toc58">
+            <w:r>
+              <w:t xml:space="preserve">The reminder schedule</w:t>
+            </w:r>
+            <w:r>
+              <w:tab/>
+            </w:r>
+            <w:r>
+              <w:fldChar w:fldCharType="begin" w:dirty="true"/>
+              <w:instrText xml:space="preserve">PAGEREF _Toc58 \h</w:instrText>
+              <w:fldChar w:fldCharType="separate"/>
+              <w:fldChar w:fldCharType="end"/>
+            </w:r>
+          </w:hyperlink>
+        </w:p>
+        <w:p>
+          <w:pPr>
+            <w:pStyle w:val="TOC1"/>
+            <w:tabs>
+              <w:tab w:val="right" w:pos="9638" w:leader="dot"/>
+            </w:tabs>
+          </w:pPr>
           <w:hyperlink w:history="1" w:anchor="_Toc59">
             <w:r>
-              <w:t xml:space="preserve">Overview</w:t>
+              <w:t xml:space="preserve">The Overview page and reports</w:t>
             </w:r>
             <w:r>
               <w:tab/>
@@ -1437,7 +1437,7 @@
           </w:pPr>
           <w:hyperlink w:history="1" w:anchor="_Toc60">
             <w:r>
-              <w:t xml:space="preserve">Pace and forecast</w:t>
+              <w:t xml:space="preserve">Overview</w:t>
             </w:r>
             <w:r>
               <w:tab/>
@@ -1460,7 +1460,7 @@
           </w:pPr>
           <w:hyperlink w:history="1" w:anchor="_Toc61">
             <w:r>
-              <w:t xml:space="preserve">Debtors</w:t>
+              <w:t xml:space="preserve">Pace and forecast</w:t>
             </w:r>
             <w:r>
               <w:tab/>
@@ -1483,7 +1483,7 @@
           </w:pPr>
           <w:hyperlink w:history="1" w:anchor="_Toc62">
             <w:r>
-              <w:t xml:space="preserve">Money received</w:t>
+              <w:t xml:space="preserve">Debtors</w:t>
             </w:r>
             <w:r>
               <w:tab/>
@@ -1506,7 +1506,7 @@
           </w:pPr>
           <w:hyperlink w:history="1" w:anchor="_Toc63">
             <w:r>
-              <w:t xml:space="preserve">Fee status by pupil</w:t>
+              <w:t xml:space="preserve">Money received</w:t>
             </w:r>
             <w:r>
               <w:tab/>
@@ -1529,7 +1529,7 @@
           </w:pPr>
           <w:hyperlink w:history="1" w:anchor="_Toc64">
             <w:r>
-              <w:t xml:space="preserve">Unusual activity</w:t>
+              <w:t xml:space="preserve">Fee status by pupil</w:t>
             </w:r>
             <w:r>
               <w:tab/>
@@ -1537,28 +1537,6 @@
             <w:r>
               <w:fldChar w:fldCharType="begin" w:dirty="true"/>
               <w:instrText xml:space="preserve">PAGEREF _Toc64 \h</w:instrText>
-              <w:fldChar w:fldCharType="separate"/>
-              <w:fldChar w:fldCharType="end"/>
-            </w:r>
-          </w:hyperlink>
-        </w:p>
-        <w:p>
-          <w:pPr>
-            <w:pStyle w:val="TOC1"/>
-            <w:tabs>
-              <w:tab w:val="right" w:pos="9638" w:leader="dot"/>
-            </w:tabs>
-          </w:pPr>
-          <w:hyperlink w:history="1" w:anchor="_Toc65">
-            <w:r>
-              <w:t xml:space="preserve">For the accountant</w:t>
-            </w:r>
-            <w:r>
-              <w:tab/>
-            </w:r>
-            <w:r>
-              <w:fldChar w:fldCharType="begin" w:dirty="true"/>
-              <w:instrText xml:space="preserve">PAGEREF _Toc65 \h</w:instrText>
               <w:fldChar w:fldCharType="separate"/>
               <w:fldChar w:fldCharType="end"/>
             </w:r>
@@ -1572,9 +1550,31 @@
             </w:tabs>
             <w:ind w:left="220"/>
           </w:pPr>
+          <w:hyperlink w:history="1" w:anchor="_Toc65">
+            <w:r>
+              <w:t xml:space="preserve">Unusual activity</w:t>
+            </w:r>
+            <w:r>
+              <w:tab/>
+            </w:r>
+            <w:r>
+              <w:fldChar w:fldCharType="begin" w:dirty="true"/>
+              <w:instrText xml:space="preserve">PAGEREF _Toc65 \h</w:instrText>
+              <w:fldChar w:fldCharType="separate"/>
+              <w:fldChar w:fldCharType="end"/>
+            </w:r>
+          </w:hyperlink>
+        </w:p>
+        <w:p>
+          <w:pPr>
+            <w:pStyle w:val="TOC1"/>
+            <w:tabs>
+              <w:tab w:val="right" w:pos="9638" w:leader="dot"/>
+            </w:tabs>
+          </w:pPr>
           <w:hyperlink w:history="1" w:anchor="_Toc66">
             <w:r>
-              <w:t xml:space="preserve">The general journal</w:t>
+              <w:t xml:space="preserve">For the accountant</w:t>
             </w:r>
             <w:r>
               <w:tab/>
@@ -1597,7 +1597,7 @@
           </w:pPr>
           <w:hyperlink w:history="1" w:anchor="_Toc67">
             <w:r>
-              <w:t xml:space="preserve">Chart of accounts</w:t>
+              <w:t xml:space="preserve">The general journal</w:t>
             </w:r>
             <w:r>
               <w:tab/>
@@ -1620,7 +1620,7 @@
           </w:pPr>
           <w:hyperlink w:history="1" w:anchor="_Toc68">
             <w:r>
-              <w:t xml:space="preserve">Closing the books (closing a term)</w:t>
+              <w:t xml:space="preserve">Chart of accounts</w:t>
             </w:r>
             <w:r>
               <w:tab/>
@@ -1643,7 +1643,7 @@
           </w:pPr>
           <w:hyperlink w:history="1" w:anchor="_Toc69">
             <w:r>
-              <w:t xml:space="preserve">End-of-session pack</w:t>
+              <w:t xml:space="preserve">Closing the books (closing a term)</w:t>
             </w:r>
             <w:r>
               <w:tab/>
@@ -1651,28 +1651,6 @@
             <w:r>
               <w:fldChar w:fldCharType="begin" w:dirty="true"/>
               <w:instrText xml:space="preserve">PAGEREF _Toc69 \h</w:instrText>
-              <w:fldChar w:fldCharType="separate"/>
-              <w:fldChar w:fldCharType="end"/>
-            </w:r>
-          </w:hyperlink>
-        </w:p>
-        <w:p>
-          <w:pPr>
-            <w:pStyle w:val="TOC1"/>
-            <w:tabs>
-              <w:tab w:val="right" w:pos="9638" w:leader="dot"/>
-            </w:tabs>
-          </w:pPr>
-          <w:hyperlink w:history="1" w:anchor="_Toc70">
-            <w:r>
-              <w:t xml:space="preserve">The school’s own records</w:t>
-            </w:r>
-            <w:r>
-              <w:tab/>
-            </w:r>
-            <w:r>
-              <w:fldChar w:fldCharType="begin" w:dirty="true"/>
-              <w:instrText xml:space="preserve">PAGEREF _Toc70 \h</w:instrText>
               <w:fldChar w:fldCharType="separate"/>
               <w:fldChar w:fldCharType="end"/>
             </w:r>
@@ -1686,9 +1664,31 @@
             </w:tabs>
             <w:ind w:left="220"/>
           </w:pPr>
+          <w:hyperlink w:history="1" w:anchor="_Toc70">
+            <w:r>
+              <w:t xml:space="preserve">End-of-session pack</w:t>
+            </w:r>
+            <w:r>
+              <w:tab/>
+            </w:r>
+            <w:r>
+              <w:fldChar w:fldCharType="begin" w:dirty="true"/>
+              <w:instrText xml:space="preserve">PAGEREF _Toc70 \h</w:instrText>
+              <w:fldChar w:fldCharType="separate"/>
+              <w:fldChar w:fldCharType="end"/>
+            </w:r>
+          </w:hyperlink>
+        </w:p>
+        <w:p>
+          <w:pPr>
+            <w:pStyle w:val="TOC1"/>
+            <w:tabs>
+              <w:tab w:val="right" w:pos="9638" w:leader="dot"/>
+            </w:tabs>
+          </w:pPr>
           <w:hyperlink w:history="1" w:anchor="_Toc71">
             <w:r>
-              <w:t xml:space="preserve">Activity log</w:t>
+              <w:t xml:space="preserve">The school’s own records</w:t>
             </w:r>
             <w:r>
               <w:tab/>
@@ -1711,7 +1711,7 @@
           </w:pPr>
           <w:hyperlink w:history="1" w:anchor="_Toc72">
             <w:r>
-              <w:t xml:space="preserve">Subscription</w:t>
+              <w:t xml:space="preserve">Activity log</w:t>
             </w:r>
             <w:r>
               <w:tab/>
@@ -1719,28 +1719,6 @@
             <w:r>
               <w:fldChar w:fldCharType="begin" w:dirty="true"/>
               <w:instrText xml:space="preserve">PAGEREF _Toc72 \h</w:instrText>
-              <w:fldChar w:fldCharType="separate"/>
-              <w:fldChar w:fldCharType="end"/>
-            </w:r>
-          </w:hyperlink>
-        </w:p>
-        <w:p>
-          <w:pPr>
-            <w:pStyle w:val="TOC1"/>
-            <w:tabs>
-              <w:tab w:val="right" w:pos="9638" w:leader="dot"/>
-            </w:tabs>
-          </w:pPr>
-          <w:hyperlink w:history="1" w:anchor="_Toc73">
-            <w:r>
-              <w:t xml:space="preserve">For parents</w:t>
-            </w:r>
-            <w:r>
-              <w:tab/>
-            </w:r>
-            <w:r>
-              <w:fldChar w:fldCharType="begin" w:dirty="true"/>
-              <w:instrText xml:space="preserve">PAGEREF _Toc73 \h</w:instrText>
               <w:fldChar w:fldCharType="separate"/>
               <w:fldChar w:fldCharType="end"/>
             </w:r>
@@ -1754,9 +1732,31 @@
             </w:tabs>
             <w:ind w:left="220"/>
           </w:pPr>
+          <w:hyperlink w:history="1" w:anchor="_Toc73">
+            <w:r>
+              <w:t xml:space="preserve">Subscription</w:t>
+            </w:r>
+            <w:r>
+              <w:tab/>
+            </w:r>
+            <w:r>
+              <w:fldChar w:fldCharType="begin" w:dirty="true"/>
+              <w:instrText xml:space="preserve">PAGEREF _Toc73 \h</w:instrText>
+              <w:fldChar w:fldCharType="separate"/>
+              <w:fldChar w:fldCharType="end"/>
+            </w:r>
+          </w:hyperlink>
+        </w:p>
+        <w:p>
+          <w:pPr>
+            <w:pStyle w:val="TOC1"/>
+            <w:tabs>
+              <w:tab w:val="right" w:pos="9638" w:leader="dot"/>
+            </w:tabs>
+          </w:pPr>
           <w:hyperlink w:history="1" w:anchor="_Toc74">
             <w:r>
-              <w:t xml:space="preserve">Paying from the message link</w:t>
+              <w:t xml:space="preserve">For parents</w:t>
             </w:r>
             <w:r>
               <w:tab/>
@@ -1779,7 +1779,7 @@
           </w:pPr>
           <w:hyperlink w:history="1" w:anchor="_Toc75">
             <w:r>
-              <w:t xml:space="preserve">The parent portal</w:t>
+              <w:t xml:space="preserve">Paying from the message link</w:t>
             </w:r>
             <w:r>
               <w:tab/>
@@ -1802,7 +1802,7 @@
           </w:pPr>
           <w:hyperlink w:history="1" w:anchor="_Toc76">
             <w:r>
-              <w:t xml:space="preserve">Spreading the fees with a school plan</w:t>
+              <w:t xml:space="preserve">The parent portal</w:t>
             </w:r>
             <w:r>
               <w:tab/>
@@ -1825,7 +1825,7 @@
           </w:pPr>
           <w:hyperlink w:history="1" w:anchor="_Toc77">
             <w:r>
-              <w:t xml:space="preserve">Messages and my data</w:t>
+              <w:t xml:space="preserve">Spreading the fees with a school plan</w:t>
             </w:r>
             <w:r>
               <w:tab/>
@@ -1833,28 +1833,6 @@
             <w:r>
               <w:fldChar w:fldCharType="begin" w:dirty="true"/>
               <w:instrText xml:space="preserve">PAGEREF _Toc77 \h</w:instrText>
-              <w:fldChar w:fldCharType="separate"/>
-              <w:fldChar w:fldCharType="end"/>
-            </w:r>
-          </w:hyperlink>
-        </w:p>
-        <w:p>
-          <w:pPr>
-            <w:pStyle w:val="TOC1"/>
-            <w:tabs>
-              <w:tab w:val="right" w:pos="9638" w:leader="dot"/>
-            </w:tabs>
-          </w:pPr>
-          <w:hyperlink w:history="1" w:anchor="_Toc78">
-            <w:r>
-              <w:t xml:space="preserve">For the WardPay team</w:t>
-            </w:r>
-            <w:r>
-              <w:tab/>
-            </w:r>
-            <w:r>
-              <w:fldChar w:fldCharType="begin" w:dirty="true"/>
-              <w:instrText xml:space="preserve">PAGEREF _Toc78 \h</w:instrText>
               <w:fldChar w:fldCharType="separate"/>
               <w:fldChar w:fldCharType="end"/>
             </w:r>
@@ -1868,9 +1846,31 @@
             </w:tabs>
             <w:ind w:left="220"/>
           </w:pPr>
+          <w:hyperlink w:history="1" w:anchor="_Toc78">
+            <w:r>
+              <w:t xml:space="preserve">Messages and my data</w:t>
+            </w:r>
+            <w:r>
+              <w:tab/>
+            </w:r>
+            <w:r>
+              <w:fldChar w:fldCharType="begin" w:dirty="true"/>
+              <w:instrText xml:space="preserve">PAGEREF _Toc78 \h</w:instrText>
+              <w:fldChar w:fldCharType="separate"/>
+              <w:fldChar w:fldCharType="end"/>
+            </w:r>
+          </w:hyperlink>
+        </w:p>
+        <w:p>
+          <w:pPr>
+            <w:pStyle w:val="TOC1"/>
+            <w:tabs>
+              <w:tab w:val="right" w:pos="9638" w:leader="dot"/>
+            </w:tabs>
+          </w:pPr>
           <w:hyperlink w:history="1" w:anchor="_Toc79">
             <w:r>
-              <w:t xml:space="preserve">Platform overview and trends</w:t>
+              <w:t xml:space="preserve">For the WardPay team</w:t>
             </w:r>
             <w:r>
               <w:tab/>
@@ -1893,7 +1893,7 @@
           </w:pPr>
           <w:hyperlink w:history="1" w:anchor="_Toc80">
             <w:r>
-              <w:t xml:space="preserve">Schools</w:t>
+              <w:t xml:space="preserve">Platform overview and trends</w:t>
             </w:r>
             <w:r>
               <w:tab/>
@@ -1916,7 +1916,7 @@
           </w:pPr>
           <w:hyperlink w:history="1" w:anchor="_Toc81">
             <w:r>
-              <w:t xml:space="preserve">School groups (several branches, one owner)</w:t>
+              <w:t xml:space="preserve">Schools</w:t>
             </w:r>
             <w:r>
               <w:tab/>
@@ -1939,7 +1939,7 @@
           </w:pPr>
           <w:hyperlink w:history="1" w:anchor="_Toc82">
             <w:r>
-              <w:t xml:space="preserve">Subscription billing and plans</w:t>
+              <w:t xml:space="preserve">School groups (several branches, one owner)</w:t>
             </w:r>
             <w:r>
               <w:tab/>
@@ -1962,7 +1962,7 @@
           </w:pPr>
           <w:hyperlink w:history="1" w:anchor="_Toc83">
             <w:r>
-              <w:t xml:space="preserve">Problems, providers and support lookup</w:t>
+              <w:t xml:space="preserve">Subscription billing and plans</w:t>
             </w:r>
             <w:r>
               <w:tab/>
@@ -1970,6 +1970,29 @@
             <w:r>
               <w:fldChar w:fldCharType="begin" w:dirty="true"/>
               <w:instrText xml:space="preserve">PAGEREF _Toc83 \h</w:instrText>
+              <w:fldChar w:fldCharType="separate"/>
+              <w:fldChar w:fldCharType="end"/>
+            </w:r>
+          </w:hyperlink>
+        </w:p>
+        <w:p>
+          <w:pPr>
+            <w:pStyle w:val="TOC2"/>
+            <w:tabs>
+              <w:tab w:val="right" w:pos="9638" w:leader="dot"/>
+            </w:tabs>
+            <w:ind w:left="220"/>
+          </w:pPr>
+          <w:hyperlink w:history="1" w:anchor="_Toc84">
+            <w:r>
+              <w:t xml:space="preserve">Problems, providers and support lookup</w:t>
+            </w:r>
+            <w:r>
+              <w:tab/>
+            </w:r>
+            <w:r>
+              <w:fldChar w:fldCharType="begin" w:dirty="true"/>
+              <w:instrText xml:space="preserve">PAGEREF _Toc84 \h</w:instrText>
               <w:fldChar w:fldCharType="separate"/>
               <w:fldChar w:fldCharType="end"/>
             </w:r>
@@ -1982,7 +2005,7 @@
               <w:tab w:val="right" w:pos="9638" w:leader="dot"/>
             </w:tabs>
           </w:pPr>
-          <w:hyperlink w:history="1" w:anchor="_Toc84">
+          <w:hyperlink w:history="1" w:anchor="_Toc85">
             <w:r>
               <w:t xml:space="preserve">What changed in this guide</w:t>
             </w:r>
@@ -1991,7 +2014,7 @@
             </w:r>
             <w:r>
               <w:fldChar w:fldCharType="begin" w:dirty="true"/>
-              <w:instrText xml:space="preserve">PAGEREF _Toc84 \h</w:instrText>
+              <w:instrText xml:space="preserve">PAGEREF _Toc85 \h</w:instrText>
               <w:fldChar w:fldCharType="separate"/>
               <w:fldChar w:fldCharType="end"/>
             </w:r>
@@ -4533,15 +4556,168 @@
     </w:p>
     <w:p>
       <w:pPr>
+        <w:pStyle w:val="Heading2"/>
+        <w:spacing w:after="100" w:before="280"/>
+      </w:pPr>
+      <w:bookmarkStart w:name="_Toc19" w:id="19"/>
+      <w:r>
+        <w:t xml:space="preserve">Payment settings: charges on online payments</w:t>
+      </w:r>
+      <w:bookmarkEnd w:id="19"/>
+    </w:p>
+    <w:p>
+      <w:pPr>
+        <w:spacing w:after="100"/>
+      </w:pPr>
+      <w:r>
+        <w:rPr>
+          <w:b/>
+          <w:bCs/>
+          <w:color w:val="0F5132"/>
+          <w:sz w:val="22"/>
+          <w:szCs w:val="22"/>
+        </w:rPr>
+        <w:t xml:space="preserve">Who: </w:t>
+      </w:r>
+      <w:r>
+        <w:rPr>
+          <w:sz w:val="22"/>
+          <w:szCs w:val="22"/>
+        </w:rPr>
+        <w:t xml:space="preserve">Proprietor (others can see it)</w:t>
+      </w:r>
+    </w:p>
+    <w:p>
+      <w:pPr>
+        <w:spacing w:after="100"/>
+      </w:pPr>
+      <w:r>
+        <w:rPr>
+          <w:b/>
+          <w:bCs/>
+          <w:color w:val="0F5132"/>
+          <w:sz w:val="22"/>
+          <w:szCs w:val="22"/>
+        </w:rPr>
+        <w:t xml:space="preserve">What it’s for: </w:t>
+      </w:r>
+      <w:r>
+        <w:rPr>
+          <w:sz w:val="22"/>
+          <w:szCs w:val="22"/>
+        </w:rPr>
+        <w:t xml:space="preserve">Decide who pays Paystack’s charge when a parent pays on the payment page (card, bank transfer or USSD there all cost 1.5% plus ₦100, at most ₦2,000).</w:t>
+      </w:r>
+    </w:p>
+    <w:p>
+      <w:pPr>
+        <w:spacing w:after="60" w:before="80"/>
+      </w:pPr>
+      <w:r>
+        <w:rPr>
+          <w:b/>
+          <w:bCs/>
+          <w:color w:val="0F5132"/>
+          <w:sz w:val="22"/>
+          <w:szCs w:val="22"/>
+        </w:rPr>
+        <w:t xml:space="preserve">How to use it</w:t>
+      </w:r>
+    </w:p>
+    <w:p>
+      <w:pPr>
+        <w:pStyle w:val="ListParagraph"/>
+        <w:numPr>
+          <w:ilvl w:val="0"/>
+          <w:numId w:val="18"/>
+        </w:numPr>
+        <w:spacing w:after="60"/>
+      </w:pPr>
+      <w:r>
+        <w:rPr>
+          <w:sz w:val="22"/>
+          <w:szCs w:val="22"/>
+        </w:rPr>
+        <w:t xml:space="preserve">Go to Setup → Payment settings, under “Charges on online payments”.</w:t>
+      </w:r>
+    </w:p>
+    <w:p>
+      <w:pPr>
+        <w:pStyle w:val="ListParagraph"/>
+        <w:numPr>
+          <w:ilvl w:val="0"/>
+          <w:numId w:val="18"/>
+        </w:numPr>
+        <w:spacing w:after="60"/>
+      </w:pPr>
+      <w:r>
+        <w:rPr>
+          <w:sz w:val="22"/>
+          <w:szCs w:val="22"/>
+        </w:rPr>
+        <w:t xml:space="preserve">Choose The school (parents pay exactly the fees; the charge comes off what reaches the bank) or The parent, added on top (for ₦100,000 of fees the parent pays ₦101,624.37 and the school receives ₦100,000).</w:t>
+      </w:r>
+    </w:p>
+    <w:p>
+      <w:pPr>
+        <w:spacing w:after="60" w:before="80"/>
+      </w:pPr>
+      <w:r>
+        <w:rPr>
+          <w:b/>
+          <w:bCs/>
+          <w:color w:val="0F5132"/>
+          <w:sz w:val="22"/>
+          <w:szCs w:val="22"/>
+        </w:rPr>
+        <w:t xml:space="preserve">Good to know</w:t>
+      </w:r>
+    </w:p>
+    <w:p>
+      <w:pPr>
+        <w:pStyle w:val="ListParagraph"/>
+        <w:numPr>
+          <w:ilvl w:val="0"/>
+          <w:numId w:val="3"/>
+        </w:numPr>
+        <w:spacing w:after="60"/>
+      </w:pPr>
+      <w:r>
+        <w:rPr>
+          <w:sz w:val="22"/>
+          <w:szCs w:val="22"/>
+        </w:rPr>
+        <w:t xml:space="preserve">Our advice: ask parents to transfer into their child’s own account number. It costs far less (at most ₦300, paid by the school), and parents pay no charge at all.</w:t>
+      </w:r>
+    </w:p>
+    <w:p>
+      <w:pPr>
+        <w:pStyle w:val="ListParagraph"/>
+        <w:numPr>
+          <w:ilvl w:val="0"/>
+          <w:numId w:val="3"/>
+        </w:numPr>
+        <w:spacing w:after="60"/>
+      </w:pPr>
+      <w:r>
+        <w:rPr>
+          <w:sz w:val="22"/>
+          <w:szCs w:val="22"/>
+        </w:rPr>
+        <w:t xml:space="preserve">Parents see any charge before they pay, on the button and under it.</w:t>
+      </w:r>
+    </w:p>
+    <w:p>
+      <w:pPr>
         <w:pStyle w:val="Heading1"/>
         <w:pageBreakBefore/>
         <w:spacing w:after="160"/>
       </w:pPr>
-      <w:bookmarkStart w:name="_Toc19" w:id="19"/>
+      <w:bookmarkStart w:name="_Toc20" w:id="20"/>
       <w:r>
         <w:t xml:space="preserve">Pupils and parents</w:t>
       </w:r>
-      <w:bookmarkEnd w:id="19"/>
+      <w:bookmarkEnd w:id="20"/>
     </w:p>
     <w:p>
       <w:pPr>
@@ -4560,11 +4736,11 @@
         <w:pStyle w:val="Heading2"/>
         <w:spacing w:after="100" w:before="280"/>
       </w:pPr>
-      <w:bookmarkStart w:name="_Toc20" w:id="20"/>
+      <w:bookmarkStart w:name="_Toc21" w:id="21"/>
       <w:r>
         <w:t xml:space="preserve">Finding pupils</w:t>
       </w:r>
-      <w:bookmarkEnd w:id="20"/>
+      <w:bookmarkEnd w:id="21"/>
     </w:p>
     <w:p>
       <w:pPr>
@@ -4630,7 +4806,7 @@
         <w:pStyle w:val="ListParagraph"/>
         <w:numPr>
           <w:ilvl w:val="0"/>
-          <w:numId w:val="18"/>
+          <w:numId w:val="19"/>
         </w:numPr>
         <w:spacing w:after="60"/>
       </w:pPr>
@@ -4647,7 +4823,7 @@
         <w:pStyle w:val="ListParagraph"/>
         <w:numPr>
           <w:ilvl w:val="0"/>
-          <w:numId w:val="18"/>
+          <w:numId w:val="19"/>
         </w:numPr>
         <w:spacing w:after="60"/>
       </w:pPr>
@@ -4664,7 +4840,7 @@
         <w:pStyle w:val="ListParagraph"/>
         <w:numPr>
           <w:ilvl w:val="0"/>
-          <w:numId w:val="18"/>
+          <w:numId w:val="19"/>
         </w:numPr>
         <w:spacing w:after="60"/>
       </w:pPr>
@@ -4713,11 +4889,11 @@
         <w:pStyle w:val="Heading2"/>
         <w:spacing w:after="100" w:before="280"/>
       </w:pPr>
-      <w:bookmarkStart w:name="_Toc21" w:id="21"/>
+      <w:bookmarkStart w:name="_Toc22" w:id="22"/>
       <w:r>
         <w:t xml:space="preserve">Adding a pupil</w:t>
       </w:r>
-      <w:bookmarkEnd w:id="21"/>
+      <w:bookmarkEnd w:id="22"/>
     </w:p>
     <w:p>
       <w:pPr>
@@ -4783,7 +4959,7 @@
         <w:pStyle w:val="ListParagraph"/>
         <w:numPr>
           <w:ilvl w:val="0"/>
-          <w:numId w:val="19"/>
+          <w:numId w:val="20"/>
         </w:numPr>
         <w:spacing w:after="60"/>
       </w:pPr>
@@ -4800,7 +4976,7 @@
         <w:pStyle w:val="ListParagraph"/>
         <w:numPr>
           <w:ilvl w:val="0"/>
-          <w:numId w:val="19"/>
+          <w:numId w:val="20"/>
         </w:numPr>
         <w:spacing w:after="60"/>
       </w:pPr>
@@ -4817,7 +4993,7 @@
         <w:pStyle w:val="ListParagraph"/>
         <w:numPr>
           <w:ilvl w:val="0"/>
-          <w:numId w:val="19"/>
+          <w:numId w:val="20"/>
         </w:numPr>
         <w:spacing w:after="60"/>
       </w:pPr>
@@ -4834,11 +5010,11 @@
         <w:pStyle w:val="Heading2"/>
         <w:spacing w:after="100" w:before="280"/>
       </w:pPr>
-      <w:bookmarkStart w:name="_Toc22" w:id="22"/>
+      <w:bookmarkStart w:name="_Toc23" w:id="23"/>
       <w:r>
         <w:t xml:space="preserve">Importing pupils from a spreadsheet</w:t>
       </w:r>
-      <w:bookmarkEnd w:id="22"/>
+      <w:bookmarkEnd w:id="23"/>
     </w:p>
     <w:p>
       <w:pPr>
@@ -4904,7 +5080,7 @@
         <w:pStyle w:val="ListParagraph"/>
         <w:numPr>
           <w:ilvl w:val="0"/>
-          <w:numId w:val="20"/>
+          <w:numId w:val="21"/>
         </w:numPr>
         <w:spacing w:after="60"/>
       </w:pPr>
@@ -4921,7 +5097,7 @@
         <w:pStyle w:val="ListParagraph"/>
         <w:numPr>
           <w:ilvl w:val="0"/>
-          <w:numId w:val="20"/>
+          <w:numId w:val="21"/>
         </w:numPr>
         <w:spacing w:after="60"/>
       </w:pPr>
@@ -4938,7 +5114,7 @@
         <w:pStyle w:val="ListParagraph"/>
         <w:numPr>
           <w:ilvl w:val="0"/>
-          <w:numId w:val="20"/>
+          <w:numId w:val="21"/>
         </w:numPr>
         <w:spacing w:after="60"/>
       </w:pPr>
@@ -4955,7 +5131,7 @@
         <w:pStyle w:val="ListParagraph"/>
         <w:numPr>
           <w:ilvl w:val="0"/>
-          <w:numId w:val="20"/>
+          <w:numId w:val="21"/>
         </w:numPr>
         <w:spacing w:after="60"/>
       </w:pPr>
@@ -5004,11 +5180,11 @@
         <w:pStyle w:val="Heading2"/>
         <w:spacing w:after="100" w:before="280"/>
       </w:pPr>
-      <w:bookmarkStart w:name="_Toc23" w:id="23"/>
+      <w:bookmarkStart w:name="_Toc24" w:id="24"/>
       <w:r>
         <w:t xml:space="preserve">The pupil’s page</w:t>
       </w:r>
-      <w:bookmarkEnd w:id="23"/>
+      <w:bookmarkEnd w:id="24"/>
     </w:p>
     <w:p>
       <w:pPr>
@@ -5074,7 +5250,7 @@
         <w:pStyle w:val="ListParagraph"/>
         <w:numPr>
           <w:ilvl w:val="0"/>
-          <w:numId w:val="21"/>
+          <w:numId w:val="22"/>
         </w:numPr>
         <w:spacing w:after="60"/>
       </w:pPr>
@@ -5091,7 +5267,7 @@
         <w:pStyle w:val="ListParagraph"/>
         <w:numPr>
           <w:ilvl w:val="0"/>
-          <w:numId w:val="21"/>
+          <w:numId w:val="22"/>
         </w:numPr>
         <w:spacing w:after="60"/>
       </w:pPr>
@@ -5108,7 +5284,7 @@
         <w:pStyle w:val="ListParagraph"/>
         <w:numPr>
           <w:ilvl w:val="0"/>
-          <w:numId w:val="21"/>
+          <w:numId w:val="22"/>
         </w:numPr>
         <w:spacing w:after="60"/>
       </w:pPr>
@@ -5125,7 +5301,7 @@
         <w:pStyle w:val="ListParagraph"/>
         <w:numPr>
           <w:ilvl w:val="0"/>
-          <w:numId w:val="21"/>
+          <w:numId w:val="22"/>
         </w:numPr>
         <w:spacing w:after="60"/>
       </w:pPr>
@@ -5142,11 +5318,11 @@
         <w:pStyle w:val="Heading2"/>
         <w:spacing w:after="100" w:before="280"/>
       </w:pPr>
-      <w:bookmarkStart w:name="_Toc24" w:id="24"/>
+      <w:bookmarkStart w:name="_Toc25" w:id="25"/>
       <w:r>
         <w:t xml:space="preserve">Parents and guardians</w:t>
       </w:r>
-      <w:bookmarkEnd w:id="24"/>
+      <w:bookmarkEnd w:id="25"/>
     </w:p>
     <w:p>
       <w:pPr>
@@ -5212,7 +5388,7 @@
         <w:pStyle w:val="ListParagraph"/>
         <w:numPr>
           <w:ilvl w:val="0"/>
-          <w:numId w:val="22"/>
+          <w:numId w:val="23"/>
         </w:numPr>
         <w:spacing w:after="60"/>
       </w:pPr>
@@ -5229,7 +5405,7 @@
         <w:pStyle w:val="ListParagraph"/>
         <w:numPr>
           <w:ilvl w:val="0"/>
-          <w:numId w:val="22"/>
+          <w:numId w:val="23"/>
         </w:numPr>
         <w:spacing w:after="60"/>
       </w:pPr>
@@ -5246,7 +5422,7 @@
         <w:pStyle w:val="ListParagraph"/>
         <w:numPr>
           <w:ilvl w:val="0"/>
-          <w:numId w:val="22"/>
+          <w:numId w:val="23"/>
         </w:numPr>
         <w:spacing w:after="60"/>
       </w:pPr>
@@ -5263,11 +5439,11 @@
         <w:pStyle w:val="Heading2"/>
         <w:spacing w:after="100" w:before="280"/>
       </w:pPr>
-      <w:bookmarkStart w:name="_Toc25" w:id="25"/>
+      <w:bookmarkStart w:name="_Toc26" w:id="26"/>
       <w:r>
         <w:t xml:space="preserve">Sending one reminder now</w:t>
       </w:r>
-      <w:bookmarkEnd w:id="25"/>
+      <w:bookmarkEnd w:id="26"/>
     </w:p>
     <w:p>
       <w:pPr>
@@ -5333,7 +5509,7 @@
         <w:pStyle w:val="ListParagraph"/>
         <w:numPr>
           <w:ilvl w:val="0"/>
-          <w:numId w:val="23"/>
+          <w:numId w:val="24"/>
         </w:numPr>
         <w:spacing w:after="60"/>
       </w:pPr>
@@ -5350,11 +5526,11 @@
         <w:pStyle w:val="Heading2"/>
         <w:spacing w:after="100" w:before="280"/>
       </w:pPr>
-      <w:bookmarkStart w:name="_Toc26" w:id="26"/>
+      <w:bookmarkStart w:name="_Toc27" w:id="27"/>
       <w:r>
         <w:t xml:space="preserve">The family payment link</w:t>
       </w:r>
-      <w:bookmarkEnd w:id="26"/>
+      <w:bookmarkEnd w:id="27"/>
     </w:p>
     <w:p>
       <w:pPr>
@@ -5420,7 +5596,7 @@
         <w:pStyle w:val="ListParagraph"/>
         <w:numPr>
           <w:ilvl w:val="0"/>
-          <w:numId w:val="24"/>
+          <w:numId w:val="25"/>
         </w:numPr>
         <w:spacing w:after="60"/>
       </w:pPr>
@@ -5437,7 +5613,7 @@
         <w:pStyle w:val="ListParagraph"/>
         <w:numPr>
           <w:ilvl w:val="0"/>
-          <w:numId w:val="24"/>
+          <w:numId w:val="25"/>
         </w:numPr>
         <w:spacing w:after="60"/>
       </w:pPr>
@@ -5454,7 +5630,7 @@
         <w:pStyle w:val="ListParagraph"/>
         <w:numPr>
           <w:ilvl w:val="0"/>
-          <w:numId w:val="24"/>
+          <w:numId w:val="25"/>
         </w:numPr>
         <w:spacing w:after="60"/>
       </w:pPr>
@@ -5471,11 +5647,11 @@
         <w:pStyle w:val="Heading2"/>
         <w:spacing w:after="100" w:before="280"/>
       </w:pPr>
-      <w:bookmarkStart w:name="_Toc27" w:id="27"/>
+      <w:bookmarkStart w:name="_Toc28" w:id="28"/>
       <w:r>
         <w:t xml:space="preserve">Pay cards</w:t>
       </w:r>
-      <w:bookmarkEnd w:id="27"/>
+      <w:bookmarkEnd w:id="28"/>
     </w:p>
     <w:p>
       <w:pPr>
@@ -5541,7 +5717,7 @@
         <w:pStyle w:val="ListParagraph"/>
         <w:numPr>
           <w:ilvl w:val="0"/>
-          <w:numId w:val="25"/>
+          <w:numId w:val="26"/>
         </w:numPr>
         <w:spacing w:after="60"/>
       </w:pPr>
@@ -5558,11 +5734,11 @@
         <w:pStyle w:val="Heading2"/>
         <w:spacing w:after="100" w:before="280"/>
       </w:pPr>
-      <w:bookmarkStart w:name="_Toc28" w:id="28"/>
+      <w:bookmarkStart w:name="_Toc29" w:id="29"/>
       <w:r>
         <w:t xml:space="preserve">A parent’s data: export and erase</w:t>
       </w:r>
-      <w:bookmarkEnd w:id="28"/>
+      <w:bookmarkEnd w:id="29"/>
     </w:p>
     <w:p>
       <w:pPr>
@@ -5628,7 +5804,7 @@
         <w:pStyle w:val="ListParagraph"/>
         <w:numPr>
           <w:ilvl w:val="0"/>
-          <w:numId w:val="26"/>
+          <w:numId w:val="27"/>
         </w:numPr>
         <w:spacing w:after="60"/>
       </w:pPr>
@@ -5645,7 +5821,7 @@
         <w:pStyle w:val="ListParagraph"/>
         <w:numPr>
           <w:ilvl w:val="0"/>
-          <w:numId w:val="26"/>
+          <w:numId w:val="27"/>
         </w:numPr>
         <w:spacing w:after="60"/>
       </w:pPr>
@@ -5695,11 +5871,11 @@
         <w:pageBreakBefore/>
         <w:spacing w:after="160"/>
       </w:pPr>
-      <w:bookmarkStart w:name="_Toc29" w:id="29"/>
+      <w:bookmarkStart w:name="_Toc30" w:id="30"/>
       <w:r>
         <w:t xml:space="preserve">Bills</w:t>
       </w:r>
-      <w:bookmarkEnd w:id="29"/>
+      <w:bookmarkEnd w:id="30"/>
     </w:p>
     <w:p>
       <w:pPr>
@@ -5718,11 +5894,11 @@
         <w:pStyle w:val="Heading2"/>
         <w:spacing w:after="100" w:before="280"/>
       </w:pPr>
-      <w:bookmarkStart w:name="_Toc30" w:id="30"/>
+      <w:bookmarkStart w:name="_Toc31" w:id="31"/>
       <w:r>
         <w:t xml:space="preserve">Generating the term’s bills</w:t>
       </w:r>
-      <w:bookmarkEnd w:id="30"/>
+      <w:bookmarkEnd w:id="31"/>
     </w:p>
     <w:p>
       <w:pPr>
@@ -5788,7 +5964,7 @@
         <w:pStyle w:val="ListParagraph"/>
         <w:numPr>
           <w:ilvl w:val="0"/>
-          <w:numId w:val="27"/>
+          <w:numId w:val="28"/>
         </w:numPr>
         <w:spacing w:after="60"/>
       </w:pPr>
@@ -5805,7 +5981,7 @@
         <w:pStyle w:val="ListParagraph"/>
         <w:numPr>
           <w:ilvl w:val="0"/>
-          <w:numId w:val="27"/>
+          <w:numId w:val="28"/>
         </w:numPr>
         <w:spacing w:after="60"/>
       </w:pPr>
@@ -5822,7 +5998,7 @@
         <w:pStyle w:val="ListParagraph"/>
         <w:numPr>
           <w:ilvl w:val="0"/>
-          <w:numId w:val="27"/>
+          <w:numId w:val="28"/>
         </w:numPr>
         <w:spacing w:after="60"/>
       </w:pPr>
@@ -5871,11 +6047,11 @@
         <w:pStyle w:val="Heading2"/>
         <w:spacing w:after="100" w:before="280"/>
       </w:pPr>
-      <w:bookmarkStart w:name="_Toc31" w:id="31"/>
+      <w:bookmarkStart w:name="_Toc32" w:id="32"/>
       <w:r>
         <w:t xml:space="preserve">Adding a fee to some classes after the bills have gone out</w:t>
       </w:r>
-      <w:bookmarkEnd w:id="31"/>
+      <w:bookmarkEnd w:id="32"/>
     </w:p>
     <w:p>
       <w:pPr>
@@ -5941,7 +6117,7 @@
         <w:pStyle w:val="ListParagraph"/>
         <w:numPr>
           <w:ilvl w:val="0"/>
-          <w:numId w:val="28"/>
+          <w:numId w:val="29"/>
         </w:numPr>
         <w:spacing w:after="60"/>
       </w:pPr>
@@ -5958,7 +6134,7 @@
         <w:pStyle w:val="ListParagraph"/>
         <w:numPr>
           <w:ilvl w:val="0"/>
-          <w:numId w:val="28"/>
+          <w:numId w:val="29"/>
         </w:numPr>
         <w:spacing w:after="60"/>
       </w:pPr>
@@ -5975,11 +6151,11 @@
         <w:pStyle w:val="Heading2"/>
         <w:spacing w:after="100" w:before="280"/>
       </w:pPr>
-      <w:bookmarkStart w:name="_Toc32" w:id="32"/>
+      <w:bookmarkStart w:name="_Toc33" w:id="33"/>
       <w:r>
         <w:t xml:space="preserve">Exempting a pupil from a fee</w:t>
       </w:r>
-      <w:bookmarkEnd w:id="32"/>
+      <w:bookmarkEnd w:id="33"/>
     </w:p>
     <w:p>
       <w:pPr>
@@ -6045,7 +6221,7 @@
         <w:pStyle w:val="ListParagraph"/>
         <w:numPr>
           <w:ilvl w:val="0"/>
-          <w:numId w:val="29"/>
+          <w:numId w:val="30"/>
         </w:numPr>
         <w:spacing w:after="60"/>
       </w:pPr>
@@ -6062,11 +6238,11 @@
         <w:pStyle w:val="Heading2"/>
         <w:spacing w:after="100" w:before="280"/>
       </w:pPr>
-      <w:bookmarkStart w:name="_Toc33" w:id="33"/>
+      <w:bookmarkStart w:name="_Toc34" w:id="34"/>
       <w:r>
         <w:t xml:space="preserve">One-off charges and opening balances</w:t>
       </w:r>
-      <w:bookmarkEnd w:id="33"/>
+      <w:bookmarkEnd w:id="34"/>
     </w:p>
     <w:p>
       <w:pPr>
@@ -6132,7 +6308,7 @@
         <w:pStyle w:val="ListParagraph"/>
         <w:numPr>
           <w:ilvl w:val="0"/>
-          <w:numId w:val="30"/>
+          <w:numId w:val="31"/>
         </w:numPr>
         <w:spacing w:after="60"/>
       </w:pPr>
@@ -6149,11 +6325,11 @@
         <w:pStyle w:val="Heading2"/>
         <w:spacing w:after="100" w:before="280"/>
       </w:pPr>
-      <w:bookmarkStart w:name="_Toc34" w:id="34"/>
+      <w:bookmarkStart w:name="_Toc35" w:id="35"/>
       <w:r>
         <w:t xml:space="preserve">Correcting a bill, adding a charge, voiding a bill</w:t>
       </w:r>
-      <w:bookmarkEnd w:id="34"/>
+      <w:bookmarkEnd w:id="35"/>
     </w:p>
     <w:p>
       <w:pPr>
@@ -6219,7 +6395,7 @@
         <w:pStyle w:val="ListParagraph"/>
         <w:numPr>
           <w:ilvl w:val="0"/>
-          <w:numId w:val="31"/>
+          <w:numId w:val="32"/>
         </w:numPr>
         <w:spacing w:after="60"/>
       </w:pPr>
@@ -6236,7 +6412,7 @@
         <w:pStyle w:val="ListParagraph"/>
         <w:numPr>
           <w:ilvl w:val="0"/>
-          <w:numId w:val="31"/>
+          <w:numId w:val="32"/>
         </w:numPr>
         <w:spacing w:after="60"/>
       </w:pPr>
@@ -6253,7 +6429,7 @@
         <w:pStyle w:val="ListParagraph"/>
         <w:numPr>
           <w:ilvl w:val="0"/>
-          <w:numId w:val="31"/>
+          <w:numId w:val="32"/>
         </w:numPr>
         <w:spacing w:after="60"/>
       </w:pPr>
@@ -6302,11 +6478,11 @@
         <w:pStyle w:val="Heading2"/>
         <w:spacing w:after="100" w:before="280"/>
       </w:pPr>
-      <w:bookmarkStart w:name="_Toc35" w:id="35"/>
+      <w:bookmarkStart w:name="_Toc36" w:id="36"/>
       <w:r>
         <w:t xml:space="preserve">Paying in instalments (payment plans)</w:t>
       </w:r>
-      <w:bookmarkEnd w:id="35"/>
+      <w:bookmarkEnd w:id="36"/>
     </w:p>
     <w:p>
       <w:pPr>
@@ -6372,7 +6548,7 @@
         <w:pStyle w:val="ListParagraph"/>
         <w:numPr>
           <w:ilvl w:val="0"/>
-          <w:numId w:val="32"/>
+          <w:numId w:val="33"/>
         </w:numPr>
         <w:spacing w:after="60"/>
       </w:pPr>
@@ -6389,7 +6565,7 @@
         <w:pStyle w:val="ListParagraph"/>
         <w:numPr>
           <w:ilvl w:val="0"/>
-          <w:numId w:val="32"/>
+          <w:numId w:val="33"/>
         </w:numPr>
         <w:spacing w:after="60"/>
       </w:pPr>
@@ -6406,7 +6582,7 @@
         <w:pStyle w:val="ListParagraph"/>
         <w:numPr>
           <w:ilvl w:val="0"/>
-          <w:numId w:val="32"/>
+          <w:numId w:val="33"/>
         </w:numPr>
         <w:spacing w:after="60"/>
       </w:pPr>
@@ -6423,11 +6599,11 @@
         <w:pStyle w:val="Heading2"/>
         <w:spacing w:after="100" w:before="280"/>
       </w:pPr>
-      <w:bookmarkStart w:name="_Toc36" w:id="36"/>
+      <w:bookmarkStart w:name="_Toc37" w:id="37"/>
       <w:r>
         <w:t xml:space="preserve">The school’s own instalment plans</w:t>
       </w:r>
-      <w:bookmarkEnd w:id="36"/>
+      <w:bookmarkEnd w:id="37"/>
     </w:p>
     <w:p>
       <w:pPr>
@@ -6493,7 +6669,7 @@
         <w:pStyle w:val="ListParagraph"/>
         <w:numPr>
           <w:ilvl w:val="0"/>
-          <w:numId w:val="33"/>
+          <w:numId w:val="34"/>
         </w:numPr>
         <w:spacing w:after="60"/>
       </w:pPr>
@@ -6510,7 +6686,7 @@
         <w:pStyle w:val="ListParagraph"/>
         <w:numPr>
           <w:ilvl w:val="0"/>
-          <w:numId w:val="33"/>
+          <w:numId w:val="34"/>
         </w:numPr>
         <w:spacing w:after="60"/>
       </w:pPr>
@@ -6527,7 +6703,7 @@
         <w:pStyle w:val="ListParagraph"/>
         <w:numPr>
           <w:ilvl w:val="0"/>
-          <w:numId w:val="33"/>
+          <w:numId w:val="34"/>
         </w:numPr>
         <w:spacing w:after="60"/>
       </w:pPr>
@@ -6544,7 +6720,7 @@
         <w:pStyle w:val="ListParagraph"/>
         <w:numPr>
           <w:ilvl w:val="0"/>
-          <w:numId w:val="33"/>
+          <w:numId w:val="34"/>
         </w:numPr>
         <w:spacing w:after="60"/>
       </w:pPr>
@@ -6561,7 +6737,7 @@
         <w:pStyle w:val="ListParagraph"/>
         <w:numPr>
           <w:ilvl w:val="0"/>
-          <w:numId w:val="33"/>
+          <w:numId w:val="34"/>
         </w:numPr>
         <w:spacing w:after="60"/>
       </w:pPr>
@@ -6661,11 +6837,11 @@
         <w:pStyle w:val="Heading2"/>
         <w:spacing w:after="100" w:before="280"/>
       </w:pPr>
-      <w:bookmarkStart w:name="_Toc37" w:id="37"/>
+      <w:bookmarkStart w:name="_Toc38" w:id="38"/>
       <w:r>
         <w:t xml:space="preserve">Putting a family on a plan</w:t>
       </w:r>
-      <w:bookmarkEnd w:id="37"/>
+      <w:bookmarkEnd w:id="38"/>
     </w:p>
     <w:p>
       <w:pPr>
@@ -6731,7 +6907,7 @@
         <w:pStyle w:val="ListParagraph"/>
         <w:numPr>
           <w:ilvl w:val="0"/>
-          <w:numId w:val="34"/>
+          <w:numId w:val="35"/>
         </w:numPr>
         <w:spacing w:after="60"/>
       </w:pPr>
@@ -6748,7 +6924,7 @@
         <w:pStyle w:val="ListParagraph"/>
         <w:numPr>
           <w:ilvl w:val="0"/>
-          <w:numId w:val="34"/>
+          <w:numId w:val="35"/>
         </w:numPr>
         <w:spacing w:after="60"/>
       </w:pPr>
@@ -6765,7 +6941,7 @@
         <w:pStyle w:val="ListParagraph"/>
         <w:numPr>
           <w:ilvl w:val="0"/>
-          <w:numId w:val="34"/>
+          <w:numId w:val="35"/>
         </w:numPr>
         <w:spacing w:after="60"/>
       </w:pPr>
@@ -6782,7 +6958,7 @@
         <w:pStyle w:val="ListParagraph"/>
         <w:numPr>
           <w:ilvl w:val="0"/>
-          <w:numId w:val="34"/>
+          <w:numId w:val="35"/>
         </w:numPr>
         <w:spacing w:after="60"/>
       </w:pPr>
@@ -6865,11 +7041,11 @@
         <w:pStyle w:val="Heading2"/>
         <w:spacing w:after="100" w:before="280"/>
       </w:pPr>
-      <w:bookmarkStart w:name="_Toc38" w:id="38"/>
+      <w:bookmarkStart w:name="_Toc39" w:id="39"/>
       <w:r>
         <w:t xml:space="preserve">Writing off debt</w:t>
       </w:r>
-      <w:bookmarkEnd w:id="38"/>
+      <w:bookmarkEnd w:id="39"/>
     </w:p>
     <w:p>
       <w:pPr>
@@ -6935,7 +7111,7 @@
         <w:pStyle w:val="ListParagraph"/>
         <w:numPr>
           <w:ilvl w:val="0"/>
-          <w:numId w:val="35"/>
+          <w:numId w:val="36"/>
         </w:numPr>
         <w:spacing w:after="60"/>
       </w:pPr>
@@ -6952,7 +7128,7 @@
         <w:pStyle w:val="ListParagraph"/>
         <w:numPr>
           <w:ilvl w:val="0"/>
-          <w:numId w:val="35"/>
+          <w:numId w:val="36"/>
         </w:numPr>
         <w:spacing w:after="60"/>
       </w:pPr>
@@ -6969,7 +7145,7 @@
         <w:pStyle w:val="ListParagraph"/>
         <w:numPr>
           <w:ilvl w:val="0"/>
-          <w:numId w:val="35"/>
+          <w:numId w:val="36"/>
         </w:numPr>
         <w:spacing w:after="60"/>
       </w:pPr>
@@ -6986,7 +7162,7 @@
         <w:pStyle w:val="ListParagraph"/>
         <w:numPr>
           <w:ilvl w:val="0"/>
-          <w:numId w:val="35"/>
+          <w:numId w:val="36"/>
         </w:numPr>
         <w:spacing w:after="60"/>
       </w:pPr>
@@ -7053,11 +7229,11 @@
         <w:pageBreakBefore/>
         <w:spacing w:after="160"/>
       </w:pPr>
-      <w:bookmarkStart w:name="_Toc39" w:id="39"/>
+      <w:bookmarkStart w:name="_Toc40" w:id="40"/>
       <w:r>
         <w:t xml:space="preserve">Payments</w:t>
       </w:r>
-      <w:bookmarkEnd w:id="39"/>
+      <w:bookmarkEnd w:id="40"/>
     </w:p>
     <w:p>
       <w:pPr>
@@ -7076,11 +7252,11 @@
         <w:pStyle w:val="Heading2"/>
         <w:spacing w:after="100" w:before="280"/>
       </w:pPr>
-      <w:bookmarkStart w:name="_Toc40" w:id="40"/>
+      <w:bookmarkStart w:name="_Toc41" w:id="41"/>
       <w:r>
         <w:t xml:space="preserve">How parents pay</w:t>
       </w:r>
-      <w:bookmarkEnd w:id="40"/>
+      <w:bookmarkEnd w:id="41"/>
     </w:p>
     <w:p>
       <w:pPr>
@@ -7146,7 +7322,7 @@
         <w:pStyle w:val="ListParagraph"/>
         <w:numPr>
           <w:ilvl w:val="0"/>
-          <w:numId w:val="36"/>
+          <w:numId w:val="37"/>
         </w:numPr>
         <w:spacing w:after="60"/>
       </w:pPr>
@@ -7163,7 +7339,7 @@
         <w:pStyle w:val="ListParagraph"/>
         <w:numPr>
           <w:ilvl w:val="0"/>
-          <w:numId w:val="36"/>
+          <w:numId w:val="37"/>
         </w:numPr>
         <w:spacing w:after="60"/>
       </w:pPr>
@@ -7180,7 +7356,7 @@
         <w:pStyle w:val="ListParagraph"/>
         <w:numPr>
           <w:ilvl w:val="0"/>
-          <w:numId w:val="36"/>
+          <w:numId w:val="37"/>
         </w:numPr>
         <w:spacing w:after="60"/>
       </w:pPr>
@@ -7197,7 +7373,7 @@
         <w:pStyle w:val="ListParagraph"/>
         <w:numPr>
           <w:ilvl w:val="0"/>
-          <w:numId w:val="36"/>
+          <w:numId w:val="37"/>
         </w:numPr>
         <w:spacing w:after="60"/>
       </w:pPr>
@@ -7246,11 +7422,11 @@
         <w:pStyle w:val="Heading2"/>
         <w:spacing w:after="100" w:before="280"/>
       </w:pPr>
-      <w:bookmarkStart w:name="_Toc41" w:id="41"/>
+      <w:bookmarkStart w:name="_Toc42" w:id="42"/>
       <w:r>
         <w:t xml:space="preserve">Seeing payments</w:t>
       </w:r>
-      <w:bookmarkEnd w:id="41"/>
+      <w:bookmarkEnd w:id="42"/>
     </w:p>
     <w:p>
       <w:pPr>
@@ -7316,7 +7492,7 @@
         <w:pStyle w:val="ListParagraph"/>
         <w:numPr>
           <w:ilvl w:val="0"/>
-          <w:numId w:val="37"/>
+          <w:numId w:val="38"/>
         </w:numPr>
         <w:spacing w:after="60"/>
       </w:pPr>
@@ -7333,11 +7509,11 @@
         <w:pStyle w:val="Heading2"/>
         <w:spacing w:after="100" w:before="280"/>
       </w:pPr>
-      <w:bookmarkStart w:name="_Toc42" w:id="42"/>
+      <w:bookmarkStart w:name="_Toc43" w:id="43"/>
       <w:r>
         <w:t xml:space="preserve">Recording cash, teller, POS or a direct transfer</w:t>
       </w:r>
-      <w:bookmarkEnd w:id="42"/>
+      <w:bookmarkEnd w:id="43"/>
     </w:p>
     <w:p>
       <w:pPr>
@@ -7403,7 +7579,7 @@
         <w:pStyle w:val="ListParagraph"/>
         <w:numPr>
           <w:ilvl w:val="0"/>
-          <w:numId w:val="38"/>
+          <w:numId w:val="39"/>
         </w:numPr>
         <w:spacing w:after="60"/>
       </w:pPr>
@@ -7420,7 +7596,7 @@
         <w:pStyle w:val="ListParagraph"/>
         <w:numPr>
           <w:ilvl w:val="0"/>
-          <w:numId w:val="38"/>
+          <w:numId w:val="39"/>
         </w:numPr>
         <w:spacing w:after="60"/>
       </w:pPr>
@@ -7437,7 +7613,7 @@
         <w:pStyle w:val="ListParagraph"/>
         <w:numPr>
           <w:ilvl w:val="0"/>
-          <w:numId w:val="38"/>
+          <w:numId w:val="39"/>
         </w:numPr>
         <w:spacing w:after="60"/>
       </w:pPr>
@@ -7486,11 +7662,11 @@
         <w:pStyle w:val="Heading2"/>
         <w:spacing w:after="100" w:before="280"/>
       </w:pPr>
-      <w:bookmarkStart w:name="_Toc43" w:id="43"/>
+      <w:bookmarkStart w:name="_Toc44" w:id="44"/>
       <w:r>
         <w:t xml:space="preserve">Saying what a payment was for, after it arrived</w:t>
       </w:r>
-      <w:bookmarkEnd w:id="43"/>
+      <w:bookmarkEnd w:id="44"/>
     </w:p>
     <w:p>
       <w:pPr>
@@ -7556,7 +7732,7 @@
         <w:pStyle w:val="ListParagraph"/>
         <w:numPr>
           <w:ilvl w:val="0"/>
-          <w:numId w:val="39"/>
+          <w:numId w:val="40"/>
         </w:numPr>
         <w:spacing w:after="60"/>
       </w:pPr>
@@ -7573,7 +7749,7 @@
         <w:pStyle w:val="ListParagraph"/>
         <w:numPr>
           <w:ilvl w:val="0"/>
-          <w:numId w:val="39"/>
+          <w:numId w:val="40"/>
         </w:numPr>
         <w:spacing w:after="60"/>
       </w:pPr>
@@ -7590,11 +7766,11 @@
         <w:pStyle w:val="Heading2"/>
         <w:spacing w:after="100" w:before="280"/>
       </w:pPr>
-      <w:bookmarkStart w:name="_Toc44" w:id="44"/>
+      <w:bookmarkStart w:name="_Toc45" w:id="45"/>
       <w:r>
         <w:t xml:space="preserve">Reversing a payment</w:t>
       </w:r>
-      <w:bookmarkEnd w:id="44"/>
+      <w:bookmarkEnd w:id="45"/>
     </w:p>
     <w:p>
       <w:pPr>
@@ -7660,7 +7836,7 @@
         <w:pStyle w:val="ListParagraph"/>
         <w:numPr>
           <w:ilvl w:val="0"/>
-          <w:numId w:val="40"/>
+          <w:numId w:val="41"/>
         </w:numPr>
         <w:spacing w:after="60"/>
       </w:pPr>
@@ -7677,11 +7853,11 @@
         <w:pStyle w:val="Heading2"/>
         <w:spacing w:after="100" w:before="280"/>
       </w:pPr>
-      <w:bookmarkStart w:name="_Toc45" w:id="45"/>
+      <w:bookmarkStart w:name="_Toc46" w:id="46"/>
       <w:r>
         <w:t xml:space="preserve">Card payment link for one pupil</w:t>
       </w:r>
-      <w:bookmarkEnd w:id="45"/>
+      <w:bookmarkEnd w:id="46"/>
     </w:p>
     <w:p>
       <w:pPr>
@@ -7747,7 +7923,7 @@
         <w:pStyle w:val="ListParagraph"/>
         <w:numPr>
           <w:ilvl w:val="0"/>
-          <w:numId w:val="41"/>
+          <w:numId w:val="42"/>
         </w:numPr>
         <w:spacing w:after="60"/>
       </w:pPr>
@@ -7764,11 +7940,11 @@
         <w:pStyle w:val="Heading2"/>
         <w:spacing w:after="100" w:before="280"/>
       </w:pPr>
-      <w:bookmarkStart w:name="_Toc46" w:id="46"/>
+      <w:bookmarkStart w:name="_Toc47" w:id="47"/>
       <w:r>
         <w:t xml:space="preserve">Receipts</w:t>
       </w:r>
-      <w:bookmarkEnd w:id="46"/>
+      <w:bookmarkEnd w:id="47"/>
     </w:p>
     <w:p>
       <w:pPr>
@@ -7834,7 +8010,7 @@
         <w:pStyle w:val="ListParagraph"/>
         <w:numPr>
           <w:ilvl w:val="0"/>
-          <w:numId w:val="42"/>
+          <w:numId w:val="43"/>
         </w:numPr>
         <w:spacing w:after="60"/>
       </w:pPr>
@@ -7851,7 +8027,7 @@
         <w:pStyle w:val="ListParagraph"/>
         <w:numPr>
           <w:ilvl w:val="0"/>
-          <w:numId w:val="42"/>
+          <w:numId w:val="43"/>
         </w:numPr>
         <w:spacing w:after="60"/>
       </w:pPr>
@@ -7868,7 +8044,7 @@
         <w:pStyle w:val="ListParagraph"/>
         <w:numPr>
           <w:ilvl w:val="0"/>
-          <w:numId w:val="42"/>
+          <w:numId w:val="43"/>
         </w:numPr>
         <w:spacing w:after="60"/>
       </w:pPr>
@@ -7885,11 +8061,11 @@
         <w:pStyle w:val="Heading2"/>
         <w:spacing w:after="100" w:before="280"/>
       </w:pPr>
-      <w:bookmarkStart w:name="_Toc47" w:id="47"/>
+      <w:bookmarkStart w:name="_Toc48" w:id="48"/>
       <w:r>
         <w:t xml:space="preserve">Paid into the bank (Paystack payouts)</w:t>
       </w:r>
-      <w:bookmarkEnd w:id="47"/>
+      <w:bookmarkEnd w:id="48"/>
     </w:p>
     <w:p>
       <w:pPr>
@@ -7955,7 +8131,7 @@
         <w:pStyle w:val="ListParagraph"/>
         <w:numPr>
           <w:ilvl w:val="0"/>
-          <w:numId w:val="43"/>
+          <w:numId w:val="44"/>
         </w:numPr>
         <w:spacing w:after="60"/>
       </w:pPr>
@@ -7972,7 +8148,7 @@
         <w:pStyle w:val="ListParagraph"/>
         <w:numPr>
           <w:ilvl w:val="0"/>
-          <w:numId w:val="43"/>
+          <w:numId w:val="44"/>
         </w:numPr>
         <w:spacing w:after="60"/>
       </w:pPr>
@@ -7989,7 +8165,7 @@
         <w:pStyle w:val="ListParagraph"/>
         <w:numPr>
           <w:ilvl w:val="0"/>
-          <w:numId w:val="43"/>
+          <w:numId w:val="44"/>
         </w:numPr>
         <w:spacing w:after="60"/>
       </w:pPr>
@@ -8006,7 +8182,7 @@
         <w:pStyle w:val="ListParagraph"/>
         <w:numPr>
           <w:ilvl w:val="0"/>
-          <w:numId w:val="43"/>
+          <w:numId w:val="44"/>
         </w:numPr>
         <w:spacing w:after="60"/>
       </w:pPr>
@@ -8024,11 +8200,11 @@
         <w:pageBreakBefore/>
         <w:spacing w:after="160"/>
       </w:pPr>
-      <w:bookmarkStart w:name="_Toc48" w:id="48"/>
+      <w:bookmarkStart w:name="_Toc49" w:id="49"/>
       <w:r>
         <w:t xml:space="preserve">Cash and spending</w:t>
       </w:r>
-      <w:bookmarkEnd w:id="48"/>
+      <w:bookmarkEnd w:id="49"/>
     </w:p>
     <w:p>
       <w:pPr>
@@ -8047,11 +8223,11 @@
         <w:pStyle w:val="Heading2"/>
         <w:spacing w:after="100" w:before="280"/>
       </w:pPr>
-      <w:bookmarkStart w:name="_Toc49" w:id="49"/>
+      <w:bookmarkStart w:name="_Toc50" w:id="50"/>
       <w:r>
         <w:t xml:space="preserve">Cash book</w:t>
       </w:r>
-      <w:bookmarkEnd w:id="49"/>
+      <w:bookmarkEnd w:id="50"/>
     </w:p>
     <w:p>
       <w:pPr>
@@ -8117,7 +8293,7 @@
         <w:pStyle w:val="ListParagraph"/>
         <w:numPr>
           <w:ilvl w:val="0"/>
-          <w:numId w:val="44"/>
+          <w:numId w:val="45"/>
         </w:numPr>
         <w:spacing w:after="60"/>
       </w:pPr>
@@ -8166,11 +8342,11 @@
         <w:pStyle w:val="Heading2"/>
         <w:spacing w:after="100" w:before="280"/>
       </w:pPr>
-      <w:bookmarkStart w:name="_Toc50" w:id="50"/>
+      <w:bookmarkStart w:name="_Toc51" w:id="51"/>
       <w:r>
         <w:t xml:space="preserve">Banking cash, checked by a second person</w:t>
       </w:r>
-      <w:bookmarkEnd w:id="50"/>
+      <w:bookmarkEnd w:id="51"/>
     </w:p>
     <w:p>
       <w:pPr>
@@ -8236,7 +8412,7 @@
         <w:pStyle w:val="ListParagraph"/>
         <w:numPr>
           <w:ilvl w:val="0"/>
-          <w:numId w:val="45"/>
+          <w:numId w:val="46"/>
         </w:numPr>
         <w:spacing w:after="60"/>
       </w:pPr>
@@ -8253,7 +8429,7 @@
         <w:pStyle w:val="ListParagraph"/>
         <w:numPr>
           <w:ilvl w:val="0"/>
-          <w:numId w:val="45"/>
+          <w:numId w:val="46"/>
         </w:numPr>
         <w:spacing w:after="60"/>
       </w:pPr>
@@ -8270,11 +8446,11 @@
         <w:pStyle w:val="Heading2"/>
         <w:spacing w:after="100" w:before="280"/>
       </w:pPr>
-      <w:bookmarkStart w:name="_Toc51" w:id="51"/>
+      <w:bookmarkStart w:name="_Toc52" w:id="52"/>
       <w:r>
         <w:t xml:space="preserve">Closing the day (drawer count)</w:t>
       </w:r>
-      <w:bookmarkEnd w:id="51"/>
+      <w:bookmarkEnd w:id="52"/>
     </w:p>
     <w:p>
       <w:pPr>
@@ -8340,7 +8516,7 @@
         <w:pStyle w:val="ListParagraph"/>
         <w:numPr>
           <w:ilvl w:val="0"/>
-          <w:numId w:val="46"/>
+          <w:numId w:val="47"/>
         </w:numPr>
         <w:spacing w:after="60"/>
       </w:pPr>
@@ -8357,11 +8533,11 @@
         <w:pStyle w:val="Heading2"/>
         <w:spacing w:after="100" w:before="280"/>
       </w:pPr>
-      <w:bookmarkStart w:name="_Toc52" w:id="52"/>
+      <w:bookmarkStart w:name="_Toc53" w:id="53"/>
       <w:r>
         <w:t xml:space="preserve">Recording spending</w:t>
       </w:r>
-      <w:bookmarkEnd w:id="52"/>
+      <w:bookmarkEnd w:id="53"/>
     </w:p>
     <w:p>
       <w:pPr>
@@ -8427,7 +8603,7 @@
         <w:pStyle w:val="ListParagraph"/>
         <w:numPr>
           <w:ilvl w:val="0"/>
-          <w:numId w:val="47"/>
+          <w:numId w:val="48"/>
         </w:numPr>
         <w:spacing w:after="60"/>
       </w:pPr>
@@ -8444,7 +8620,7 @@
         <w:pStyle w:val="ListParagraph"/>
         <w:numPr>
           <w:ilvl w:val="0"/>
-          <w:numId w:val="47"/>
+          <w:numId w:val="48"/>
         </w:numPr>
         <w:spacing w:after="60"/>
       </w:pPr>
@@ -8461,7 +8637,7 @@
         <w:pStyle w:val="ListParagraph"/>
         <w:numPr>
           <w:ilvl w:val="0"/>
-          <w:numId w:val="47"/>
+          <w:numId w:val="48"/>
         </w:numPr>
         <w:spacing w:after="60"/>
       </w:pPr>
@@ -8510,11 +8686,11 @@
         <w:pStyle w:val="Heading2"/>
         <w:spacing w:after="100" w:before="280"/>
       </w:pPr>
-      <w:bookmarkStart w:name="_Toc53" w:id="53"/>
+      <w:bookmarkStart w:name="_Toc54" w:id="54"/>
       <w:r>
         <w:t xml:space="preserve">Income and expenditure</w:t>
       </w:r>
-      <w:bookmarkEnd w:id="53"/>
+      <w:bookmarkEnd w:id="54"/>
     </w:p>
     <w:p>
       <w:pPr>
@@ -8580,7 +8756,7 @@
         <w:pStyle w:val="ListParagraph"/>
         <w:numPr>
           <w:ilvl w:val="0"/>
-          <w:numId w:val="48"/>
+          <w:numId w:val="49"/>
         </w:numPr>
         <w:spacing w:after="60"/>
       </w:pPr>
@@ -8598,11 +8774,11 @@
         <w:pageBreakBefore/>
         <w:spacing w:after="160"/>
       </w:pPr>
-      <w:bookmarkStart w:name="_Toc54" w:id="54"/>
+      <w:bookmarkStart w:name="_Toc55" w:id="55"/>
       <w:r>
         <w:t xml:space="preserve">Messages to parents</w:t>
       </w:r>
-      <w:bookmarkEnd w:id="54"/>
+      <w:bookmarkEnd w:id="55"/>
     </w:p>
     <w:p>
       <w:pPr>
@@ -8621,11 +8797,11 @@
         <w:pStyle w:val="Heading2"/>
         <w:spacing w:after="100" w:before="280"/>
       </w:pPr>
-      <w:bookmarkStart w:name="_Toc55" w:id="55"/>
+      <w:bookmarkStart w:name="_Toc56" w:id="56"/>
       <w:r>
         <w:t xml:space="preserve">Sent messages</w:t>
       </w:r>
-      <w:bookmarkEnd w:id="55"/>
+      <w:bookmarkEnd w:id="56"/>
     </w:p>
     <w:p>
       <w:pPr>
@@ -8691,7 +8867,7 @@
         <w:pStyle w:val="ListParagraph"/>
         <w:numPr>
           <w:ilvl w:val="0"/>
-          <w:numId w:val="49"/>
+          <w:numId w:val="50"/>
         </w:numPr>
         <w:spacing w:after="60"/>
       </w:pPr>
@@ -8708,11 +8884,11 @@
         <w:pStyle w:val="Heading2"/>
         <w:spacing w:after="100" w:before="280"/>
       </w:pPr>
-      <w:bookmarkStart w:name="_Toc56" w:id="56"/>
+      <w:bookmarkStart w:name="_Toc57" w:id="57"/>
       <w:r>
         <w:t xml:space="preserve">The wording</w:t>
       </w:r>
-      <w:bookmarkEnd w:id="56"/>
+      <w:bookmarkEnd w:id="57"/>
     </w:p>
     <w:p>
       <w:pPr>
@@ -8778,7 +8954,7 @@
         <w:pStyle w:val="ListParagraph"/>
         <w:numPr>
           <w:ilvl w:val="0"/>
-          <w:numId w:val="50"/>
+          <w:numId w:val="51"/>
         </w:numPr>
         <w:spacing w:after="60"/>
       </w:pPr>
@@ -8795,7 +8971,7 @@
         <w:pStyle w:val="ListParagraph"/>
         <w:numPr>
           <w:ilvl w:val="0"/>
-          <w:numId w:val="50"/>
+          <w:numId w:val="51"/>
         </w:numPr>
         <w:spacing w:after="60"/>
       </w:pPr>
@@ -8812,7 +8988,7 @@
         <w:pStyle w:val="ListParagraph"/>
         <w:numPr>
           <w:ilvl w:val="0"/>
-          <w:numId w:val="50"/>
+          <w:numId w:val="51"/>
         </w:numPr>
         <w:spacing w:after="60"/>
       </w:pPr>
@@ -8861,11 +9037,11 @@
         <w:pStyle w:val="Heading2"/>
         <w:spacing w:after="100" w:before="280"/>
       </w:pPr>
-      <w:bookmarkStart w:name="_Toc57" w:id="57"/>
+      <w:bookmarkStart w:name="_Toc58" w:id="58"/>
       <w:r>
         <w:t xml:space="preserve">The reminder schedule</w:t>
       </w:r>
-      <w:bookmarkEnd w:id="57"/>
+      <w:bookmarkEnd w:id="58"/>
     </w:p>
     <w:p>
       <w:pPr>
@@ -8931,7 +9107,7 @@
         <w:pStyle w:val="ListParagraph"/>
         <w:numPr>
           <w:ilvl w:val="0"/>
-          <w:numId w:val="51"/>
+          <w:numId w:val="52"/>
         </w:numPr>
         <w:spacing w:after="60"/>
       </w:pPr>
@@ -8948,7 +9124,7 @@
         <w:pStyle w:val="ListParagraph"/>
         <w:numPr>
           <w:ilvl w:val="0"/>
-          <w:numId w:val="51"/>
+          <w:numId w:val="52"/>
         </w:numPr>
         <w:spacing w:after="60"/>
       </w:pPr>
@@ -8965,7 +9141,7 @@
         <w:pStyle w:val="ListParagraph"/>
         <w:numPr>
           <w:ilvl w:val="0"/>
-          <w:numId w:val="51"/>
+          <w:numId w:val="52"/>
         </w:numPr>
         <w:spacing w:after="60"/>
       </w:pPr>
@@ -8983,11 +9159,11 @@
         <w:pageBreakBefore/>
         <w:spacing w:after="160"/>
       </w:pPr>
-      <w:bookmarkStart w:name="_Toc58" w:id="58"/>
+      <w:bookmarkStart w:name="_Toc59" w:id="59"/>
       <w:r>
         <w:t xml:space="preserve">The Overview page and reports</w:t>
       </w:r>
-      <w:bookmarkEnd w:id="58"/>
+      <w:bookmarkEnd w:id="59"/>
     </w:p>
     <w:p>
       <w:pPr>
@@ -9006,11 +9182,11 @@
         <w:pStyle w:val="Heading2"/>
         <w:spacing w:after="100" w:before="280"/>
       </w:pPr>
-      <w:bookmarkStart w:name="_Toc59" w:id="59"/>
+      <w:bookmarkStart w:name="_Toc60" w:id="60"/>
       <w:r>
         <w:t xml:space="preserve">Overview</w:t>
       </w:r>
-      <w:bookmarkEnd w:id="59"/>
+      <w:bookmarkEnd w:id="60"/>
     </w:p>
     <w:p>
       <w:pPr>
@@ -9076,7 +9252,7 @@
         <w:pStyle w:val="ListParagraph"/>
         <w:numPr>
           <w:ilvl w:val="0"/>
-          <w:numId w:val="52"/>
+          <w:numId w:val="53"/>
         </w:numPr>
         <w:spacing w:after="60"/>
       </w:pPr>
@@ -9093,7 +9269,7 @@
         <w:pStyle w:val="ListParagraph"/>
         <w:numPr>
           <w:ilvl w:val="0"/>
-          <w:numId w:val="52"/>
+          <w:numId w:val="53"/>
         </w:numPr>
         <w:spacing w:after="60"/>
       </w:pPr>
@@ -9110,11 +9286,11 @@
         <w:pStyle w:val="Heading2"/>
         <w:spacing w:after="100" w:before="280"/>
       </w:pPr>
-      <w:bookmarkStart w:name="_Toc60" w:id="60"/>
+      <w:bookmarkStart w:name="_Toc61" w:id="61"/>
       <w:r>
         <w:t xml:space="preserve">Pace and forecast</w:t>
       </w:r>
-      <w:bookmarkEnd w:id="60"/>
+      <w:bookmarkEnd w:id="61"/>
     </w:p>
     <w:p>
       <w:pPr>
@@ -9180,7 +9356,7 @@
         <w:pStyle w:val="ListParagraph"/>
         <w:numPr>
           <w:ilvl w:val="0"/>
-          <w:numId w:val="53"/>
+          <w:numId w:val="54"/>
         </w:numPr>
         <w:spacing w:after="60"/>
       </w:pPr>
@@ -9197,7 +9373,7 @@
         <w:pStyle w:val="ListParagraph"/>
         <w:numPr>
           <w:ilvl w:val="0"/>
-          <w:numId w:val="53"/>
+          <w:numId w:val="54"/>
         </w:numPr>
         <w:spacing w:after="60"/>
       </w:pPr>
@@ -9214,7 +9390,7 @@
         <w:pStyle w:val="ListParagraph"/>
         <w:numPr>
           <w:ilvl w:val="0"/>
-          <w:numId w:val="53"/>
+          <w:numId w:val="54"/>
         </w:numPr>
         <w:spacing w:after="60"/>
       </w:pPr>
@@ -9231,11 +9407,11 @@
         <w:pStyle w:val="Heading2"/>
         <w:spacing w:after="100" w:before="280"/>
       </w:pPr>
-      <w:bookmarkStart w:name="_Toc61" w:id="61"/>
+      <w:bookmarkStart w:name="_Toc62" w:id="62"/>
       <w:r>
         <w:t xml:space="preserve">Debtors</w:t>
       </w:r>
-      <w:bookmarkEnd w:id="61"/>
+      <w:bookmarkEnd w:id="62"/>
     </w:p>
     <w:p>
       <w:pPr>
@@ -9301,7 +9477,7 @@
         <w:pStyle w:val="ListParagraph"/>
         <w:numPr>
           <w:ilvl w:val="0"/>
-          <w:numId w:val="54"/>
+          <w:numId w:val="55"/>
         </w:numPr>
         <w:spacing w:after="60"/>
       </w:pPr>
@@ -9318,11 +9494,11 @@
         <w:pStyle w:val="Heading2"/>
         <w:spacing w:after="100" w:before="280"/>
       </w:pPr>
-      <w:bookmarkStart w:name="_Toc62" w:id="62"/>
+      <w:bookmarkStart w:name="_Toc63" w:id="63"/>
       <w:r>
         <w:t xml:space="preserve">Money received</w:t>
       </w:r>
-      <w:bookmarkEnd w:id="62"/>
+      <w:bookmarkEnd w:id="63"/>
     </w:p>
     <w:p>
       <w:pPr>
@@ -9388,7 +9564,7 @@
         <w:pStyle w:val="ListParagraph"/>
         <w:numPr>
           <w:ilvl w:val="0"/>
-          <w:numId w:val="55"/>
+          <w:numId w:val="56"/>
         </w:numPr>
         <w:spacing w:after="60"/>
       </w:pPr>
@@ -9405,11 +9581,11 @@
         <w:pStyle w:val="Heading2"/>
         <w:spacing w:after="100" w:before="280"/>
       </w:pPr>
-      <w:bookmarkStart w:name="_Toc63" w:id="63"/>
+      <w:bookmarkStart w:name="_Toc64" w:id="64"/>
       <w:r>
         <w:t xml:space="preserve">Fee status by pupil</w:t>
       </w:r>
-      <w:bookmarkEnd w:id="63"/>
+      <w:bookmarkEnd w:id="64"/>
     </w:p>
     <w:p>
       <w:pPr>
@@ -9475,7 +9651,7 @@
         <w:pStyle w:val="ListParagraph"/>
         <w:numPr>
           <w:ilvl w:val="0"/>
-          <w:numId w:val="56"/>
+          <w:numId w:val="57"/>
         </w:numPr>
         <w:spacing w:after="60"/>
       </w:pPr>
@@ -9492,11 +9668,11 @@
         <w:pStyle w:val="Heading2"/>
         <w:spacing w:after="100" w:before="280"/>
       </w:pPr>
-      <w:bookmarkStart w:name="_Toc64" w:id="64"/>
+      <w:bookmarkStart w:name="_Toc65" w:id="65"/>
       <w:r>
         <w:t xml:space="preserve">Unusual activity</w:t>
       </w:r>
-      <w:bookmarkEnd w:id="64"/>
+      <w:bookmarkEnd w:id="65"/>
     </w:p>
     <w:p>
       <w:pPr>
@@ -9562,7 +9738,7 @@
         <w:pStyle w:val="ListParagraph"/>
         <w:numPr>
           <w:ilvl w:val="0"/>
-          <w:numId w:val="57"/>
+          <w:numId w:val="58"/>
         </w:numPr>
         <w:spacing w:after="60"/>
       </w:pPr>
@@ -9579,7 +9755,7 @@
         <w:pStyle w:val="ListParagraph"/>
         <w:numPr>
           <w:ilvl w:val="0"/>
-          <w:numId w:val="57"/>
+          <w:numId w:val="58"/>
         </w:numPr>
         <w:spacing w:after="60"/>
       </w:pPr>
@@ -9596,7 +9772,7 @@
         <w:pStyle w:val="ListParagraph"/>
         <w:numPr>
           <w:ilvl w:val="0"/>
-          <w:numId w:val="57"/>
+          <w:numId w:val="58"/>
         </w:numPr>
         <w:spacing w:after="60"/>
       </w:pPr>
@@ -9646,11 +9822,11 @@
         <w:pageBreakBefore/>
         <w:spacing w:after="160"/>
       </w:pPr>
-      <w:bookmarkStart w:name="_Toc65" w:id="65"/>
+      <w:bookmarkStart w:name="_Toc66" w:id="66"/>
       <w:r>
         <w:t xml:space="preserve">For the accountant</w:t>
       </w:r>
-      <w:bookmarkEnd w:id="65"/>
+      <w:bookmarkEnd w:id="66"/>
     </w:p>
     <w:p>
       <w:pPr>
@@ -9669,11 +9845,11 @@
         <w:pStyle w:val="Heading2"/>
         <w:spacing w:after="100" w:before="280"/>
       </w:pPr>
-      <w:bookmarkStart w:name="_Toc66" w:id="66"/>
+      <w:bookmarkStart w:name="_Toc67" w:id="67"/>
       <w:r>
         <w:t xml:space="preserve">The general journal</w:t>
       </w:r>
-      <w:bookmarkEnd w:id="66"/>
+      <w:bookmarkEnd w:id="67"/>
     </w:p>
     <w:p>
       <w:pPr>
@@ -9739,7 +9915,7 @@
         <w:pStyle w:val="ListParagraph"/>
         <w:numPr>
           <w:ilvl w:val="0"/>
-          <w:numId w:val="58"/>
+          <w:numId w:val="59"/>
         </w:numPr>
         <w:spacing w:after="60"/>
       </w:pPr>
@@ -9756,7 +9932,7 @@
         <w:pStyle w:val="ListParagraph"/>
         <w:numPr>
           <w:ilvl w:val="0"/>
-          <w:numId w:val="58"/>
+          <w:numId w:val="59"/>
         </w:numPr>
         <w:spacing w:after="60"/>
       </w:pPr>
@@ -9805,11 +9981,11 @@
         <w:pStyle w:val="Heading2"/>
         <w:spacing w:after="100" w:before="280"/>
       </w:pPr>
-      <w:bookmarkStart w:name="_Toc67" w:id="67"/>
+      <w:bookmarkStart w:name="_Toc68" w:id="68"/>
       <w:r>
         <w:t xml:space="preserve">Chart of accounts</w:t>
       </w:r>
-      <w:bookmarkEnd w:id="67"/>
+      <w:bookmarkEnd w:id="68"/>
     </w:p>
     <w:p>
       <w:pPr>
@@ -9875,7 +10051,7 @@
         <w:pStyle w:val="ListParagraph"/>
         <w:numPr>
           <w:ilvl w:val="0"/>
-          <w:numId w:val="59"/>
+          <w:numId w:val="60"/>
         </w:numPr>
         <w:spacing w:after="60"/>
       </w:pPr>
@@ -9892,11 +10068,11 @@
         <w:pStyle w:val="Heading2"/>
         <w:spacing w:after="100" w:before="280"/>
       </w:pPr>
-      <w:bookmarkStart w:name="_Toc68" w:id="68"/>
+      <w:bookmarkStart w:name="_Toc69" w:id="69"/>
       <w:r>
         <w:t xml:space="preserve">Closing the books (closing a term)</w:t>
       </w:r>
-      <w:bookmarkEnd w:id="68"/>
+      <w:bookmarkEnd w:id="69"/>
     </w:p>
     <w:p>
       <w:pPr>
@@ -9962,7 +10138,7 @@
         <w:pStyle w:val="ListParagraph"/>
         <w:numPr>
           <w:ilvl w:val="0"/>
-          <w:numId w:val="60"/>
+          <w:numId w:val="61"/>
         </w:numPr>
         <w:spacing w:after="60"/>
       </w:pPr>
@@ -9979,7 +10155,7 @@
         <w:pStyle w:val="ListParagraph"/>
         <w:numPr>
           <w:ilvl w:val="0"/>
-          <w:numId w:val="60"/>
+          <w:numId w:val="61"/>
         </w:numPr>
         <w:spacing w:after="60"/>
       </w:pPr>
@@ -9996,7 +10172,7 @@
         <w:pStyle w:val="ListParagraph"/>
         <w:numPr>
           <w:ilvl w:val="0"/>
-          <w:numId w:val="60"/>
+          <w:numId w:val="61"/>
         </w:numPr>
         <w:spacing w:after="60"/>
       </w:pPr>
@@ -10045,11 +10221,11 @@
         <w:pStyle w:val="Heading2"/>
         <w:spacing w:after="100" w:before="280"/>
       </w:pPr>
-      <w:bookmarkStart w:name="_Toc69" w:id="69"/>
+      <w:bookmarkStart w:name="_Toc70" w:id="70"/>
       <w:r>
         <w:t xml:space="preserve">End-of-session pack</w:t>
       </w:r>
-      <w:bookmarkEnd w:id="69"/>
+      <w:bookmarkEnd w:id="70"/>
     </w:p>
     <w:p>
       <w:pPr>
@@ -10115,7 +10291,7 @@
         <w:pStyle w:val="ListParagraph"/>
         <w:numPr>
           <w:ilvl w:val="0"/>
-          <w:numId w:val="61"/>
+          <w:numId w:val="62"/>
         </w:numPr>
         <w:spacing w:after="60"/>
       </w:pPr>
@@ -10132,7 +10308,7 @@
         <w:pStyle w:val="ListParagraph"/>
         <w:numPr>
           <w:ilvl w:val="0"/>
-          <w:numId w:val="61"/>
+          <w:numId w:val="62"/>
         </w:numPr>
         <w:spacing w:after="60"/>
       </w:pPr>
@@ -10182,22 +10358,22 @@
         <w:pageBreakBefore/>
         <w:spacing w:after="160"/>
       </w:pPr>
-      <w:bookmarkStart w:name="_Toc70" w:id="70"/>
+      <w:bookmarkStart w:name="_Toc71" w:id="71"/>
       <w:r>
         <w:t xml:space="preserve">The school’s own records</w:t>
       </w:r>
-      <w:bookmarkEnd w:id="70"/>
+      <w:bookmarkEnd w:id="71"/>
     </w:p>
     <w:p>
       <w:pPr>
         <w:pStyle w:val="Heading2"/>
         <w:spacing w:after="100" w:before="280"/>
       </w:pPr>
-      <w:bookmarkStart w:name="_Toc71" w:id="71"/>
+      <w:bookmarkStart w:name="_Toc72" w:id="72"/>
       <w:r>
         <w:t xml:space="preserve">Activity log</w:t>
       </w:r>
-      <w:bookmarkEnd w:id="71"/>
+      <w:bookmarkEnd w:id="72"/>
     </w:p>
     <w:p>
       <w:pPr>
@@ -10263,7 +10439,7 @@
         <w:pStyle w:val="ListParagraph"/>
         <w:numPr>
           <w:ilvl w:val="0"/>
-          <w:numId w:val="62"/>
+          <w:numId w:val="63"/>
         </w:numPr>
         <w:spacing w:after="60"/>
       </w:pPr>
@@ -10280,11 +10456,11 @@
         <w:pStyle w:val="Heading2"/>
         <w:spacing w:after="100" w:before="280"/>
       </w:pPr>
-      <w:bookmarkStart w:name="_Toc72" w:id="72"/>
+      <w:bookmarkStart w:name="_Toc73" w:id="73"/>
       <w:r>
         <w:t xml:space="preserve">Subscription</w:t>
       </w:r>
-      <w:bookmarkEnd w:id="72"/>
+      <w:bookmarkEnd w:id="73"/>
     </w:p>
     <w:p>
       <w:pPr>
@@ -10350,7 +10526,7 @@
         <w:pStyle w:val="ListParagraph"/>
         <w:numPr>
           <w:ilvl w:val="0"/>
-          <w:numId w:val="63"/>
+          <w:numId w:val="64"/>
         </w:numPr>
         <w:spacing w:after="60"/>
       </w:pPr>
@@ -10367,7 +10543,7 @@
         <w:pStyle w:val="ListParagraph"/>
         <w:numPr>
           <w:ilvl w:val="0"/>
-          <w:numId w:val="63"/>
+          <w:numId w:val="64"/>
         </w:numPr>
         <w:spacing w:after="60"/>
       </w:pPr>
@@ -10384,7 +10560,7 @@
         <w:pStyle w:val="ListParagraph"/>
         <w:numPr>
           <w:ilvl w:val="0"/>
-          <w:numId w:val="63"/>
+          <w:numId w:val="64"/>
         </w:numPr>
         <w:spacing w:after="60"/>
       </w:pPr>
@@ -10434,11 +10610,11 @@
         <w:pageBreakBefore/>
         <w:spacing w:after="160"/>
       </w:pPr>
-      <w:bookmarkStart w:name="_Toc73" w:id="73"/>
+      <w:bookmarkStart w:name="_Toc74" w:id="74"/>
       <w:r>
         <w:t xml:space="preserve">For parents</w:t>
       </w:r>
-      <w:bookmarkEnd w:id="73"/>
+      <w:bookmarkEnd w:id="74"/>
     </w:p>
     <w:p>
       <w:pPr>
@@ -10457,11 +10633,11 @@
         <w:pStyle w:val="Heading2"/>
         <w:spacing w:after="100" w:before="280"/>
       </w:pPr>
-      <w:bookmarkStart w:name="_Toc74" w:id="74"/>
+      <w:bookmarkStart w:name="_Toc75" w:id="75"/>
       <w:r>
         <w:t xml:space="preserve">Paying from the message link</w:t>
       </w:r>
-      <w:bookmarkEnd w:id="74"/>
+      <w:bookmarkEnd w:id="75"/>
     </w:p>
     <w:p>
       <w:pPr>
@@ -10527,7 +10703,7 @@
         <w:pStyle w:val="ListParagraph"/>
         <w:numPr>
           <w:ilvl w:val="0"/>
-          <w:numId w:val="64"/>
+          <w:numId w:val="65"/>
         </w:numPr>
         <w:spacing w:after="60"/>
       </w:pPr>
@@ -10544,7 +10720,7 @@
         <w:pStyle w:val="ListParagraph"/>
         <w:numPr>
           <w:ilvl w:val="0"/>
-          <w:numId w:val="64"/>
+          <w:numId w:val="65"/>
         </w:numPr>
         <w:spacing w:after="60"/>
       </w:pPr>
@@ -10561,7 +10737,7 @@
         <w:pStyle w:val="ListParagraph"/>
         <w:numPr>
           <w:ilvl w:val="0"/>
-          <w:numId w:val="64"/>
+          <w:numId w:val="65"/>
         </w:numPr>
         <w:spacing w:after="60"/>
       </w:pPr>
@@ -10578,11 +10754,11 @@
         <w:pStyle w:val="Heading2"/>
         <w:spacing w:after="100" w:before="280"/>
       </w:pPr>
-      <w:bookmarkStart w:name="_Toc75" w:id="75"/>
+      <w:bookmarkStart w:name="_Toc76" w:id="76"/>
       <w:r>
         <w:t xml:space="preserve">The parent portal</w:t>
       </w:r>
-      <w:bookmarkEnd w:id="75"/>
+      <w:bookmarkEnd w:id="76"/>
     </w:p>
     <w:p>
       <w:pPr>
@@ -10648,7 +10824,7 @@
         <w:pStyle w:val="ListParagraph"/>
         <w:numPr>
           <w:ilvl w:val="0"/>
-          <w:numId w:val="65"/>
+          <w:numId w:val="66"/>
         </w:numPr>
         <w:spacing w:after="60"/>
       </w:pPr>
@@ -10665,7 +10841,7 @@
         <w:pStyle w:val="ListParagraph"/>
         <w:numPr>
           <w:ilvl w:val="0"/>
-          <w:numId w:val="65"/>
+          <w:numId w:val="66"/>
         </w:numPr>
         <w:spacing w:after="60"/>
       </w:pPr>
@@ -10682,7 +10858,7 @@
         <w:pStyle w:val="ListParagraph"/>
         <w:numPr>
           <w:ilvl w:val="0"/>
-          <w:numId w:val="65"/>
+          <w:numId w:val="66"/>
         </w:numPr>
         <w:spacing w:after="60"/>
       </w:pPr>
@@ -10699,11 +10875,11 @@
         <w:pStyle w:val="Heading2"/>
         <w:spacing w:after="100" w:before="280"/>
       </w:pPr>
-      <w:bookmarkStart w:name="_Toc76" w:id="76"/>
+      <w:bookmarkStart w:name="_Toc77" w:id="77"/>
       <w:r>
         <w:t xml:space="preserve">Spreading the fees with a school plan</w:t>
       </w:r>
-      <w:bookmarkEnd w:id="76"/>
+      <w:bookmarkEnd w:id="77"/>
     </w:p>
     <w:p>
       <w:pPr>
@@ -10769,7 +10945,7 @@
         <w:pStyle w:val="ListParagraph"/>
         <w:numPr>
           <w:ilvl w:val="0"/>
-          <w:numId w:val="66"/>
+          <w:numId w:val="67"/>
         </w:numPr>
         <w:spacing w:after="60"/>
       </w:pPr>
@@ -10786,7 +10962,7 @@
         <w:pStyle w:val="ListParagraph"/>
         <w:numPr>
           <w:ilvl w:val="0"/>
-          <w:numId w:val="66"/>
+          <w:numId w:val="67"/>
         </w:numPr>
         <w:spacing w:after="60"/>
       </w:pPr>
@@ -10803,7 +10979,7 @@
         <w:pStyle w:val="ListParagraph"/>
         <w:numPr>
           <w:ilvl w:val="0"/>
-          <w:numId w:val="66"/>
+          <w:numId w:val="67"/>
         </w:numPr>
         <w:spacing w:after="60"/>
       </w:pPr>
@@ -10820,11 +10996,11 @@
         <w:pStyle w:val="Heading2"/>
         <w:spacing w:after="100" w:before="280"/>
       </w:pPr>
-      <w:bookmarkStart w:name="_Toc77" w:id="77"/>
+      <w:bookmarkStart w:name="_Toc78" w:id="78"/>
       <w:r>
         <w:t xml:space="preserve">Messages and my data</w:t>
       </w:r>
-      <w:bookmarkEnd w:id="77"/>
+      <w:bookmarkEnd w:id="78"/>
     </w:p>
     <w:p>
       <w:pPr>
@@ -10890,7 +11066,7 @@
         <w:pStyle w:val="ListParagraph"/>
         <w:numPr>
           <w:ilvl w:val="0"/>
-          <w:numId w:val="67"/>
+          <w:numId w:val="68"/>
         </w:numPr>
         <w:spacing w:after="60"/>
       </w:pPr>
@@ -10907,7 +11083,7 @@
         <w:pStyle w:val="ListParagraph"/>
         <w:numPr>
           <w:ilvl w:val="0"/>
-          <w:numId w:val="67"/>
+          <w:numId w:val="68"/>
         </w:numPr>
         <w:spacing w:after="60"/>
       </w:pPr>
@@ -10925,11 +11101,11 @@
         <w:pageBreakBefore/>
         <w:spacing w:after="160"/>
       </w:pPr>
-      <w:bookmarkStart w:name="_Toc78" w:id="78"/>
+      <w:bookmarkStart w:name="_Toc79" w:id="79"/>
       <w:r>
         <w:t xml:space="preserve">For the WardPay team</w:t>
       </w:r>
-      <w:bookmarkEnd w:id="78"/>
+      <w:bookmarkEnd w:id="79"/>
     </w:p>
     <w:p>
       <w:pPr>
@@ -10948,11 +11124,11 @@
         <w:pStyle w:val="Heading2"/>
         <w:spacing w:after="100" w:before="280"/>
       </w:pPr>
-      <w:bookmarkStart w:name="_Toc79" w:id="79"/>
+      <w:bookmarkStart w:name="_Toc80" w:id="80"/>
       <w:r>
         <w:t xml:space="preserve">Platform overview and trends</w:t>
       </w:r>
-      <w:bookmarkEnd w:id="79"/>
+      <w:bookmarkEnd w:id="80"/>
     </w:p>
     <w:p>
       <w:pPr>
@@ -11018,7 +11194,7 @@
         <w:pStyle w:val="ListParagraph"/>
         <w:numPr>
           <w:ilvl w:val="0"/>
-          <w:numId w:val="68"/>
+          <w:numId w:val="69"/>
         </w:numPr>
         <w:spacing w:after="60"/>
       </w:pPr>
@@ -11035,11 +11211,11 @@
         <w:pStyle w:val="Heading2"/>
         <w:spacing w:after="100" w:before="280"/>
       </w:pPr>
-      <w:bookmarkStart w:name="_Toc80" w:id="80"/>
+      <w:bookmarkStart w:name="_Toc81" w:id="81"/>
       <w:r>
         <w:t xml:space="preserve">Schools</w:t>
       </w:r>
-      <w:bookmarkEnd w:id="80"/>
+      <w:bookmarkEnd w:id="81"/>
     </w:p>
     <w:p>
       <w:pPr>
@@ -11105,7 +11281,7 @@
         <w:pStyle w:val="ListParagraph"/>
         <w:numPr>
           <w:ilvl w:val="0"/>
-          <w:numId w:val="69"/>
+          <w:numId w:val="70"/>
         </w:numPr>
         <w:spacing w:after="60"/>
       </w:pPr>
@@ -11122,7 +11298,7 @@
         <w:pStyle w:val="ListParagraph"/>
         <w:numPr>
           <w:ilvl w:val="0"/>
-          <w:numId w:val="69"/>
+          <w:numId w:val="70"/>
         </w:numPr>
         <w:spacing w:after="60"/>
       </w:pPr>
@@ -11139,7 +11315,7 @@
         <w:pStyle w:val="ListParagraph"/>
         <w:numPr>
           <w:ilvl w:val="0"/>
-          <w:numId w:val="69"/>
+          <w:numId w:val="70"/>
         </w:numPr>
         <w:spacing w:after="60"/>
       </w:pPr>
@@ -11156,11 +11332,11 @@
         <w:pStyle w:val="Heading2"/>
         <w:spacing w:after="100" w:before="280"/>
       </w:pPr>
-      <w:bookmarkStart w:name="_Toc81" w:id="81"/>
+      <w:bookmarkStart w:name="_Toc82" w:id="82"/>
       <w:r>
         <w:t xml:space="preserve">School groups (several branches, one owner)</w:t>
       </w:r>
-      <w:bookmarkEnd w:id="81"/>
+      <w:bookmarkEnd w:id="82"/>
     </w:p>
     <w:p>
       <w:pPr>
@@ -11226,7 +11402,7 @@
         <w:pStyle w:val="ListParagraph"/>
         <w:numPr>
           <w:ilvl w:val="0"/>
-          <w:numId w:val="70"/>
+          <w:numId w:val="71"/>
         </w:numPr>
         <w:spacing w:after="60"/>
       </w:pPr>
@@ -11243,7 +11419,7 @@
         <w:pStyle w:val="ListParagraph"/>
         <w:numPr>
           <w:ilvl w:val="0"/>
-          <w:numId w:val="70"/>
+          <w:numId w:val="71"/>
         </w:numPr>
         <w:spacing w:after="60"/>
       </w:pPr>
@@ -11260,7 +11436,7 @@
         <w:pStyle w:val="ListParagraph"/>
         <w:numPr>
           <w:ilvl w:val="0"/>
-          <w:numId w:val="70"/>
+          <w:numId w:val="71"/>
         </w:numPr>
         <w:spacing w:after="60"/>
       </w:pPr>
@@ -11277,7 +11453,7 @@
         <w:pStyle w:val="ListParagraph"/>
         <w:numPr>
           <w:ilvl w:val="0"/>
-          <w:numId w:val="70"/>
+          <w:numId w:val="71"/>
         </w:numPr>
         <w:spacing w:after="60"/>
       </w:pPr>
@@ -11294,7 +11470,7 @@
         <w:pStyle w:val="ListParagraph"/>
         <w:numPr>
           <w:ilvl w:val="0"/>
-          <w:numId w:val="70"/>
+          <w:numId w:val="71"/>
         </w:numPr>
         <w:spacing w:after="60"/>
       </w:pPr>
@@ -11311,7 +11487,7 @@
         <w:pStyle w:val="ListParagraph"/>
         <w:numPr>
           <w:ilvl w:val="0"/>
-          <w:numId w:val="70"/>
+          <w:numId w:val="71"/>
         </w:numPr>
         <w:spacing w:after="60"/>
       </w:pPr>
@@ -11360,11 +11536,11 @@
         <w:pStyle w:val="Heading2"/>
         <w:spacing w:after="100" w:before="280"/>
       </w:pPr>
-      <w:bookmarkStart w:name="_Toc82" w:id="82"/>
+      <w:bookmarkStart w:name="_Toc83" w:id="83"/>
       <w:r>
         <w:t xml:space="preserve">Subscription billing and plans</w:t>
       </w:r>
-      <w:bookmarkEnd w:id="82"/>
+      <w:bookmarkEnd w:id="83"/>
     </w:p>
     <w:p>
       <w:pPr>
@@ -11430,7 +11606,7 @@
         <w:pStyle w:val="ListParagraph"/>
         <w:numPr>
           <w:ilvl w:val="0"/>
-          <w:numId w:val="71"/>
+          <w:numId w:val="72"/>
         </w:numPr>
         <w:spacing w:after="60"/>
       </w:pPr>
@@ -11447,7 +11623,7 @@
         <w:pStyle w:val="ListParagraph"/>
         <w:numPr>
           <w:ilvl w:val="0"/>
-          <w:numId w:val="71"/>
+          <w:numId w:val="72"/>
         </w:numPr>
         <w:spacing w:after="60"/>
       </w:pPr>
@@ -11464,7 +11640,7 @@
         <w:pStyle w:val="ListParagraph"/>
         <w:numPr>
           <w:ilvl w:val="0"/>
-          <w:numId w:val="71"/>
+          <w:numId w:val="72"/>
         </w:numPr>
         <w:spacing w:after="60"/>
       </w:pPr>
@@ -11481,11 +11657,11 @@
         <w:pStyle w:val="Heading2"/>
         <w:spacing w:after="100" w:before="280"/>
       </w:pPr>
-      <w:bookmarkStart w:name="_Toc83" w:id="83"/>
+      <w:bookmarkStart w:name="_Toc84" w:id="84"/>
       <w:r>
         <w:t xml:space="preserve">Problems, providers and support lookup</w:t>
       </w:r>
-      <w:bookmarkEnd w:id="83"/>
+      <w:bookmarkEnd w:id="84"/>
     </w:p>
     <w:p>
       <w:pPr>
@@ -11551,7 +11727,7 @@
         <w:pStyle w:val="ListParagraph"/>
         <w:numPr>
           <w:ilvl w:val="0"/>
-          <w:numId w:val="72"/>
+          <w:numId w:val="73"/>
         </w:numPr>
         <w:spacing w:after="60"/>
       </w:pPr>
@@ -11568,7 +11744,7 @@
         <w:pStyle w:val="ListParagraph"/>
         <w:numPr>
           <w:ilvl w:val="0"/>
-          <w:numId w:val="72"/>
+          <w:numId w:val="73"/>
         </w:numPr>
         <w:spacing w:after="60"/>
       </w:pPr>
@@ -11585,7 +11761,7 @@
         <w:pStyle w:val="ListParagraph"/>
         <w:numPr>
           <w:ilvl w:val="0"/>
-          <w:numId w:val="72"/>
+          <w:numId w:val="73"/>
         </w:numPr>
         <w:spacing w:after="60"/>
       </w:pPr>
@@ -11603,11 +11779,11 @@
         <w:pageBreakBefore/>
         <w:spacing w:after="160"/>
       </w:pPr>
-      <w:bookmarkStart w:name="_Toc84" w:id="84"/>
+      <w:bookmarkStart w:name="_Toc85" w:id="85"/>
       <w:r>
         <w:t xml:space="preserve">What changed in this guide</w:t>
       </w:r>
-      <w:bookmarkEnd w:id="84"/>
+      <w:bookmarkEnd w:id="85"/>
     </w:p>
     <w:tbl>
       <w:tblPr>
@@ -11686,6 +11862,64 @@
                 <w:szCs w:val="21"/>
               </w:rPr>
               <w:t xml:space="preserve">Change</w:t>
+            </w:r>
+          </w:p>
+        </w:tc>
+      </w:tr>
+      <w:tr>
+        <w:tc>
+          <w:tcPr>
+            <w:tcW w:type="dxa" w:w="1900"/>
+            <w:tcBorders>
+              <w:top w:val="single" w:color="D0D7D3" w:sz="4"/>
+              <w:left w:val="single" w:color="D0D7D3" w:sz="4"/>
+              <w:bottom w:val="single" w:color="D0D7D3" w:sz="4"/>
+              <w:right w:val="single" w:color="D0D7D3" w:sz="4"/>
+            </w:tcBorders>
+            <w:tcMar>
+              <w:top w:type="dxa" w:w="80"/>
+              <w:left w:type="dxa" w:w="120"/>
+              <w:bottom w:type="dxa" w:w="80"/>
+              <w:right w:type="dxa" w:w="120"/>
+            </w:tcMar>
+          </w:tcPr>
+          <w:p>
+            <w:r>
+              <w:rPr>
+                <w:b w:val="false"/>
+                <w:bCs w:val="false"/>
+                <w:sz w:val="21"/>
+                <w:szCs w:val="21"/>
+              </w:rPr>
+              <w:t xml:space="preserve">27 Oct 2026</w:t>
+            </w:r>
+          </w:p>
+        </w:tc>
+        <w:tc>
+          <w:tcPr>
+            <w:tcW w:type="dxa" w:w="7738"/>
+            <w:tcBorders>
+              <w:top w:val="single" w:color="D0D7D3" w:sz="4"/>
+              <w:left w:val="single" w:color="D0D7D3" w:sz="4"/>
+              <w:bottom w:val="single" w:color="D0D7D3" w:sz="4"/>
+              <w:right w:val="single" w:color="D0D7D3" w:sz="4"/>
+            </w:tcBorders>
+            <w:tcMar>
+              <w:top w:type="dxa" w:w="80"/>
+              <w:left w:type="dxa" w:w="120"/>
+              <w:bottom w:type="dxa" w:w="80"/>
+              <w:right w:type="dxa" w:w="120"/>
+            </w:tcMar>
+          </w:tcPr>
+          <w:p>
+            <w:r>
+              <w:rPr>
+                <w:b w:val="false"/>
+                <w:bCs w:val="false"/>
+                <w:sz w:val="21"/>
+                <w:szCs w:val="21"/>
+              </w:rPr>
+              <w:t xml:space="preserve">Schools choose who pays the charge on online payments: the school, or the parent on top (shown before paying).</w:t>
             </w:r>
           </w:p>
         </w:tc>
@@ -12962,6 +13196,12 @@
     </w:lvlOverride>
   </w:num>
   <w:num w:numId="72">
+    <w:abstractNumId w:val="3"/>
+    <w:lvlOverride w:ilvl="0">
+      <w:startOverride w:val="1"/>
+    </w:lvlOverride>
+  </w:num>
+  <w:num w:numId="73">
     <w:abstractNumId w:val="3"/>
     <w:lvlOverride w:ilvl="0">
       <w:startOverride w:val="1"/>

</xml_diff>

<commit_message>
WardPay takes no share of school payments: the 1% split is removed
WardPay is paid only through its termly bills to schools (owner). Subaccounts are made
with a 0% platform share; the setting, the stored per-school percentage and the Bachs
platform fee are gone; a new command, python -m app.cli clear-platform-fee, sets older
subaccounts to 0% at the provider (audited, safe to rerun). Docs, Word guides and owner
to-do updated.
</commit_message>
<xml_diff>
--- a/docs/product/WardPay - user guide.docx
+++ b/docs/product/WardPay - user guide.docx
@@ -11862,6 +11862,64 @@
                 <w:szCs w:val="21"/>
               </w:rPr>
               <w:t xml:space="preserve">Change</w:t>
+            </w:r>
+          </w:p>
+        </w:tc>
+      </w:tr>
+      <w:tr>
+        <w:tc>
+          <w:tcPr>
+            <w:tcW w:type="dxa" w:w="1900"/>
+            <w:tcBorders>
+              <w:top w:val="single" w:color="D0D7D3" w:sz="4"/>
+              <w:left w:val="single" w:color="D0D7D3" w:sz="4"/>
+              <w:bottom w:val="single" w:color="D0D7D3" w:sz="4"/>
+              <w:right w:val="single" w:color="D0D7D3" w:sz="4"/>
+            </w:tcBorders>
+            <w:tcMar>
+              <w:top w:type="dxa" w:w="80"/>
+              <w:left w:type="dxa" w:w="120"/>
+              <w:bottom w:type="dxa" w:w="80"/>
+              <w:right w:type="dxa" w:w="120"/>
+            </w:tcMar>
+          </w:tcPr>
+          <w:p>
+            <w:r>
+              <w:rPr>
+                <w:b w:val="false"/>
+                <w:bCs w:val="false"/>
+                <w:sz w:val="21"/>
+                <w:szCs w:val="21"/>
+              </w:rPr>
+              <w:t xml:space="preserve">27 Oct 2026</w:t>
+            </w:r>
+          </w:p>
+        </w:tc>
+        <w:tc>
+          <w:tcPr>
+            <w:tcW w:type="dxa" w:w="7738"/>
+            <w:tcBorders>
+              <w:top w:val="single" w:color="D0D7D3" w:sz="4"/>
+              <w:left w:val="single" w:color="D0D7D3" w:sz="4"/>
+              <w:bottom w:val="single" w:color="D0D7D3" w:sz="4"/>
+              <w:right w:val="single" w:color="D0D7D3" w:sz="4"/>
+            </w:tcBorders>
+            <w:tcMar>
+              <w:top w:type="dxa" w:w="80"/>
+              <w:left w:type="dxa" w:w="120"/>
+              <w:bottom w:type="dxa" w:w="80"/>
+              <w:right w:type="dxa" w:w="120"/>
+            </w:tcMar>
+          </w:tcPr>
+          <w:p>
+            <w:r>
+              <w:rPr>
+                <w:b w:val="false"/>
+                <w:bCs w:val="false"/>
+                <w:sz w:val="21"/>
+                <w:szCs w:val="21"/>
+              </w:rPr>
+              <w:t xml:space="preserve">WardPay no longer takes 1% of payments; the school’s bank receives everything except the payment provider’s own charge.</w:t>
             </w:r>
           </w:p>
         </w:tc>

</xml_diff>